<commit_message>
feat: change title in vscode
</commit_message>
<xml_diff>
--- a/ЛР-1. Настройка среды разработки.docx
+++ b/ЛР-1. Настройка среды разработки.docx
@@ -455,21 +455,22 @@
       </w:pPr>
       <w:r>
         <w:rPr>
+          <w:noProof/>
           <w:lang w:val="ru-RU"/>
         </w:rPr>
         <w:drawing>
-          <wp:anchor distT="0" distB="0" distL="114300" distR="114300" simplePos="0" relativeHeight="251653120" behindDoc="0" locked="0" layoutInCell="1" allowOverlap="1" wp14:anchorId="55D7CFF6" wp14:editId="348195CC">
+          <wp:anchor distT="0" distB="0" distL="114300" distR="114300" simplePos="0" relativeHeight="251612672" behindDoc="0" locked="0" layoutInCell="1" allowOverlap="1" wp14:anchorId="09C90A42" wp14:editId="513501B2">
             <wp:simplePos x="0" y="0"/>
             <wp:positionH relativeFrom="page">
-              <wp:posOffset>2103120</wp:posOffset>
+              <wp:posOffset>1866900</wp:posOffset>
             </wp:positionH>
             <wp:positionV relativeFrom="page">
-              <wp:posOffset>6788785</wp:posOffset>
+              <wp:posOffset>6797040</wp:posOffset>
             </wp:positionV>
-            <wp:extent cx="3553321" cy="609685"/>
-            <wp:effectExtent l="0" t="0" r="9525" b="0"/>
+            <wp:extent cx="3886200" cy="561037"/>
+            <wp:effectExtent l="0" t="0" r="0" b="0"/>
             <wp:wrapTopAndBottom/>
-            <wp:docPr id="1822201767" name="Рисунок 1"/>
+            <wp:docPr id="77633089" name="Рисунок 1"/>
             <wp:cNvGraphicFramePr>
               <a:graphicFrameLocks xmlns:a="http://schemas.openxmlformats.org/drawingml/2006/main" noChangeAspect="1"/>
             </wp:cNvGraphicFramePr>
@@ -477,7 +478,7 @@
               <a:graphicData uri="http://schemas.openxmlformats.org/drawingml/2006/picture">
                 <pic:pic xmlns:pic="http://schemas.openxmlformats.org/drawingml/2006/picture">
                   <pic:nvPicPr>
-                    <pic:cNvPr id="1822201767" name=""/>
+                    <pic:cNvPr id="77633089" name=""/>
                     <pic:cNvPicPr/>
                   </pic:nvPicPr>
                   <pic:blipFill>
@@ -489,7 +490,7 @@
                   <pic:spPr>
                     <a:xfrm>
                       <a:off x="0" y="0"/>
-                      <a:ext cx="3553321" cy="609685"/>
+                      <a:ext cx="3886200" cy="561037"/>
                     </a:xfrm>
                     <a:prstGeom prst="rect">
                       <a:avLst/>
@@ -498,15 +499,22 @@
                 </pic:pic>
               </a:graphicData>
             </a:graphic>
+            <wp14:sizeRelH relativeFrom="margin">
+              <wp14:pctWidth>0</wp14:pctWidth>
+            </wp14:sizeRelH>
+            <wp14:sizeRelV relativeFrom="margin">
+              <wp14:pctHeight>0</wp14:pctHeight>
+            </wp14:sizeRelV>
           </wp:anchor>
         </w:drawing>
       </w:r>
       <w:r>
         <w:rPr>
+          <w:noProof/>
           <w:lang w:val="ru-RU"/>
         </w:rPr>
         <w:drawing>
-          <wp:anchor distT="0" distB="0" distL="114300" distR="114300" simplePos="0" relativeHeight="251651072" behindDoc="0" locked="0" layoutInCell="1" allowOverlap="1" wp14:anchorId="2C5F23D5" wp14:editId="33F715D8">
+          <wp:anchor distT="0" distB="0" distL="114300" distR="114300" simplePos="0" relativeHeight="251604480" behindDoc="0" locked="0" layoutInCell="1" allowOverlap="1" wp14:anchorId="2C5F23D5" wp14:editId="06C46ED4">
             <wp:simplePos x="0" y="0"/>
             <wp:positionH relativeFrom="page">
               <wp:posOffset>731520</wp:posOffset>
@@ -632,21 +640,22 @@
       </w:pPr>
       <w:r>
         <w:rPr>
+          <w:noProof/>
           <w:lang w:val="ru-RU"/>
         </w:rPr>
         <w:drawing>
-          <wp:anchor distT="0" distB="0" distL="114300" distR="114300" simplePos="0" relativeHeight="251665408" behindDoc="0" locked="0" layoutInCell="1" allowOverlap="1" wp14:anchorId="26A165DE" wp14:editId="18244C5E">
+          <wp:anchor distT="0" distB="0" distL="114300" distR="114300" simplePos="0" relativeHeight="251616768" behindDoc="0" locked="0" layoutInCell="1" allowOverlap="1" wp14:anchorId="00EC2DEF" wp14:editId="741FE2E7">
             <wp:simplePos x="0" y="0"/>
             <wp:positionH relativeFrom="page">
-              <wp:posOffset>925830</wp:posOffset>
+              <wp:posOffset>815340</wp:posOffset>
             </wp:positionH>
             <wp:positionV relativeFrom="page">
-              <wp:posOffset>8068945</wp:posOffset>
+              <wp:posOffset>8092440</wp:posOffset>
             </wp:positionV>
-            <wp:extent cx="6309360" cy="328930"/>
+            <wp:extent cx="6287377" cy="571580"/>
             <wp:effectExtent l="0" t="0" r="0" b="0"/>
-            <wp:wrapSquare wrapText="bothSides"/>
-            <wp:docPr id="1969775725" name="Рисунок 1"/>
+            <wp:wrapTopAndBottom/>
+            <wp:docPr id="359836509" name="Рисунок 1"/>
             <wp:cNvGraphicFramePr>
               <a:graphicFrameLocks xmlns:a="http://schemas.openxmlformats.org/drawingml/2006/main" noChangeAspect="1"/>
             </wp:cNvGraphicFramePr>
@@ -654,7 +663,7 @@
               <a:graphicData uri="http://schemas.openxmlformats.org/drawingml/2006/picture">
                 <pic:pic xmlns:pic="http://schemas.openxmlformats.org/drawingml/2006/picture">
                   <pic:nvPicPr>
-                    <pic:cNvPr id="1969775725" name=""/>
+                    <pic:cNvPr id="359836509" name=""/>
                     <pic:cNvPicPr/>
                   </pic:nvPicPr>
                   <pic:blipFill>
@@ -666,7 +675,7 @@
                   <pic:spPr>
                     <a:xfrm>
                       <a:off x="0" y="0"/>
-                      <a:ext cx="6309360" cy="328930"/>
+                      <a:ext cx="6287377" cy="571580"/>
                     </a:xfrm>
                     <a:prstGeom prst="rect">
                       <a:avLst/>
@@ -830,22 +839,23 @@
       </w:pPr>
       <w:r>
         <w:rPr>
+          <w:noProof/>
           <w:lang w:val="ru-RU"/>
         </w:rPr>
         <w:lastRenderedPageBreak/>
         <w:drawing>
-          <wp:anchor distT="0" distB="0" distL="114300" distR="114300" simplePos="0" relativeHeight="251669504" behindDoc="0" locked="0" layoutInCell="1" allowOverlap="1" wp14:anchorId="58F4D4AA" wp14:editId="01B468F1">
+          <wp:anchor distT="0" distB="0" distL="114300" distR="114300" simplePos="0" relativeHeight="251621888" behindDoc="0" locked="0" layoutInCell="1" allowOverlap="1" wp14:anchorId="2AE5A85E" wp14:editId="0F2E6484">
             <wp:simplePos x="0" y="0"/>
             <wp:positionH relativeFrom="page">
               <wp:posOffset>731520</wp:posOffset>
             </wp:positionH>
             <wp:positionV relativeFrom="page">
-              <wp:posOffset>993352</wp:posOffset>
+              <wp:posOffset>1027430</wp:posOffset>
             </wp:positionV>
-            <wp:extent cx="6309360" cy="2251710"/>
-            <wp:effectExtent l="0" t="0" r="0" b="0"/>
+            <wp:extent cx="6309360" cy="2927985"/>
+            <wp:effectExtent l="0" t="0" r="0" b="5715"/>
             <wp:wrapTopAndBottom/>
-            <wp:docPr id="695197766" name="Рисунок 1"/>
+            <wp:docPr id="1993516825" name="Рисунок 1"/>
             <wp:cNvGraphicFramePr>
               <a:graphicFrameLocks xmlns:a="http://schemas.openxmlformats.org/drawingml/2006/main" noChangeAspect="1"/>
             </wp:cNvGraphicFramePr>
@@ -853,7 +863,7 @@
               <a:graphicData uri="http://schemas.openxmlformats.org/drawingml/2006/picture">
                 <pic:pic xmlns:pic="http://schemas.openxmlformats.org/drawingml/2006/picture">
                   <pic:nvPicPr>
-                    <pic:cNvPr id="695197766" name=""/>
+                    <pic:cNvPr id="1993516825" name=""/>
                     <pic:cNvPicPr/>
                   </pic:nvPicPr>
                   <pic:blipFill>
@@ -865,7 +875,7 @@
                   <pic:spPr>
                     <a:xfrm>
                       <a:off x="0" y="0"/>
-                      <a:ext cx="6309360" cy="2251710"/>
+                      <a:ext cx="6309360" cy="2927985"/>
                     </a:xfrm>
                     <a:prstGeom prst="rect">
                       <a:avLst/>
@@ -947,6 +957,242 @@
     </w:p>
     <w:p>
       <w:pPr>
+        <w:keepNext/>
+        <w:spacing w:before="200" w:after="80"/>
+        <w:rPr>
+          <w:lang w:val="ru-RU"/>
+        </w:rPr>
+      </w:pPr>
+      <w:r>
+        <w:rPr>
+          <w:b/>
+          <w:color w:val="4C1D95"/>
+          <w:sz w:val="25"/>
+        </w:rPr>
+        <w:t xml:space="preserve">🟡 </w:t>
+      </w:r>
+      <w:proofErr w:type="spellStart"/>
+      <w:r>
+        <w:rPr>
+          <w:b/>
+          <w:color w:val="4C1D95"/>
+          <w:sz w:val="25"/>
+        </w:rPr>
+        <w:t>Уровень</w:t>
+      </w:r>
+      <w:proofErr w:type="spellEnd"/>
+      <w:r>
+        <w:rPr>
+          <w:b/>
+          <w:color w:val="4C1D95"/>
+          <w:sz w:val="25"/>
+        </w:rPr>
+        <w:t xml:space="preserve"> 2 </w:t>
+      </w:r>
+      <w:r>
+        <w:rPr>
+          <w:b/>
+          <w:color w:val="4C1D95"/>
+          <w:sz w:val="25"/>
+        </w:rPr>
+        <w:t>[</w:t>
+      </w:r>
+      <w:r>
+        <w:rPr>
+          <w:b/>
+          <w:color w:val="4C1D95"/>
+          <w:sz w:val="25"/>
+          <w:lang w:val="ru-RU"/>
+        </w:rPr>
+        <w:t>2</w:t>
+      </w:r>
+      <w:r>
+        <w:rPr>
+          <w:b/>
+          <w:color w:val="4C1D95"/>
+          <w:sz w:val="25"/>
+        </w:rPr>
+        <w:t xml:space="preserve"> </w:t>
+      </w:r>
+      <w:r>
+        <w:rPr>
+          <w:b/>
+          <w:color w:val="4C1D95"/>
+          <w:sz w:val="25"/>
+          <w:lang w:val="ru-RU"/>
+        </w:rPr>
+        <w:t>балла</w:t>
+      </w:r>
+      <w:r>
+        <w:rPr>
+          <w:b/>
+          <w:color w:val="4C1D95"/>
+          <w:sz w:val="25"/>
+        </w:rPr>
+        <w:t>]</w:t>
+      </w:r>
+      <w:r>
+        <w:rPr>
+          <w:b/>
+          <w:color w:val="4C1D95"/>
+          <w:sz w:val="25"/>
+          <w:lang w:val="ru-RU"/>
+        </w:rPr>
+        <w:t xml:space="preserve"> (3)</w:t>
+      </w:r>
+    </w:p>
+    <w:p>
+      <w:pPr>
+        <w:pStyle w:val="a0"/>
+        <w:spacing w:after="60"/>
+        <w:rPr>
+          <w:lang w:val="ru-RU"/>
+        </w:rPr>
+      </w:pPr>
+      <w:r>
+        <w:rPr>
+          <w:noProof/>
+          <w:lang w:val="ru-RU"/>
+        </w:rPr>
+        <w:drawing>
+          <wp:anchor distT="0" distB="0" distL="114300" distR="114300" simplePos="0" relativeHeight="251623936" behindDoc="0" locked="0" layoutInCell="1" allowOverlap="1" wp14:anchorId="19A47080" wp14:editId="7DFD25BD">
+            <wp:simplePos x="0" y="0"/>
+            <wp:positionH relativeFrom="page">
+              <wp:posOffset>1691640</wp:posOffset>
+            </wp:positionH>
+            <wp:positionV relativeFrom="page">
+              <wp:posOffset>4715510</wp:posOffset>
+            </wp:positionV>
+            <wp:extent cx="4439270" cy="419158"/>
+            <wp:effectExtent l="0" t="0" r="0" b="0"/>
+            <wp:wrapTopAndBottom/>
+            <wp:docPr id="2017574772" name="Рисунок 1"/>
+            <wp:cNvGraphicFramePr>
+              <a:graphicFrameLocks xmlns:a="http://schemas.openxmlformats.org/drawingml/2006/main" noChangeAspect="1"/>
+            </wp:cNvGraphicFramePr>
+            <a:graphic xmlns:a="http://schemas.openxmlformats.org/drawingml/2006/main">
+              <a:graphicData uri="http://schemas.openxmlformats.org/drawingml/2006/picture">
+                <pic:pic xmlns:pic="http://schemas.openxmlformats.org/drawingml/2006/picture">
+                  <pic:nvPicPr>
+                    <pic:cNvPr id="2017574772" name=""/>
+                    <pic:cNvPicPr/>
+                  </pic:nvPicPr>
+                  <pic:blipFill>
+                    <a:blip r:embed="rId12"/>
+                    <a:stretch>
+                      <a:fillRect/>
+                    </a:stretch>
+                  </pic:blipFill>
+                  <pic:spPr>
+                    <a:xfrm>
+                      <a:off x="0" y="0"/>
+                      <a:ext cx="4439270" cy="419158"/>
+                    </a:xfrm>
+                    <a:prstGeom prst="rect">
+                      <a:avLst/>
+                    </a:prstGeom>
+                  </pic:spPr>
+                </pic:pic>
+              </a:graphicData>
+            </a:graphic>
+          </wp:anchor>
+        </w:drawing>
+      </w:r>
+      <w:r>
+        <w:rPr>
+          <w:b/>
+          <w:lang w:val="ru-RU"/>
+        </w:rPr>
+        <w:t xml:space="preserve">Инициализировать </w:t>
+      </w:r>
+      <w:r>
+        <w:rPr>
+          <w:lang w:val="ru-RU"/>
+        </w:rPr>
+        <w:t xml:space="preserve">локальный репозиторий в папке проекта </w:t>
+      </w:r>
+      <w:proofErr w:type="spellStart"/>
+      <w:r>
+        <w:t>wt</w:t>
+      </w:r>
+      <w:proofErr w:type="spellEnd"/>
+      <w:r>
+        <w:rPr>
+          <w:lang w:val="ru-RU"/>
+        </w:rPr>
+        <w:t>-</w:t>
+      </w:r>
+      <w:r>
+        <w:t>lab</w:t>
+      </w:r>
+      <w:r>
+        <w:rPr>
+          <w:lang w:val="ru-RU"/>
+        </w:rPr>
+        <w:t>1-1</w:t>
+      </w:r>
+      <w:r>
+        <w:t>git</w:t>
+      </w:r>
+      <w:r>
+        <w:rPr>
+          <w:lang w:val="ru-RU"/>
+        </w:rPr>
+        <w:t>-</w:t>
+      </w:r>
+      <w:proofErr w:type="spellStart"/>
+      <w:r>
+        <w:t>ivanov</w:t>
+      </w:r>
+      <w:proofErr w:type="spellEnd"/>
+      <w:r>
+        <w:rPr>
+          <w:lang w:val="ru-RU"/>
+        </w:rPr>
+        <w:t xml:space="preserve">. </w:t>
+      </w:r>
+      <w:r>
+        <w:rPr>
+          <w:lang w:val="ru-RU"/>
+        </w:rPr>
+        <w:t>(</w:t>
+      </w:r>
+      <w:r>
+        <w:rPr>
+          <w:rFonts w:ascii="Consolas" w:hAnsi="Consolas"/>
+          <w:color w:val="6B21A8"/>
+          <w:sz w:val="20"/>
+        </w:rPr>
+        <w:t>git</w:t>
+      </w:r>
+      <w:r>
+        <w:rPr>
+          <w:rFonts w:ascii="Consolas" w:hAnsi="Consolas"/>
+          <w:color w:val="6B21A8"/>
+          <w:sz w:val="20"/>
+          <w:lang w:val="ru-RU"/>
+        </w:rPr>
+        <w:t xml:space="preserve"> </w:t>
+      </w:r>
+      <w:proofErr w:type="spellStart"/>
+      <w:r>
+        <w:rPr>
+          <w:rFonts w:ascii="Consolas" w:hAnsi="Consolas"/>
+          <w:color w:val="6B21A8"/>
+          <w:sz w:val="20"/>
+        </w:rPr>
+        <w:t>init</w:t>
+      </w:r>
+      <w:proofErr w:type="spellEnd"/>
+      <w:r>
+        <w:rPr>
+          <w:lang w:val="ru-RU"/>
+        </w:rPr>
+        <w:t>)</w:t>
+      </w:r>
+    </w:p>
+    <w:p>
+      <w:pPr>
         <w:pStyle w:val="a0"/>
         <w:numPr>
           <w:ilvl w:val="0"/>
@@ -961,89 +1207,123 @@
     </w:p>
     <w:p>
       <w:pPr>
-        <w:keepNext/>
-        <w:spacing w:before="200" w:after="80"/>
+        <w:pStyle w:val="a0"/>
+        <w:spacing w:after="60"/>
         <w:rPr>
           <w:lang w:val="ru-RU"/>
         </w:rPr>
       </w:pPr>
       <w:r>
         <w:rPr>
-          <w:b/>
-          <w:color w:val="4C1D95"/>
-          <w:sz w:val="25"/>
-        </w:rPr>
-        <w:t xml:space="preserve">🟡 </w:t>
-      </w:r>
-      <w:proofErr w:type="spellStart"/>
-      <w:r>
-        <w:rPr>
-          <w:b/>
-          <w:color w:val="4C1D95"/>
-          <w:sz w:val="25"/>
-        </w:rPr>
-        <w:t>Уровень</w:t>
-      </w:r>
-      <w:proofErr w:type="spellEnd"/>
-      <w:r>
-        <w:rPr>
-          <w:b/>
-          <w:color w:val="4C1D95"/>
-          <w:sz w:val="25"/>
-        </w:rPr>
-        <w:t xml:space="preserve"> 2 </w:t>
-      </w:r>
-      <w:r>
-        <w:rPr>
-          <w:b/>
-          <w:color w:val="4C1D95"/>
-          <w:sz w:val="25"/>
-        </w:rPr>
-        <w:t>[</w:t>
-      </w:r>
-      <w:r>
-        <w:rPr>
-          <w:b/>
-          <w:color w:val="4C1D95"/>
-          <w:sz w:val="25"/>
-          <w:lang w:val="ru-RU"/>
-        </w:rPr>
-        <w:t>2</w:t>
-      </w:r>
-      <w:r>
-        <w:rPr>
-          <w:b/>
-          <w:color w:val="4C1D95"/>
-          <w:sz w:val="25"/>
-        </w:rPr>
-        <w:t xml:space="preserve"> </w:t>
-      </w:r>
-      <w:r>
-        <w:rPr>
-          <w:b/>
-          <w:color w:val="4C1D95"/>
-          <w:sz w:val="25"/>
-          <w:lang w:val="ru-RU"/>
-        </w:rPr>
-        <w:t>балла</w:t>
-      </w:r>
-      <w:r>
-        <w:rPr>
-          <w:b/>
-          <w:color w:val="4C1D95"/>
-          <w:sz w:val="25"/>
-        </w:rPr>
-        <w:t>]</w:t>
-      </w:r>
-      <w:r>
-        <w:rPr>
-          <w:b/>
-          <w:color w:val="4C1D95"/>
-          <w:sz w:val="25"/>
-          <w:lang w:val="ru-RU"/>
-        </w:rPr>
-        <w:t xml:space="preserve"> (3)</w:t>
-      </w:r>
+          <w:noProof/>
+          <w:lang w:val="ru-RU"/>
+        </w:rPr>
+        <w:drawing>
+          <wp:anchor distT="0" distB="0" distL="114300" distR="114300" simplePos="0" relativeHeight="251624960" behindDoc="0" locked="0" layoutInCell="1" allowOverlap="1" wp14:anchorId="35DF82A1" wp14:editId="5E055EBE">
+            <wp:simplePos x="0" y="0"/>
+            <wp:positionH relativeFrom="page">
+              <wp:posOffset>1341120</wp:posOffset>
+            </wp:positionH>
+            <wp:positionV relativeFrom="page">
+              <wp:posOffset>5708015</wp:posOffset>
+            </wp:positionV>
+            <wp:extent cx="5058481" cy="447737"/>
+            <wp:effectExtent l="0" t="0" r="8890" b="9525"/>
+            <wp:wrapTopAndBottom/>
+            <wp:docPr id="2091131667" name="Рисунок 1"/>
+            <wp:cNvGraphicFramePr>
+              <a:graphicFrameLocks xmlns:a="http://schemas.openxmlformats.org/drawingml/2006/main" noChangeAspect="1"/>
+            </wp:cNvGraphicFramePr>
+            <a:graphic xmlns:a="http://schemas.openxmlformats.org/drawingml/2006/main">
+              <a:graphicData uri="http://schemas.openxmlformats.org/drawingml/2006/picture">
+                <pic:pic xmlns:pic="http://schemas.openxmlformats.org/drawingml/2006/picture">
+                  <pic:nvPicPr>
+                    <pic:cNvPr id="2091131667" name=""/>
+                    <pic:cNvPicPr/>
+                  </pic:nvPicPr>
+                  <pic:blipFill>
+                    <a:blip r:embed="rId13"/>
+                    <a:stretch>
+                      <a:fillRect/>
+                    </a:stretch>
+                  </pic:blipFill>
+                  <pic:spPr>
+                    <a:xfrm>
+                      <a:off x="0" y="0"/>
+                      <a:ext cx="5058481" cy="447737"/>
+                    </a:xfrm>
+                    <a:prstGeom prst="rect">
+                      <a:avLst/>
+                    </a:prstGeom>
+                  </pic:spPr>
+                </pic:pic>
+              </a:graphicData>
+            </a:graphic>
+          </wp:anchor>
+        </w:drawing>
+      </w:r>
+      <w:r>
+        <w:rPr>
+          <w:b/>
+          <w:lang w:val="ru-RU"/>
+        </w:rPr>
+        <w:t xml:space="preserve">Создать </w:t>
+      </w:r>
+      <w:r>
+        <w:rPr>
+          <w:lang w:val="ru-RU"/>
+        </w:rPr>
+        <w:t xml:space="preserve">файлы </w:t>
+      </w:r>
+      <w:r>
+        <w:t>README</w:t>
+      </w:r>
+      <w:r>
+        <w:rPr>
+          <w:lang w:val="ru-RU"/>
+        </w:rPr>
+        <w:t>.</w:t>
+      </w:r>
+      <w:r>
+        <w:t>md</w:t>
+      </w:r>
+      <w:r>
+        <w:rPr>
+          <w:lang w:val="ru-RU"/>
+        </w:rPr>
+        <w:t xml:space="preserve"> и разметку сайта «Как я провел лето» в </w:t>
+      </w:r>
+      <w:r>
+        <w:t>index</w:t>
+      </w:r>
+      <w:r>
+        <w:rPr>
+          <w:lang w:val="ru-RU"/>
+        </w:rPr>
+        <w:t>.</w:t>
+      </w:r>
+      <w:r>
+        <w:t>html</w:t>
+      </w:r>
+      <w:r>
+        <w:rPr>
+          <w:lang w:val="ru-RU"/>
+        </w:rPr>
+        <w:t>.</w:t>
+      </w:r>
+    </w:p>
+    <w:p>
+      <w:pPr>
+        <w:pStyle w:val="a0"/>
+        <w:numPr>
+          <w:ilvl w:val="0"/>
+          <w:numId w:val="0"/>
+        </w:numPr>
+        <w:spacing w:after="60"/>
+        <w:rPr>
+          <w:lang w:val="ru-RU"/>
+        </w:rPr>
+      </w:pPr>
     </w:p>
     <w:p>
       <w:pPr>
@@ -1055,56 +1335,65 @@
       </w:pPr>
       <w:r>
         <w:rPr>
-          <w:b/>
-          <w:lang w:val="ru-RU"/>
-        </w:rPr>
-        <w:t xml:space="preserve">Инициализировать </w:t>
-      </w:r>
-      <w:r>
-        <w:rPr>
-          <w:lang w:val="ru-RU"/>
-        </w:rPr>
-        <w:t xml:space="preserve">локальный репозиторий в папке проекта </w:t>
-      </w:r>
-      <w:proofErr w:type="spellStart"/>
-      <w:r>
-        <w:t>wt</w:t>
-      </w:r>
-      <w:proofErr w:type="spellEnd"/>
-      <w:r>
-        <w:rPr>
-          <w:lang w:val="ru-RU"/>
-        </w:rPr>
-        <w:t>-</w:t>
-      </w:r>
-      <w:r>
-        <w:t>lab</w:t>
-      </w:r>
-      <w:r>
-        <w:rPr>
-          <w:lang w:val="ru-RU"/>
-        </w:rPr>
-        <w:t>1-1</w:t>
-      </w:r>
-      <w:r>
-        <w:t>git</w:t>
-      </w:r>
-      <w:r>
-        <w:rPr>
-          <w:lang w:val="ru-RU"/>
-        </w:rPr>
-        <w:t>-</w:t>
-      </w:r>
-      <w:proofErr w:type="spellStart"/>
-      <w:r>
-        <w:t>ivanov</w:t>
-      </w:r>
-      <w:proofErr w:type="spellEnd"/>
-      <w:r>
-        <w:rPr>
-          <w:lang w:val="ru-RU"/>
-        </w:rPr>
-        <w:t xml:space="preserve">. </w:t>
+          <w:noProof/>
+          <w:lang w:val="ru-RU"/>
+        </w:rPr>
+        <w:drawing>
+          <wp:anchor distT="0" distB="0" distL="114300" distR="114300" simplePos="0" relativeHeight="251627008" behindDoc="0" locked="0" layoutInCell="1" allowOverlap="1" wp14:anchorId="6049839D" wp14:editId="3009235B">
+            <wp:simplePos x="0" y="0"/>
+            <wp:positionH relativeFrom="page">
+              <wp:posOffset>937260</wp:posOffset>
+            </wp:positionH>
+            <wp:positionV relativeFrom="page">
+              <wp:posOffset>6971030</wp:posOffset>
+            </wp:positionV>
+            <wp:extent cx="5915851" cy="1952898"/>
+            <wp:effectExtent l="0" t="0" r="0" b="9525"/>
+            <wp:wrapTopAndBottom/>
+            <wp:docPr id="1934515844" name="Рисунок 1"/>
+            <wp:cNvGraphicFramePr>
+              <a:graphicFrameLocks xmlns:a="http://schemas.openxmlformats.org/drawingml/2006/main" noChangeAspect="1"/>
+            </wp:cNvGraphicFramePr>
+            <a:graphic xmlns:a="http://schemas.openxmlformats.org/drawingml/2006/main">
+              <a:graphicData uri="http://schemas.openxmlformats.org/drawingml/2006/picture">
+                <pic:pic xmlns:pic="http://schemas.openxmlformats.org/drawingml/2006/picture">
+                  <pic:nvPicPr>
+                    <pic:cNvPr id="1934515844" name=""/>
+                    <pic:cNvPicPr/>
+                  </pic:nvPicPr>
+                  <pic:blipFill>
+                    <a:blip r:embed="rId14"/>
+                    <a:stretch>
+                      <a:fillRect/>
+                    </a:stretch>
+                  </pic:blipFill>
+                  <pic:spPr>
+                    <a:xfrm>
+                      <a:off x="0" y="0"/>
+                      <a:ext cx="5915851" cy="1952898"/>
+                    </a:xfrm>
+                    <a:prstGeom prst="rect">
+                      <a:avLst/>
+                    </a:prstGeom>
+                  </pic:spPr>
+                </pic:pic>
+              </a:graphicData>
+            </a:graphic>
+          </wp:anchor>
+        </w:drawing>
+      </w:r>
+      <w:r>
+        <w:rPr>
+          <w:b/>
+          <w:lang w:val="ru-RU"/>
+        </w:rPr>
+        <w:t xml:space="preserve">Перевести </w:t>
+      </w:r>
+      <w:r>
+        <w:rPr>
+          <w:lang w:val="ru-RU"/>
+        </w:rPr>
+        <w:t xml:space="preserve">файлы в область подготовленных файлов и сделать первый коммит. </w:t>
       </w:r>
       <w:r>
         <w:rPr>
@@ -1129,22 +1418,129 @@
         </w:rPr>
         <w:t xml:space="preserve"> </w:t>
       </w:r>
-      <w:proofErr w:type="spellStart"/>
       <w:r>
         <w:rPr>
           <w:rFonts w:ascii="Consolas" w:hAnsi="Consolas"/>
           <w:color w:val="6B21A8"/>
           <w:sz w:val="20"/>
         </w:rPr>
+        <w:t>add</w:t>
+      </w:r>
+      <w:r>
+        <w:rPr>
+          <w:rFonts w:ascii="Consolas" w:hAnsi="Consolas"/>
+          <w:color w:val="6B21A8"/>
+          <w:sz w:val="20"/>
+          <w:lang w:val="ru-RU"/>
+        </w:rPr>
+        <w:t xml:space="preserve"> . &amp;&amp; </w:t>
+      </w:r>
+      <w:r>
+        <w:rPr>
+          <w:rFonts w:ascii="Consolas" w:hAnsi="Consolas"/>
+          <w:color w:val="6B21A8"/>
+          <w:sz w:val="20"/>
+        </w:rPr>
+        <w:t>git</w:t>
+      </w:r>
+      <w:r>
+        <w:rPr>
+          <w:rFonts w:ascii="Consolas" w:hAnsi="Consolas"/>
+          <w:color w:val="6B21A8"/>
+          <w:sz w:val="20"/>
+          <w:lang w:val="ru-RU"/>
+        </w:rPr>
+        <w:t xml:space="preserve"> </w:t>
+      </w:r>
+      <w:r>
+        <w:rPr>
+          <w:rFonts w:ascii="Consolas" w:hAnsi="Consolas"/>
+          <w:color w:val="6B21A8"/>
+          <w:sz w:val="20"/>
+        </w:rPr>
+        <w:t>commit</w:t>
+      </w:r>
+      <w:r>
+        <w:rPr>
+          <w:rFonts w:ascii="Consolas" w:hAnsi="Consolas"/>
+          <w:color w:val="6B21A8"/>
+          <w:sz w:val="20"/>
+          <w:lang w:val="ru-RU"/>
+        </w:rPr>
+        <w:t xml:space="preserve"> -</w:t>
+      </w:r>
+      <w:r>
+        <w:rPr>
+          <w:rFonts w:ascii="Consolas" w:hAnsi="Consolas"/>
+          <w:color w:val="6B21A8"/>
+          <w:sz w:val="20"/>
+        </w:rPr>
+        <w:t>m</w:t>
+      </w:r>
+      <w:r>
+        <w:rPr>
+          <w:rFonts w:ascii="Consolas" w:hAnsi="Consolas"/>
+          <w:color w:val="6B21A8"/>
+          <w:sz w:val="20"/>
+          <w:lang w:val="ru-RU"/>
+        </w:rPr>
+        <w:t xml:space="preserve"> "</w:t>
+      </w:r>
+      <w:r>
+        <w:rPr>
+          <w:rFonts w:ascii="Consolas" w:hAnsi="Consolas"/>
+          <w:color w:val="6B21A8"/>
+          <w:sz w:val="20"/>
+        </w:rPr>
+        <w:t>feat</w:t>
+      </w:r>
+      <w:r>
+        <w:rPr>
+          <w:rFonts w:ascii="Consolas" w:hAnsi="Consolas"/>
+          <w:color w:val="6B21A8"/>
+          <w:sz w:val="20"/>
+          <w:lang w:val="ru-RU"/>
+        </w:rPr>
+        <w:t xml:space="preserve">: </w:t>
+      </w:r>
+      <w:proofErr w:type="spellStart"/>
+      <w:r>
+        <w:rPr>
+          <w:rFonts w:ascii="Consolas" w:hAnsi="Consolas"/>
+          <w:color w:val="6B21A8"/>
+          <w:sz w:val="20"/>
+        </w:rPr>
         <w:t>init</w:t>
       </w:r>
       <w:proofErr w:type="spellEnd"/>
       <w:r>
         <w:rPr>
+          <w:rFonts w:ascii="Consolas" w:hAnsi="Consolas"/>
+          <w:color w:val="6B21A8"/>
+          <w:sz w:val="20"/>
+          <w:lang w:val="ru-RU"/>
+        </w:rPr>
+        <w:t>"</w:t>
+      </w:r>
+      <w:r>
+        <w:rPr>
           <w:lang w:val="ru-RU"/>
         </w:rPr>
         <w:t>)</w:t>
       </w:r>
+    </w:p>
+    <w:p>
+      <w:pPr>
+        <w:pStyle w:val="a0"/>
+        <w:numPr>
+          <w:ilvl w:val="0"/>
+          <w:numId w:val="0"/>
+        </w:numPr>
+        <w:spacing w:after="60"/>
+        <w:rPr>
+          <w:lang w:val="ru-RU"/>
+        </w:rPr>
+      </w:pPr>
     </w:p>
     <w:p>
       <w:pPr>
@@ -1156,217 +1552,103 @@
       </w:pPr>
       <w:r>
         <w:rPr>
-          <w:b/>
-          <w:lang w:val="ru-RU"/>
-        </w:rPr>
-        <w:t xml:space="preserve">Создать </w:t>
-      </w:r>
-      <w:r>
-        <w:rPr>
-          <w:lang w:val="ru-RU"/>
-        </w:rPr>
-        <w:t xml:space="preserve">файлы </w:t>
-      </w:r>
-      <w:r>
-        <w:t>README</w:t>
-      </w:r>
-      <w:r>
-        <w:rPr>
-          <w:lang w:val="ru-RU"/>
-        </w:rPr>
-        <w:t>.</w:t>
-      </w:r>
-      <w:r>
-        <w:t>md</w:t>
-      </w:r>
-      <w:r>
-        <w:rPr>
-          <w:lang w:val="ru-RU"/>
-        </w:rPr>
-        <w:t xml:space="preserve"> и разметку сайта «Как я провел лето» в </w:t>
-      </w:r>
-      <w:r>
-        <w:t>index</w:t>
-      </w:r>
-      <w:r>
-        <w:rPr>
-          <w:lang w:val="ru-RU"/>
-        </w:rPr>
-        <w:t>.</w:t>
-      </w:r>
-      <w:r>
-        <w:t>html</w:t>
-      </w:r>
-      <w:r>
-        <w:rPr>
-          <w:lang w:val="ru-RU"/>
-        </w:rPr>
-        <w:t>.</w:t>
-      </w:r>
-    </w:p>
-    <w:p>
-      <w:pPr>
-        <w:pStyle w:val="a0"/>
-        <w:spacing w:after="60"/>
-        <w:rPr>
-          <w:lang w:val="ru-RU"/>
-        </w:rPr>
-      </w:pPr>
-      <w:r>
-        <w:rPr>
-          <w:b/>
-          <w:lang w:val="ru-RU"/>
-        </w:rPr>
-        <w:t xml:space="preserve">Перевести </w:t>
-      </w:r>
-      <w:r>
-        <w:rPr>
-          <w:lang w:val="ru-RU"/>
-        </w:rPr>
-        <w:t xml:space="preserve">файлы в область подготовленных файлов и сделать первый коммит. </w:t>
-      </w:r>
-      <w:r>
-        <w:rPr>
-          <w:lang w:val="ru-RU"/>
-        </w:rPr>
-        <w:t>(</w:t>
-      </w:r>
-      <w:r>
-        <w:rPr>
-          <w:rFonts w:ascii="Consolas" w:hAnsi="Consolas"/>
-          <w:color w:val="6B21A8"/>
-          <w:sz w:val="20"/>
-        </w:rPr>
-        <w:t>git</w:t>
-      </w:r>
-      <w:r>
-        <w:rPr>
-          <w:rFonts w:ascii="Consolas" w:hAnsi="Consolas"/>
-          <w:color w:val="6B21A8"/>
-          <w:sz w:val="20"/>
-          <w:lang w:val="ru-RU"/>
-        </w:rPr>
-        <w:t xml:space="preserve"> </w:t>
-      </w:r>
-      <w:r>
-        <w:rPr>
-          <w:rFonts w:ascii="Consolas" w:hAnsi="Consolas"/>
-          <w:color w:val="6B21A8"/>
-          <w:sz w:val="20"/>
-        </w:rPr>
-        <w:t>add</w:t>
-      </w:r>
-      <w:r>
-        <w:rPr>
-          <w:rFonts w:ascii="Consolas" w:hAnsi="Consolas"/>
-          <w:color w:val="6B21A8"/>
-          <w:sz w:val="20"/>
-          <w:lang w:val="ru-RU"/>
-        </w:rPr>
-        <w:t xml:space="preserve"> . &amp;&amp; </w:t>
-      </w:r>
-      <w:r>
-        <w:rPr>
-          <w:rFonts w:ascii="Consolas" w:hAnsi="Consolas"/>
-          <w:color w:val="6B21A8"/>
-          <w:sz w:val="20"/>
-        </w:rPr>
-        <w:t>git</w:t>
-      </w:r>
-      <w:r>
-        <w:rPr>
-          <w:rFonts w:ascii="Consolas" w:hAnsi="Consolas"/>
-          <w:color w:val="6B21A8"/>
-          <w:sz w:val="20"/>
-          <w:lang w:val="ru-RU"/>
-        </w:rPr>
-        <w:t xml:space="preserve"> </w:t>
-      </w:r>
-      <w:r>
-        <w:rPr>
-          <w:rFonts w:ascii="Consolas" w:hAnsi="Consolas"/>
-          <w:color w:val="6B21A8"/>
-          <w:sz w:val="20"/>
-        </w:rPr>
-        <w:t>commit</w:t>
-      </w:r>
-      <w:r>
-        <w:rPr>
-          <w:rFonts w:ascii="Consolas" w:hAnsi="Consolas"/>
-          <w:color w:val="6B21A8"/>
-          <w:sz w:val="20"/>
-          <w:lang w:val="ru-RU"/>
-        </w:rPr>
-        <w:t xml:space="preserve"> -</w:t>
-      </w:r>
-      <w:r>
-        <w:rPr>
-          <w:rFonts w:ascii="Consolas" w:hAnsi="Consolas"/>
-          <w:color w:val="6B21A8"/>
-          <w:sz w:val="20"/>
-        </w:rPr>
-        <w:t>m</w:t>
-      </w:r>
-      <w:r>
-        <w:rPr>
-          <w:rFonts w:ascii="Consolas" w:hAnsi="Consolas"/>
-          <w:color w:val="6B21A8"/>
-          <w:sz w:val="20"/>
-          <w:lang w:val="ru-RU"/>
-        </w:rPr>
-        <w:t xml:space="preserve"> "</w:t>
-      </w:r>
-      <w:r>
-        <w:rPr>
-          <w:rFonts w:ascii="Consolas" w:hAnsi="Consolas"/>
-          <w:color w:val="6B21A8"/>
-          <w:sz w:val="20"/>
-        </w:rPr>
-        <w:t>feat</w:t>
-      </w:r>
-      <w:r>
-        <w:rPr>
-          <w:rFonts w:ascii="Consolas" w:hAnsi="Consolas"/>
-          <w:color w:val="6B21A8"/>
-          <w:sz w:val="20"/>
-          <w:lang w:val="ru-RU"/>
-        </w:rPr>
-        <w:t xml:space="preserve">: </w:t>
-      </w:r>
-      <w:proofErr w:type="spellStart"/>
-      <w:r>
-        <w:rPr>
-          <w:rFonts w:ascii="Consolas" w:hAnsi="Consolas"/>
-          <w:color w:val="6B21A8"/>
-          <w:sz w:val="20"/>
-        </w:rPr>
-        <w:t>init</w:t>
-      </w:r>
-      <w:proofErr w:type="spellEnd"/>
-      <w:r>
-        <w:rPr>
-          <w:rFonts w:ascii="Consolas" w:hAnsi="Consolas"/>
-          <w:color w:val="6B21A8"/>
-          <w:sz w:val="20"/>
-          <w:lang w:val="ru-RU"/>
-        </w:rPr>
-        <w:t>"</w:t>
-      </w:r>
-      <w:r>
-        <w:rPr>
-          <w:lang w:val="ru-RU"/>
-        </w:rPr>
-        <w:t>)</w:t>
-      </w:r>
-    </w:p>
-    <w:p>
-      <w:pPr>
-        <w:pStyle w:val="a0"/>
-        <w:spacing w:after="60"/>
-        <w:rPr>
-          <w:lang w:val="ru-RU"/>
-        </w:rPr>
-      </w:pPr>
+          <w:noProof/>
+          <w:lang w:val="ru-RU"/>
+        </w:rPr>
+        <w:lastRenderedPageBreak/>
+        <w:drawing>
+          <wp:anchor distT="0" distB="0" distL="114300" distR="114300" simplePos="0" relativeHeight="251637248" behindDoc="0" locked="0" layoutInCell="1" allowOverlap="1" wp14:anchorId="22173BE7" wp14:editId="7572A72D">
+            <wp:simplePos x="0" y="0"/>
+            <wp:positionH relativeFrom="page">
+              <wp:posOffset>1699260</wp:posOffset>
+            </wp:positionH>
+            <wp:positionV relativeFrom="page">
+              <wp:posOffset>3362325</wp:posOffset>
+            </wp:positionV>
+            <wp:extent cx="4362450" cy="885825"/>
+            <wp:effectExtent l="0" t="0" r="0" b="9525"/>
+            <wp:wrapTopAndBottom/>
+            <wp:docPr id="1428030019" name="Рисунок 1"/>
+            <wp:cNvGraphicFramePr>
+              <a:graphicFrameLocks xmlns:a="http://schemas.openxmlformats.org/drawingml/2006/main" noChangeAspect="1"/>
+            </wp:cNvGraphicFramePr>
+            <a:graphic xmlns:a="http://schemas.openxmlformats.org/drawingml/2006/main">
+              <a:graphicData uri="http://schemas.openxmlformats.org/drawingml/2006/picture">
+                <pic:pic xmlns:pic="http://schemas.openxmlformats.org/drawingml/2006/picture">
+                  <pic:nvPicPr>
+                    <pic:cNvPr id="1428030019" name=""/>
+                    <pic:cNvPicPr/>
+                  </pic:nvPicPr>
+                  <pic:blipFill>
+                    <a:blip r:embed="rId15"/>
+                    <a:stretch>
+                      <a:fillRect/>
+                    </a:stretch>
+                  </pic:blipFill>
+                  <pic:spPr>
+                    <a:xfrm>
+                      <a:off x="0" y="0"/>
+                      <a:ext cx="4362450" cy="885825"/>
+                    </a:xfrm>
+                    <a:prstGeom prst="rect">
+                      <a:avLst/>
+                    </a:prstGeom>
+                  </pic:spPr>
+                </pic:pic>
+              </a:graphicData>
+            </a:graphic>
+          </wp:anchor>
+        </w:drawing>
+      </w:r>
+      <w:r>
+        <w:rPr>
+          <w:noProof/>
+          <w:lang w:val="ru-RU"/>
+        </w:rPr>
+        <w:drawing>
+          <wp:anchor distT="0" distB="0" distL="114300" distR="114300" simplePos="0" relativeHeight="251647488" behindDoc="0" locked="0" layoutInCell="1" allowOverlap="1" wp14:anchorId="66A3436A" wp14:editId="48BFA175">
+            <wp:simplePos x="0" y="0"/>
+            <wp:positionH relativeFrom="page">
+              <wp:posOffset>2171700</wp:posOffset>
+            </wp:positionH>
+            <wp:positionV relativeFrom="page">
+              <wp:posOffset>1228725</wp:posOffset>
+            </wp:positionV>
+            <wp:extent cx="3429479" cy="1952898"/>
+            <wp:effectExtent l="0" t="0" r="0" b="9525"/>
+            <wp:wrapTopAndBottom/>
+            <wp:docPr id="257294878" name="Рисунок 1"/>
+            <wp:cNvGraphicFramePr>
+              <a:graphicFrameLocks xmlns:a="http://schemas.openxmlformats.org/drawingml/2006/main" noChangeAspect="1"/>
+            </wp:cNvGraphicFramePr>
+            <a:graphic xmlns:a="http://schemas.openxmlformats.org/drawingml/2006/main">
+              <a:graphicData uri="http://schemas.openxmlformats.org/drawingml/2006/picture">
+                <pic:pic xmlns:pic="http://schemas.openxmlformats.org/drawingml/2006/picture">
+                  <pic:nvPicPr>
+                    <pic:cNvPr id="257294878" name=""/>
+                    <pic:cNvPicPr/>
+                  </pic:nvPicPr>
+                  <pic:blipFill>
+                    <a:blip r:embed="rId16"/>
+                    <a:stretch>
+                      <a:fillRect/>
+                    </a:stretch>
+                  </pic:blipFill>
+                  <pic:spPr>
+                    <a:xfrm>
+                      <a:off x="0" y="0"/>
+                      <a:ext cx="3429479" cy="1952898"/>
+                    </a:xfrm>
+                    <a:prstGeom prst="rect">
+                      <a:avLst/>
+                    </a:prstGeom>
+                  </pic:spPr>
+                </pic:pic>
+              </a:graphicData>
+            </a:graphic>
+          </wp:anchor>
+        </w:drawing>
+      </w:r>
       <w:r>
         <w:rPr>
           <w:b/>
@@ -1530,6 +1812,55 @@
       </w:pPr>
       <w:r>
         <w:rPr>
+          <w:noProof/>
+          <w:lang w:val="ru-RU"/>
+        </w:rPr>
+        <w:drawing>
+          <wp:anchor distT="0" distB="0" distL="114300" distR="114300" simplePos="0" relativeHeight="251664896" behindDoc="0" locked="0" layoutInCell="1" allowOverlap="1" wp14:anchorId="347AC861" wp14:editId="056D72BD">
+            <wp:simplePos x="0" y="0"/>
+            <wp:positionH relativeFrom="page">
+              <wp:posOffset>1661160</wp:posOffset>
+            </wp:positionH>
+            <wp:positionV relativeFrom="page">
+              <wp:posOffset>5029200</wp:posOffset>
+            </wp:positionV>
+            <wp:extent cx="3981450" cy="361950"/>
+            <wp:effectExtent l="0" t="0" r="0" b="0"/>
+            <wp:wrapSquare wrapText="bothSides"/>
+            <wp:docPr id="1636944653" name="Рисунок 1"/>
+            <wp:cNvGraphicFramePr>
+              <a:graphicFrameLocks xmlns:a="http://schemas.openxmlformats.org/drawingml/2006/main" noChangeAspect="1"/>
+            </wp:cNvGraphicFramePr>
+            <a:graphic xmlns:a="http://schemas.openxmlformats.org/drawingml/2006/main">
+              <a:graphicData uri="http://schemas.openxmlformats.org/drawingml/2006/picture">
+                <pic:pic xmlns:pic="http://schemas.openxmlformats.org/drawingml/2006/picture">
+                  <pic:nvPicPr>
+                    <pic:cNvPr id="1636944653" name=""/>
+                    <pic:cNvPicPr/>
+                  </pic:nvPicPr>
+                  <pic:blipFill>
+                    <a:blip r:embed="rId17"/>
+                    <a:stretch>
+                      <a:fillRect/>
+                    </a:stretch>
+                  </pic:blipFill>
+                  <pic:spPr>
+                    <a:xfrm>
+                      <a:off x="0" y="0"/>
+                      <a:ext cx="3981450" cy="361950"/>
+                    </a:xfrm>
+                    <a:prstGeom prst="rect">
+                      <a:avLst/>
+                    </a:prstGeom>
+                  </pic:spPr>
+                </pic:pic>
+              </a:graphicData>
+            </a:graphic>
+          </wp:anchor>
+        </w:drawing>
+      </w:r>
+      <w:r>
+        <w:rPr>
           <w:b/>
           <w:lang w:val="ru-RU"/>
         </w:rPr>
@@ -1572,6 +1903,19 @@
       </w:r>
       <w:r>
         <w:t>)</w:t>
+      </w:r>
+    </w:p>
+    <w:p>
+      <w:pPr>
+        <w:pStyle w:val="a0"/>
+        <w:numPr>
+          <w:ilvl w:val="0"/>
+          <w:numId w:val="0"/>
+        </w:numPr>
+        <w:spacing w:after="60"/>
+      </w:pPr>
+      <w:r>
+        <w:t xml:space="preserve"> </w:t>
       </w:r>
     </w:p>
     <w:p>
@@ -1621,6 +1965,124 @@
         </w:rPr>
         <w:t xml:space="preserve"> изменения.</w:t>
       </w:r>
+      <w:r>
+        <w:rPr>
+          <w:noProof/>
+          <w:lang w:val="ru-RU"/>
+        </w:rPr>
+        <w:t xml:space="preserve"> </w:t>
+      </w:r>
+    </w:p>
+    <w:p>
+      <w:pPr>
+        <w:pStyle w:val="a0"/>
+        <w:numPr>
+          <w:ilvl w:val="0"/>
+          <w:numId w:val="0"/>
+        </w:numPr>
+        <w:spacing w:after="60"/>
+        <w:rPr>
+          <w:lang w:val="ru-RU"/>
+        </w:rPr>
+      </w:pPr>
+      <w:r>
+        <w:rPr>
+          <w:noProof/>
+          <w:lang w:val="ru-RU"/>
+        </w:rPr>
+        <w:drawing>
+          <wp:anchor distT="0" distB="0" distL="114300" distR="114300" simplePos="0" relativeHeight="251678208" behindDoc="0" locked="0" layoutInCell="1" allowOverlap="1" wp14:anchorId="3D02A73C" wp14:editId="0B87B4B9">
+            <wp:simplePos x="0" y="0"/>
+            <wp:positionH relativeFrom="page">
+              <wp:posOffset>1821180</wp:posOffset>
+            </wp:positionH>
+            <wp:positionV relativeFrom="page">
+              <wp:posOffset>6751955</wp:posOffset>
+            </wp:positionV>
+            <wp:extent cx="4048690" cy="924054"/>
+            <wp:effectExtent l="0" t="0" r="9525" b="9525"/>
+            <wp:wrapTopAndBottom/>
+            <wp:docPr id="1354494901" name="Рисунок 1"/>
+            <wp:cNvGraphicFramePr>
+              <a:graphicFrameLocks xmlns:a="http://schemas.openxmlformats.org/drawingml/2006/main" noChangeAspect="1"/>
+            </wp:cNvGraphicFramePr>
+            <a:graphic xmlns:a="http://schemas.openxmlformats.org/drawingml/2006/main">
+              <a:graphicData uri="http://schemas.openxmlformats.org/drawingml/2006/picture">
+                <pic:pic xmlns:pic="http://schemas.openxmlformats.org/drawingml/2006/picture">
+                  <pic:nvPicPr>
+                    <pic:cNvPr id="1354494901" name=""/>
+                    <pic:cNvPicPr/>
+                  </pic:nvPicPr>
+                  <pic:blipFill>
+                    <a:blip r:embed="rId18"/>
+                    <a:stretch>
+                      <a:fillRect/>
+                    </a:stretch>
+                  </pic:blipFill>
+                  <pic:spPr>
+                    <a:xfrm>
+                      <a:off x="0" y="0"/>
+                      <a:ext cx="4048690" cy="924054"/>
+                    </a:xfrm>
+                    <a:prstGeom prst="rect">
+                      <a:avLst/>
+                    </a:prstGeom>
+                  </pic:spPr>
+                </pic:pic>
+              </a:graphicData>
+            </a:graphic>
+          </wp:anchor>
+        </w:drawing>
+      </w:r>
+      <w:r>
+        <w:rPr>
+          <w:noProof/>
+          <w:lang w:val="ru-RU"/>
+        </w:rPr>
+        <w:drawing>
+          <wp:anchor distT="0" distB="0" distL="114300" distR="114300" simplePos="0" relativeHeight="251672064" behindDoc="0" locked="0" layoutInCell="1" allowOverlap="1" wp14:anchorId="1B43C36D" wp14:editId="189F27EF">
+            <wp:simplePos x="0" y="0"/>
+            <wp:positionH relativeFrom="page">
+              <wp:posOffset>1249680</wp:posOffset>
+            </wp:positionH>
+            <wp:positionV relativeFrom="page">
+              <wp:posOffset>5852160</wp:posOffset>
+            </wp:positionV>
+            <wp:extent cx="5125085" cy="762000"/>
+            <wp:effectExtent l="0" t="0" r="0" b="0"/>
+            <wp:wrapSquare wrapText="bothSides"/>
+            <wp:docPr id="1245797380" name="Рисунок 1"/>
+            <wp:cNvGraphicFramePr>
+              <a:graphicFrameLocks xmlns:a="http://schemas.openxmlformats.org/drawingml/2006/main" noChangeAspect="1"/>
+            </wp:cNvGraphicFramePr>
+            <a:graphic xmlns:a="http://schemas.openxmlformats.org/drawingml/2006/main">
+              <a:graphicData uri="http://schemas.openxmlformats.org/drawingml/2006/picture">
+                <pic:pic xmlns:pic="http://schemas.openxmlformats.org/drawingml/2006/picture">
+                  <pic:nvPicPr>
+                    <pic:cNvPr id="1245797380" name=""/>
+                    <pic:cNvPicPr/>
+                  </pic:nvPicPr>
+                  <pic:blipFill>
+                    <a:blip r:embed="rId19"/>
+                    <a:stretch>
+                      <a:fillRect/>
+                    </a:stretch>
+                  </pic:blipFill>
+                  <pic:spPr>
+                    <a:xfrm>
+                      <a:off x="0" y="0"/>
+                      <a:ext cx="5125085" cy="762000"/>
+                    </a:xfrm>
+                    <a:prstGeom prst="rect">
+                      <a:avLst/>
+                    </a:prstGeom>
+                  </pic:spPr>
+                </pic:pic>
+              </a:graphicData>
+            </a:graphic>
+          </wp:anchor>
+        </w:drawing>
+      </w:r>
     </w:p>
     <w:p>
       <w:pPr>
@@ -1632,6 +2094,104 @@
       </w:pPr>
       <w:r>
         <w:rPr>
+          <w:noProof/>
+          <w:lang w:val="ru-RU"/>
+        </w:rPr>
+        <w:drawing>
+          <wp:anchor distT="0" distB="0" distL="114300" distR="114300" simplePos="0" relativeHeight="251688448" behindDoc="0" locked="0" layoutInCell="1" allowOverlap="1" wp14:anchorId="41BBFAE6" wp14:editId="0DCB608F">
+            <wp:simplePos x="0" y="0"/>
+            <wp:positionH relativeFrom="page">
+              <wp:posOffset>2644140</wp:posOffset>
+            </wp:positionH>
+            <wp:positionV relativeFrom="page">
+              <wp:posOffset>8580120</wp:posOffset>
+            </wp:positionV>
+            <wp:extent cx="2476846" cy="400106"/>
+            <wp:effectExtent l="0" t="0" r="0" b="0"/>
+            <wp:wrapTopAndBottom/>
+            <wp:docPr id="1409233565" name="Рисунок 1"/>
+            <wp:cNvGraphicFramePr>
+              <a:graphicFrameLocks xmlns:a="http://schemas.openxmlformats.org/drawingml/2006/main" noChangeAspect="1"/>
+            </wp:cNvGraphicFramePr>
+            <a:graphic xmlns:a="http://schemas.openxmlformats.org/drawingml/2006/main">
+              <a:graphicData uri="http://schemas.openxmlformats.org/drawingml/2006/picture">
+                <pic:pic xmlns:pic="http://schemas.openxmlformats.org/drawingml/2006/picture">
+                  <pic:nvPicPr>
+                    <pic:cNvPr id="1409233565" name=""/>
+                    <pic:cNvPicPr/>
+                  </pic:nvPicPr>
+                  <pic:blipFill>
+                    <a:blip r:embed="rId20"/>
+                    <a:stretch>
+                      <a:fillRect/>
+                    </a:stretch>
+                  </pic:blipFill>
+                  <pic:spPr>
+                    <a:xfrm>
+                      <a:off x="0" y="0"/>
+                      <a:ext cx="2476846" cy="400106"/>
+                    </a:xfrm>
+                    <a:prstGeom prst="rect">
+                      <a:avLst/>
+                    </a:prstGeom>
+                  </pic:spPr>
+                </pic:pic>
+              </a:graphicData>
+            </a:graphic>
+          </wp:anchor>
+        </w:drawing>
+      </w:r>
+      <w:r>
+        <w:rPr>
+          <w:noProof/>
+          <w:lang w:val="ru-RU"/>
+        </w:rPr>
+        <w:drawing>
+          <wp:anchor distT="0" distB="0" distL="114300" distR="114300" simplePos="0" relativeHeight="251683328" behindDoc="0" locked="0" layoutInCell="1" allowOverlap="1" wp14:anchorId="6C6CB29D" wp14:editId="640518C1">
+            <wp:simplePos x="0" y="0"/>
+            <wp:positionH relativeFrom="page">
+              <wp:posOffset>2278380</wp:posOffset>
+            </wp:positionH>
+            <wp:positionV relativeFrom="page">
+              <wp:posOffset>7955280</wp:posOffset>
+            </wp:positionV>
+            <wp:extent cx="3086531" cy="523948"/>
+            <wp:effectExtent l="0" t="0" r="0" b="9525"/>
+            <wp:wrapTopAndBottom/>
+            <wp:docPr id="742114087" name="Рисунок 1"/>
+            <wp:cNvGraphicFramePr>
+              <a:graphicFrameLocks xmlns:a="http://schemas.openxmlformats.org/drawingml/2006/main" noChangeAspect="1"/>
+            </wp:cNvGraphicFramePr>
+            <a:graphic xmlns:a="http://schemas.openxmlformats.org/drawingml/2006/main">
+              <a:graphicData uri="http://schemas.openxmlformats.org/drawingml/2006/picture">
+                <pic:pic xmlns:pic="http://schemas.openxmlformats.org/drawingml/2006/picture">
+                  <pic:nvPicPr>
+                    <pic:cNvPr id="742114087" name=""/>
+                    <pic:cNvPicPr/>
+                  </pic:nvPicPr>
+                  <pic:blipFill>
+                    <a:blip r:embed="rId21"/>
+                    <a:stretch>
+                      <a:fillRect/>
+                    </a:stretch>
+                  </pic:blipFill>
+                  <pic:spPr>
+                    <a:xfrm>
+                      <a:off x="0" y="0"/>
+                      <a:ext cx="3086531" cy="523948"/>
+                    </a:xfrm>
+                    <a:prstGeom prst="rect">
+                      <a:avLst/>
+                    </a:prstGeom>
+                  </pic:spPr>
+                </pic:pic>
+              </a:graphicData>
+            </a:graphic>
+          </wp:anchor>
+        </w:drawing>
+      </w:r>
+      <w:r>
+        <w:rPr>
           <w:b/>
           <w:lang w:val="ru-RU"/>
         </w:rPr>
@@ -1684,6 +2244,19 @@
         </w:rPr>
         <w:t>.</w:t>
       </w:r>
+    </w:p>
+    <w:p>
+      <w:pPr>
+        <w:pStyle w:val="a0"/>
+        <w:numPr>
+          <w:ilvl w:val="0"/>
+          <w:numId w:val="0"/>
+        </w:numPr>
+        <w:spacing w:after="60"/>
+        <w:rPr>
+          <w:lang w:val="ru-RU"/>
+        </w:rPr>
+      </w:pPr>
     </w:p>
     <w:p>
       <w:pPr>
@@ -1695,6 +2268,154 @@
       </w:pPr>
       <w:r>
         <w:rPr>
+          <w:noProof/>
+          <w:lang w:val="ru-RU"/>
+        </w:rPr>
+        <w:lastRenderedPageBreak/>
+        <w:drawing>
+          <wp:anchor distT="0" distB="0" distL="114300" distR="114300" simplePos="0" relativeHeight="251703808" behindDoc="0" locked="0" layoutInCell="1" allowOverlap="1" wp14:anchorId="5A100C6D" wp14:editId="638E1CC8">
+            <wp:simplePos x="0" y="0"/>
+            <wp:positionH relativeFrom="page">
+              <wp:posOffset>716280</wp:posOffset>
+            </wp:positionH>
+            <wp:positionV relativeFrom="page">
+              <wp:posOffset>2832100</wp:posOffset>
+            </wp:positionV>
+            <wp:extent cx="6309360" cy="764540"/>
+            <wp:effectExtent l="0" t="0" r="0" b="0"/>
+            <wp:wrapTopAndBottom/>
+            <wp:docPr id="1157322401" name="Рисунок 1"/>
+            <wp:cNvGraphicFramePr>
+              <a:graphicFrameLocks xmlns:a="http://schemas.openxmlformats.org/drawingml/2006/main" noChangeAspect="1"/>
+            </wp:cNvGraphicFramePr>
+            <a:graphic xmlns:a="http://schemas.openxmlformats.org/drawingml/2006/main">
+              <a:graphicData uri="http://schemas.openxmlformats.org/drawingml/2006/picture">
+                <pic:pic xmlns:pic="http://schemas.openxmlformats.org/drawingml/2006/picture">
+                  <pic:nvPicPr>
+                    <pic:cNvPr id="1157322401" name=""/>
+                    <pic:cNvPicPr/>
+                  </pic:nvPicPr>
+                  <pic:blipFill>
+                    <a:blip r:embed="rId22"/>
+                    <a:stretch>
+                      <a:fillRect/>
+                    </a:stretch>
+                  </pic:blipFill>
+                  <pic:spPr>
+                    <a:xfrm>
+                      <a:off x="0" y="0"/>
+                      <a:ext cx="6309360" cy="764540"/>
+                    </a:xfrm>
+                    <a:prstGeom prst="rect">
+                      <a:avLst/>
+                    </a:prstGeom>
+                  </pic:spPr>
+                </pic:pic>
+              </a:graphicData>
+            </a:graphic>
+          </wp:anchor>
+        </w:drawing>
+      </w:r>
+      <w:r>
+        <w:rPr>
+          <w:noProof/>
+          <w:lang w:val="ru-RU"/>
+        </w:rPr>
+        <w:drawing>
+          <wp:anchor distT="0" distB="0" distL="114300" distR="114300" simplePos="0" relativeHeight="251709952" behindDoc="0" locked="0" layoutInCell="1" allowOverlap="1" wp14:anchorId="3B5E5BD9" wp14:editId="64EA347A">
+            <wp:simplePos x="0" y="0"/>
+            <wp:positionH relativeFrom="page">
+              <wp:posOffset>1318260</wp:posOffset>
+            </wp:positionH>
+            <wp:positionV relativeFrom="page">
+              <wp:posOffset>1978660</wp:posOffset>
+            </wp:positionV>
+            <wp:extent cx="5125165" cy="685896"/>
+            <wp:effectExtent l="0" t="0" r="0" b="0"/>
+            <wp:wrapTopAndBottom/>
+            <wp:docPr id="939936183" name="Рисунок 1"/>
+            <wp:cNvGraphicFramePr>
+              <a:graphicFrameLocks xmlns:a="http://schemas.openxmlformats.org/drawingml/2006/main" noChangeAspect="1"/>
+            </wp:cNvGraphicFramePr>
+            <a:graphic xmlns:a="http://schemas.openxmlformats.org/drawingml/2006/main">
+              <a:graphicData uri="http://schemas.openxmlformats.org/drawingml/2006/picture">
+                <pic:pic xmlns:pic="http://schemas.openxmlformats.org/drawingml/2006/picture">
+                  <pic:nvPicPr>
+                    <pic:cNvPr id="939936183" name=""/>
+                    <pic:cNvPicPr/>
+                  </pic:nvPicPr>
+                  <pic:blipFill>
+                    <a:blip r:embed="rId23"/>
+                    <a:stretch>
+                      <a:fillRect/>
+                    </a:stretch>
+                  </pic:blipFill>
+                  <pic:spPr>
+                    <a:xfrm>
+                      <a:off x="0" y="0"/>
+                      <a:ext cx="5125165" cy="685896"/>
+                    </a:xfrm>
+                    <a:prstGeom prst="rect">
+                      <a:avLst/>
+                    </a:prstGeom>
+                  </pic:spPr>
+                </pic:pic>
+              </a:graphicData>
+            </a:graphic>
+          </wp:anchor>
+        </w:drawing>
+      </w:r>
+      <w:r>
+        <w:rPr>
+          <w:noProof/>
+          <w:lang w:val="ru-RU"/>
+        </w:rPr>
+        <w:drawing>
+          <wp:anchor distT="0" distB="0" distL="114300" distR="114300" simplePos="0" relativeHeight="251697664" behindDoc="0" locked="0" layoutInCell="1" allowOverlap="1" wp14:anchorId="7D82194C" wp14:editId="1739FC9A">
+            <wp:simplePos x="0" y="0"/>
+            <wp:positionH relativeFrom="page">
+              <wp:posOffset>1508760</wp:posOffset>
+            </wp:positionH>
+            <wp:positionV relativeFrom="page">
+              <wp:posOffset>791210</wp:posOffset>
+            </wp:positionV>
+            <wp:extent cx="4858428" cy="905001"/>
+            <wp:effectExtent l="0" t="0" r="0" b="9525"/>
+            <wp:wrapTopAndBottom/>
+            <wp:docPr id="187226428" name="Рисунок 1"/>
+            <wp:cNvGraphicFramePr>
+              <a:graphicFrameLocks xmlns:a="http://schemas.openxmlformats.org/drawingml/2006/main" noChangeAspect="1"/>
+            </wp:cNvGraphicFramePr>
+            <a:graphic xmlns:a="http://schemas.openxmlformats.org/drawingml/2006/main">
+              <a:graphicData uri="http://schemas.openxmlformats.org/drawingml/2006/picture">
+                <pic:pic xmlns:pic="http://schemas.openxmlformats.org/drawingml/2006/picture">
+                  <pic:nvPicPr>
+                    <pic:cNvPr id="187226428" name=""/>
+                    <pic:cNvPicPr/>
+                  </pic:nvPicPr>
+                  <pic:blipFill>
+                    <a:blip r:embed="rId24"/>
+                    <a:stretch>
+                      <a:fillRect/>
+                    </a:stretch>
+                  </pic:blipFill>
+                  <pic:spPr>
+                    <a:xfrm>
+                      <a:off x="0" y="0"/>
+                      <a:ext cx="4858428" cy="905001"/>
+                    </a:xfrm>
+                    <a:prstGeom prst="rect">
+                      <a:avLst/>
+                    </a:prstGeom>
+                  </pic:spPr>
+                </pic:pic>
+              </a:graphicData>
+            </a:graphic>
+          </wp:anchor>
+        </w:drawing>
+      </w:r>
+      <w:r>
+        <w:rPr>
           <w:b/>
           <w:lang w:val="ru-RU"/>
         </w:rPr>
@@ -1777,6 +2498,14 @@
         </w:rPr>
         <w:t>)</w:t>
       </w:r>
+    </w:p>
+    <w:p>
+      <w:pPr>
+        <w:pStyle w:val="a0"/>
+        <w:rPr>
+          <w:lang w:val="ru-RU"/>
+        </w:rPr>
+      </w:pPr>
     </w:p>
     <w:p>
       <w:pPr>
@@ -1889,17 +2618,415 @@
     </w:p>
     <w:p>
       <w:pPr>
+        <w:pStyle w:val="a0"/>
+        <w:numPr>
+          <w:ilvl w:val="0"/>
+          <w:numId w:val="0"/>
+        </w:numPr>
+        <w:spacing w:after="60"/>
+        <w:rPr>
+          <w:lang w:val="ru-RU"/>
+        </w:rPr>
+      </w:pPr>
+      <w:r>
+        <w:rPr>
+          <w:b/>
+          <w:noProof/>
+          <w:color w:val="2E1065"/>
+          <w:sz w:val="28"/>
+        </w:rPr>
+        <w:drawing>
+          <wp:anchor distT="0" distB="0" distL="114300" distR="114300" simplePos="0" relativeHeight="251715072" behindDoc="0" locked="0" layoutInCell="1" allowOverlap="1" wp14:anchorId="790B69ED" wp14:editId="428EADD5">
+            <wp:simplePos x="0" y="0"/>
+            <wp:positionH relativeFrom="page">
+              <wp:posOffset>1889760</wp:posOffset>
+            </wp:positionH>
+            <wp:positionV relativeFrom="page">
+              <wp:posOffset>5139055</wp:posOffset>
+            </wp:positionV>
+            <wp:extent cx="3982006" cy="1362265"/>
+            <wp:effectExtent l="0" t="0" r="0" b="9525"/>
+            <wp:wrapTopAndBottom/>
+            <wp:docPr id="1990794035" name="Рисунок 1"/>
+            <wp:cNvGraphicFramePr>
+              <a:graphicFrameLocks xmlns:a="http://schemas.openxmlformats.org/drawingml/2006/main" noChangeAspect="1"/>
+            </wp:cNvGraphicFramePr>
+            <a:graphic xmlns:a="http://schemas.openxmlformats.org/drawingml/2006/main">
+              <a:graphicData uri="http://schemas.openxmlformats.org/drawingml/2006/picture">
+                <pic:pic xmlns:pic="http://schemas.openxmlformats.org/drawingml/2006/picture">
+                  <pic:nvPicPr>
+                    <pic:cNvPr id="1990794035" name=""/>
+                    <pic:cNvPicPr/>
+                  </pic:nvPicPr>
+                  <pic:blipFill>
+                    <a:blip r:embed="rId25"/>
+                    <a:stretch>
+                      <a:fillRect/>
+                    </a:stretch>
+                  </pic:blipFill>
+                  <pic:spPr>
+                    <a:xfrm>
+                      <a:off x="0" y="0"/>
+                      <a:ext cx="3982006" cy="1362265"/>
+                    </a:xfrm>
+                    <a:prstGeom prst="rect">
+                      <a:avLst/>
+                    </a:prstGeom>
+                  </pic:spPr>
+                </pic:pic>
+              </a:graphicData>
+            </a:graphic>
+          </wp:anchor>
+        </w:drawing>
+      </w:r>
+      <w:r>
+        <w:rPr>
+          <w:noProof/>
+          <w:lang w:val="ru-RU"/>
+        </w:rPr>
+        <w:drawing>
+          <wp:anchor distT="0" distB="0" distL="114300" distR="114300" simplePos="0" relativeHeight="251713024" behindDoc="0" locked="0" layoutInCell="1" allowOverlap="1" wp14:anchorId="31880A2F" wp14:editId="4F2573C8">
+            <wp:simplePos x="0" y="0"/>
+            <wp:positionH relativeFrom="page">
+              <wp:posOffset>1604010</wp:posOffset>
+            </wp:positionH>
+            <wp:positionV relativeFrom="page">
+              <wp:posOffset>4521835</wp:posOffset>
+            </wp:positionV>
+            <wp:extent cx="4763135" cy="561975"/>
+            <wp:effectExtent l="0" t="0" r="0" b="9525"/>
+            <wp:wrapTopAndBottom/>
+            <wp:docPr id="754746478" name="Рисунок 1"/>
+            <wp:cNvGraphicFramePr>
+              <a:graphicFrameLocks xmlns:a="http://schemas.openxmlformats.org/drawingml/2006/main" noChangeAspect="1"/>
+            </wp:cNvGraphicFramePr>
+            <a:graphic xmlns:a="http://schemas.openxmlformats.org/drawingml/2006/main">
+              <a:graphicData uri="http://schemas.openxmlformats.org/drawingml/2006/picture">
+                <pic:pic xmlns:pic="http://schemas.openxmlformats.org/drawingml/2006/picture">
+                  <pic:nvPicPr>
+                    <pic:cNvPr id="754746478" name=""/>
+                    <pic:cNvPicPr/>
+                  </pic:nvPicPr>
+                  <pic:blipFill>
+                    <a:blip r:embed="rId26"/>
+                    <a:stretch>
+                      <a:fillRect/>
+                    </a:stretch>
+                  </pic:blipFill>
+                  <pic:spPr>
+                    <a:xfrm>
+                      <a:off x="0" y="0"/>
+                      <a:ext cx="4763135" cy="561975"/>
+                    </a:xfrm>
+                    <a:prstGeom prst="rect">
+                      <a:avLst/>
+                    </a:prstGeom>
+                  </pic:spPr>
+                </pic:pic>
+              </a:graphicData>
+            </a:graphic>
+          </wp:anchor>
+        </w:drawing>
+      </w:r>
+    </w:p>
+    <w:p>
+      <w:pPr>
         <w:keepNext/>
         <w:spacing w:before="280" w:after="120"/>
+        <w:rPr>
+          <w:lang w:val="ru-RU"/>
+        </w:rPr>
       </w:pPr>
       <w:r>
         <w:rPr>
           <w:b/>
           <w:color w:val="2E1065"/>
           <w:sz w:val="28"/>
-        </w:rPr>
-        <w:t>БЛОК 2. Облачный сервис GitHub</w:t>
-      </w:r>
+          <w:lang w:val="ru-RU"/>
+        </w:rPr>
+        <w:t xml:space="preserve">БЛОК 2. Облачный сервис </w:t>
+      </w:r>
+      <w:r>
+        <w:rPr>
+          <w:b/>
+          <w:color w:val="2E1065"/>
+          <w:sz w:val="28"/>
+        </w:rPr>
+        <w:t>GitHub</w:t>
+      </w:r>
+    </w:p>
+    <w:p>
+      <w:pPr>
+        <w:keepNext/>
+        <w:spacing w:before="200" w:after="80"/>
+        <w:rPr>
+          <w:lang w:val="ru-RU"/>
+        </w:rPr>
+      </w:pPr>
+      <w:r>
+        <w:rPr>
+          <w:b/>
+          <w:color w:val="4C1D95"/>
+          <w:sz w:val="25"/>
+        </w:rPr>
+        <w:t>🟢</w:t>
+      </w:r>
+      <w:r>
+        <w:rPr>
+          <w:b/>
+          <w:color w:val="4C1D95"/>
+          <w:sz w:val="25"/>
+          <w:lang w:val="ru-RU"/>
+        </w:rPr>
+        <w:t xml:space="preserve"> Уровень 1 </w:t>
+      </w:r>
+      <w:r>
+        <w:rPr>
+          <w:b/>
+          <w:color w:val="4C1D95"/>
+          <w:sz w:val="25"/>
+          <w:lang w:val="ru-RU"/>
+        </w:rPr>
+        <w:t xml:space="preserve">[1 </w:t>
+      </w:r>
+      <w:r>
+        <w:rPr>
+          <w:b/>
+          <w:color w:val="4C1D95"/>
+          <w:sz w:val="25"/>
+          <w:lang w:val="ru-RU"/>
+        </w:rPr>
+        <w:t>балл</w:t>
+      </w:r>
+      <w:r>
+        <w:rPr>
+          <w:b/>
+          <w:color w:val="4C1D95"/>
+          <w:sz w:val="25"/>
+          <w:lang w:val="ru-RU"/>
+        </w:rPr>
+        <w:t>]</w:t>
+      </w:r>
+      <w:r>
+        <w:rPr>
+          <w:b/>
+          <w:color w:val="4C1D95"/>
+          <w:sz w:val="25"/>
+          <w:lang w:val="ru-RU"/>
+        </w:rPr>
+        <w:t xml:space="preserve"> (1)</w:t>
+      </w:r>
+    </w:p>
+    <w:p>
+      <w:pPr>
+        <w:pStyle w:val="a0"/>
+        <w:spacing w:after="60"/>
+        <w:rPr>
+          <w:lang w:val="ru-RU"/>
+        </w:rPr>
+      </w:pPr>
+      <w:r>
+        <w:rPr>
+          <w:b/>
+          <w:lang w:val="ru-RU"/>
+        </w:rPr>
+        <w:t xml:space="preserve">Зарегистрироваться </w:t>
+      </w:r>
+      <w:r>
+        <w:rPr>
+          <w:lang w:val="ru-RU"/>
+        </w:rPr>
+        <w:t xml:space="preserve">на </w:t>
+      </w:r>
+      <w:r>
+        <w:t>GitHub</w:t>
+      </w:r>
+      <w:r>
+        <w:rPr>
+          <w:lang w:val="ru-RU"/>
+        </w:rPr>
+        <w:t xml:space="preserve"> и создать публичный репозиторий </w:t>
+      </w:r>
+      <w:proofErr w:type="spellStart"/>
+      <w:r>
+        <w:t>wt</w:t>
+      </w:r>
+      <w:proofErr w:type="spellEnd"/>
+      <w:r>
+        <w:rPr>
+          <w:lang w:val="ru-RU"/>
+        </w:rPr>
+        <w:t>-</w:t>
+      </w:r>
+      <w:r>
+        <w:t>lab</w:t>
+      </w:r>
+      <w:r>
+        <w:rPr>
+          <w:lang w:val="ru-RU"/>
+        </w:rPr>
+        <w:t>1-1</w:t>
+      </w:r>
+      <w:r>
+        <w:t>git</w:t>
+      </w:r>
+      <w:r>
+        <w:rPr>
+          <w:lang w:val="ru-RU"/>
+        </w:rPr>
+        <w:t>-</w:t>
+      </w:r>
+      <w:proofErr w:type="spellStart"/>
+      <w:r>
+        <w:t>ivanov</w:t>
+      </w:r>
+      <w:proofErr w:type="spellEnd"/>
+      <w:r>
+        <w:rPr>
+          <w:lang w:val="ru-RU"/>
+        </w:rPr>
+        <w:t>.</w:t>
+      </w:r>
+    </w:p>
+    <w:p>
+      <w:pPr>
+        <w:pStyle w:val="a0"/>
+        <w:spacing w:after="60"/>
+      </w:pPr>
+      <w:r>
+        <w:rPr>
+          <w:b/>
+          <w:lang w:val="ru-RU"/>
+        </w:rPr>
+        <w:t xml:space="preserve">Связать </w:t>
+      </w:r>
+      <w:r>
+        <w:rPr>
+          <w:lang w:val="ru-RU"/>
+        </w:rPr>
+        <w:t xml:space="preserve">локальный репозиторий с удаленным. </w:t>
+      </w:r>
+      <w:r>
+        <w:t>(</w:t>
+      </w:r>
+      <w:r>
+        <w:rPr>
+          <w:rFonts w:ascii="Consolas" w:hAnsi="Consolas"/>
+          <w:color w:val="6B21A8"/>
+          <w:sz w:val="20"/>
+        </w:rPr>
+        <w:t>git remote add origin https://github.com/your-account/wt-lab1-1git-ivanov.git</w:t>
+      </w:r>
+      <w:r>
+        <w:t>)</w:t>
+      </w:r>
+    </w:p>
+    <w:p>
+      <w:pPr>
+        <w:pStyle w:val="a0"/>
+        <w:spacing w:after="60"/>
+      </w:pPr>
+      <w:r>
+        <w:drawing>
+          <wp:anchor distT="0" distB="0" distL="114300" distR="114300" simplePos="0" relativeHeight="251633152" behindDoc="0" locked="0" layoutInCell="1" allowOverlap="1" wp14:anchorId="74478DB5" wp14:editId="6565F5C3">
+            <wp:simplePos x="0" y="0"/>
+            <wp:positionH relativeFrom="page">
+              <wp:posOffset>731520</wp:posOffset>
+            </wp:positionH>
+            <wp:positionV relativeFrom="page">
+              <wp:posOffset>8243570</wp:posOffset>
+            </wp:positionV>
+            <wp:extent cx="6309360" cy="514985"/>
+            <wp:effectExtent l="0" t="0" r="0" b="0"/>
+            <wp:wrapTopAndBottom/>
+            <wp:docPr id="390661182" name="Рисунок 1"/>
+            <wp:cNvGraphicFramePr>
+              <a:graphicFrameLocks xmlns:a="http://schemas.openxmlformats.org/drawingml/2006/main" noChangeAspect="1"/>
+            </wp:cNvGraphicFramePr>
+            <a:graphic xmlns:a="http://schemas.openxmlformats.org/drawingml/2006/main">
+              <a:graphicData uri="http://schemas.openxmlformats.org/drawingml/2006/picture">
+                <pic:pic xmlns:pic="http://schemas.openxmlformats.org/drawingml/2006/picture">
+                  <pic:nvPicPr>
+                    <pic:cNvPr id="390661182" name=""/>
+                    <pic:cNvPicPr/>
+                  </pic:nvPicPr>
+                  <pic:blipFill>
+                    <a:blip r:embed="rId27"/>
+                    <a:stretch>
+                      <a:fillRect/>
+                    </a:stretch>
+                  </pic:blipFill>
+                  <pic:spPr>
+                    <a:xfrm>
+                      <a:off x="0" y="0"/>
+                      <a:ext cx="6309360" cy="514985"/>
+                    </a:xfrm>
+                    <a:prstGeom prst="rect">
+                      <a:avLst/>
+                    </a:prstGeom>
+                  </pic:spPr>
+                </pic:pic>
+              </a:graphicData>
+            </a:graphic>
+          </wp:anchor>
+        </w:drawing>
+      </w:r>
+      <w:r>
+        <w:rPr>
+          <w:b/>
+          <w:lang w:val="ru-RU"/>
+        </w:rPr>
+        <w:t xml:space="preserve">Отправить </w:t>
+      </w:r>
+      <w:r>
+        <w:rPr>
+          <w:lang w:val="ru-RU"/>
+        </w:rPr>
+        <w:t xml:space="preserve">ветку </w:t>
+      </w:r>
+      <w:r>
+        <w:t>main</w:t>
+      </w:r>
+      <w:r>
+        <w:rPr>
+          <w:lang w:val="ru-RU"/>
+        </w:rPr>
+        <w:t xml:space="preserve"> на </w:t>
+      </w:r>
+      <w:r>
+        <w:t>GitHub</w:t>
+      </w:r>
+      <w:r>
+        <w:rPr>
+          <w:lang w:val="ru-RU"/>
+        </w:rPr>
+        <w:t xml:space="preserve">. </w:t>
+      </w:r>
+      <w:r>
+        <w:t>(</w:t>
+      </w:r>
+      <w:r>
+        <w:rPr>
+          <w:rFonts w:ascii="Consolas" w:hAnsi="Consolas"/>
+          <w:color w:val="6B21A8"/>
+          <w:sz w:val="20"/>
+        </w:rPr>
+        <w:t>git push -u origin main</w:t>
+      </w:r>
+      <w:r>
+        <w:t>)</w:t>
+      </w:r>
+    </w:p>
+    <w:p>
+      <w:pPr>
+        <w:pStyle w:val="a0"/>
+        <w:numPr>
+          <w:ilvl w:val="0"/>
+          <w:numId w:val="0"/>
+        </w:numPr>
+        <w:spacing w:after="60"/>
+        <w:ind w:left="360"/>
+      </w:pPr>
     </w:p>
     <w:p>
       <w:pPr>
@@ -1907,12 +3034,58 @@
         <w:spacing w:before="200" w:after="80"/>
       </w:pPr>
       <w:r>
+        <w:lastRenderedPageBreak/>
+        <w:drawing>
+          <wp:anchor distT="0" distB="0" distL="114300" distR="114300" simplePos="0" relativeHeight="251637248" behindDoc="0" locked="0" layoutInCell="1" allowOverlap="1" wp14:anchorId="1D95ED5C" wp14:editId="5CCF474F">
+            <wp:simplePos x="0" y="0"/>
+            <wp:positionH relativeFrom="page">
+              <wp:posOffset>731520</wp:posOffset>
+            </wp:positionH>
+            <wp:positionV relativeFrom="page">
+              <wp:posOffset>544195</wp:posOffset>
+            </wp:positionV>
+            <wp:extent cx="6309360" cy="2530475"/>
+            <wp:effectExtent l="0" t="0" r="0" b="3175"/>
+            <wp:wrapTopAndBottom/>
+            <wp:docPr id="1482189080" name="Рисунок 1"/>
+            <wp:cNvGraphicFramePr>
+              <a:graphicFrameLocks xmlns:a="http://schemas.openxmlformats.org/drawingml/2006/main" noChangeAspect="1"/>
+            </wp:cNvGraphicFramePr>
+            <a:graphic xmlns:a="http://schemas.openxmlformats.org/drawingml/2006/main">
+              <a:graphicData uri="http://schemas.openxmlformats.org/drawingml/2006/picture">
+                <pic:pic xmlns:pic="http://schemas.openxmlformats.org/drawingml/2006/picture">
+                  <pic:nvPicPr>
+                    <pic:cNvPr id="1482189080" name=""/>
+                    <pic:cNvPicPr/>
+                  </pic:nvPicPr>
+                  <pic:blipFill>
+                    <a:blip r:embed="rId28"/>
+                    <a:stretch>
+                      <a:fillRect/>
+                    </a:stretch>
+                  </pic:blipFill>
+                  <pic:spPr>
+                    <a:xfrm>
+                      <a:off x="0" y="0"/>
+                      <a:ext cx="6309360" cy="2530475"/>
+                    </a:xfrm>
+                    <a:prstGeom prst="rect">
+                      <a:avLst/>
+                    </a:prstGeom>
+                  </pic:spPr>
+                </pic:pic>
+              </a:graphicData>
+            </a:graphic>
+          </wp:anchor>
+        </w:drawing>
+      </w:r>
+      <w:r>
         <w:rPr>
           <w:b/>
           <w:color w:val="4C1D95"/>
           <w:sz w:val="25"/>
         </w:rPr>
-        <w:t xml:space="preserve">🟢 </w:t>
+        <w:t xml:space="preserve">🟡 </w:t>
       </w:r>
       <w:proofErr w:type="spellStart"/>
       <w:r>
@@ -1930,7 +3103,7 @@
           <w:color w:val="4C1D95"/>
           <w:sz w:val="25"/>
         </w:rPr>
-        <w:t xml:space="preserve"> 1 </w:t>
+        <w:t xml:space="preserve"> 2 </w:t>
       </w:r>
       <w:r>
         <w:rPr>
@@ -1938,7 +3111,7 @@
           <w:color w:val="4C1D95"/>
           <w:sz w:val="25"/>
         </w:rPr>
-        <w:t xml:space="preserve">[1 </w:t>
+        <w:t xml:space="preserve"> [</w:t>
       </w:r>
       <w:r>
         <w:rPr>
@@ -1947,7 +3120,7 @@
           <w:sz w:val="25"/>
           <w:lang w:val="ru-RU"/>
         </w:rPr>
-        <w:t>балл</w:t>
+        <w:t>2</w:t>
       </w:r>
       <w:r>
         <w:rPr>
@@ -1955,7 +3128,7 @@
           <w:color w:val="4C1D95"/>
           <w:sz w:val="25"/>
         </w:rPr>
-        <w:t>]</w:t>
+        <w:t xml:space="preserve"> </w:t>
       </w:r>
       <w:r>
         <w:rPr>
@@ -1964,78 +3137,24 @@
           <w:sz w:val="25"/>
           <w:lang w:val="ru-RU"/>
         </w:rPr>
-        <w:t xml:space="preserve"> (1)</w:t>
-      </w:r>
-    </w:p>
-    <w:p>
-      <w:pPr>
-        <w:pStyle w:val="a0"/>
-        <w:spacing w:after="60"/>
-        <w:rPr>
-          <w:lang w:val="ru-RU"/>
-        </w:rPr>
-      </w:pPr>
-      <w:r>
-        <w:rPr>
-          <w:b/>
-          <w:lang w:val="ru-RU"/>
-        </w:rPr>
-        <w:t xml:space="preserve">Зарегистрироваться </w:t>
-      </w:r>
-      <w:r>
-        <w:rPr>
-          <w:lang w:val="ru-RU"/>
-        </w:rPr>
-        <w:t xml:space="preserve">на </w:t>
-      </w:r>
-      <w:r>
-        <w:t>GitHub</w:t>
-      </w:r>
-      <w:r>
-        <w:rPr>
-          <w:lang w:val="ru-RU"/>
-        </w:rPr>
-        <w:t xml:space="preserve"> и создать публичный репозиторий </w:t>
-      </w:r>
-      <w:proofErr w:type="spellStart"/>
-      <w:r>
-        <w:t>wt</w:t>
-      </w:r>
-      <w:proofErr w:type="spellEnd"/>
-      <w:r>
-        <w:rPr>
-          <w:lang w:val="ru-RU"/>
-        </w:rPr>
-        <w:t>-</w:t>
-      </w:r>
-      <w:r>
-        <w:t>lab</w:t>
-      </w:r>
-      <w:r>
-        <w:rPr>
-          <w:lang w:val="ru-RU"/>
-        </w:rPr>
-        <w:t>1-1</w:t>
-      </w:r>
-      <w:r>
-        <w:t>git</w:t>
-      </w:r>
-      <w:r>
-        <w:rPr>
-          <w:lang w:val="ru-RU"/>
-        </w:rPr>
-        <w:t>-</w:t>
-      </w:r>
-      <w:proofErr w:type="spellStart"/>
-      <w:r>
-        <w:t>ivanov</w:t>
-      </w:r>
-      <w:proofErr w:type="spellEnd"/>
-      <w:r>
-        <w:rPr>
-          <w:lang w:val="ru-RU"/>
-        </w:rPr>
-        <w:t>.</w:t>
+        <w:t>балла</w:t>
+      </w:r>
+      <w:r>
+        <w:rPr>
+          <w:b/>
+          <w:color w:val="4C1D95"/>
+          <w:sz w:val="25"/>
+        </w:rPr>
+        <w:t>]</w:t>
+      </w:r>
+      <w:r>
+        <w:rPr>
+          <w:b/>
+          <w:color w:val="4C1D95"/>
+          <w:sz w:val="25"/>
+          <w:lang w:val="ru-RU"/>
+        </w:rPr>
+        <w:t xml:space="preserve"> (3)</w:t>
       </w:r>
     </w:p>
     <w:p>
@@ -2044,19 +3163,215 @@
         <w:spacing w:after="60"/>
       </w:pPr>
       <w:r>
-        <w:rPr>
-          <w:b/>
-          <w:lang w:val="ru-RU"/>
-        </w:rPr>
-        <w:t xml:space="preserve">Связать </w:t>
-      </w:r>
-      <w:r>
-        <w:rPr>
-          <w:lang w:val="ru-RU"/>
-        </w:rPr>
-        <w:t xml:space="preserve">локальный репозиторий с удаленным. </w:t>
-      </w:r>
-      <w:r>
+        <w:drawing>
+          <wp:anchor distT="0" distB="0" distL="114300" distR="114300" simplePos="0" relativeHeight="251642368" behindDoc="0" locked="0" layoutInCell="1" allowOverlap="1" wp14:anchorId="4E0533EC" wp14:editId="09E0A780">
+            <wp:simplePos x="0" y="0"/>
+            <wp:positionH relativeFrom="page">
+              <wp:posOffset>2034540</wp:posOffset>
+            </wp:positionH>
+            <wp:positionV relativeFrom="page">
+              <wp:posOffset>3740785</wp:posOffset>
+            </wp:positionV>
+            <wp:extent cx="3686689" cy="1800476"/>
+            <wp:effectExtent l="0" t="0" r="9525" b="9525"/>
+            <wp:wrapTopAndBottom/>
+            <wp:docPr id="9326699" name="Рисунок 1"/>
+            <wp:cNvGraphicFramePr>
+              <a:graphicFrameLocks xmlns:a="http://schemas.openxmlformats.org/drawingml/2006/main" noChangeAspect="1"/>
+            </wp:cNvGraphicFramePr>
+            <a:graphic xmlns:a="http://schemas.openxmlformats.org/drawingml/2006/main">
+              <a:graphicData uri="http://schemas.openxmlformats.org/drawingml/2006/picture">
+                <pic:pic xmlns:pic="http://schemas.openxmlformats.org/drawingml/2006/picture">
+                  <pic:nvPicPr>
+                    <pic:cNvPr id="9326699" name=""/>
+                    <pic:cNvPicPr/>
+                  </pic:nvPicPr>
+                  <pic:blipFill>
+                    <a:blip r:embed="rId29"/>
+                    <a:stretch>
+                      <a:fillRect/>
+                    </a:stretch>
+                  </pic:blipFill>
+                  <pic:spPr>
+                    <a:xfrm>
+                      <a:off x="0" y="0"/>
+                      <a:ext cx="3686689" cy="1800476"/>
+                    </a:xfrm>
+                    <a:prstGeom prst="rect">
+                      <a:avLst/>
+                    </a:prstGeom>
+                  </pic:spPr>
+                </pic:pic>
+              </a:graphicData>
+            </a:graphic>
+          </wp:anchor>
+        </w:drawing>
+      </w:r>
+      <w:proofErr w:type="spellStart"/>
+      <w:r>
+        <w:rPr>
+          <w:b/>
+        </w:rPr>
+        <w:t>Создать</w:t>
+      </w:r>
+      <w:proofErr w:type="spellEnd"/>
+      <w:r>
+        <w:rPr>
+          <w:b/>
+        </w:rPr>
+        <w:t xml:space="preserve"> </w:t>
+      </w:r>
+      <w:proofErr w:type="spellStart"/>
+      <w:r>
+        <w:t>ветку</w:t>
+      </w:r>
+      <w:proofErr w:type="spellEnd"/>
+      <w:r>
+        <w:t xml:space="preserve"> feature/footer </w:t>
+      </w:r>
+      <w:proofErr w:type="spellStart"/>
+      <w:r>
+        <w:t>через</w:t>
+      </w:r>
+      <w:proofErr w:type="spellEnd"/>
+      <w:r>
+        <w:t xml:space="preserve"> веб-интерфейс GitHub и </w:t>
+      </w:r>
+      <w:proofErr w:type="spellStart"/>
+      <w:r>
+        <w:t>отредактировать</w:t>
+      </w:r>
+      <w:proofErr w:type="spellEnd"/>
+      <w:r>
+        <w:t xml:space="preserve"> index.html.</w:t>
+      </w:r>
+    </w:p>
+    <w:p>
+      <w:pPr>
+        <w:pStyle w:val="a0"/>
+        <w:numPr>
+          <w:ilvl w:val="0"/>
+          <w:numId w:val="0"/>
+        </w:numPr>
+        <w:spacing w:after="60"/>
+        <w:ind w:left="360"/>
+      </w:pPr>
+      <w:r>
+        <w:drawing>
+          <wp:anchor distT="0" distB="0" distL="114300" distR="114300" simplePos="0" relativeHeight="251645440" behindDoc="0" locked="0" layoutInCell="1" allowOverlap="1" wp14:anchorId="4EF9E854" wp14:editId="64CB2286">
+            <wp:simplePos x="0" y="0"/>
+            <wp:positionH relativeFrom="page">
+              <wp:posOffset>1897380</wp:posOffset>
+            </wp:positionH>
+            <wp:positionV relativeFrom="page">
+              <wp:posOffset>5771515</wp:posOffset>
+            </wp:positionV>
+            <wp:extent cx="4057650" cy="600075"/>
+            <wp:effectExtent l="0" t="0" r="0" b="9525"/>
+            <wp:wrapTopAndBottom/>
+            <wp:docPr id="505211743" name="Рисунок 1"/>
+            <wp:cNvGraphicFramePr>
+              <a:graphicFrameLocks xmlns:a="http://schemas.openxmlformats.org/drawingml/2006/main" noChangeAspect="1"/>
+            </wp:cNvGraphicFramePr>
+            <a:graphic xmlns:a="http://schemas.openxmlformats.org/drawingml/2006/main">
+              <a:graphicData uri="http://schemas.openxmlformats.org/drawingml/2006/picture">
+                <pic:pic xmlns:pic="http://schemas.openxmlformats.org/drawingml/2006/picture">
+                  <pic:nvPicPr>
+                    <pic:cNvPr id="505211743" name=""/>
+                    <pic:cNvPicPr/>
+                  </pic:nvPicPr>
+                  <pic:blipFill>
+                    <a:blip r:embed="rId30"/>
+                    <a:stretch>
+                      <a:fillRect/>
+                    </a:stretch>
+                  </pic:blipFill>
+                  <pic:spPr>
+                    <a:xfrm>
+                      <a:off x="0" y="0"/>
+                      <a:ext cx="4057650" cy="600075"/>
+                    </a:xfrm>
+                    <a:prstGeom prst="rect">
+                      <a:avLst/>
+                    </a:prstGeom>
+                  </pic:spPr>
+                </pic:pic>
+              </a:graphicData>
+            </a:graphic>
+          </wp:anchor>
+        </w:drawing>
+      </w:r>
+    </w:p>
+    <w:p>
+      <w:pPr>
+        <w:pStyle w:val="a0"/>
+        <w:spacing w:after="60"/>
+        <w:rPr>
+          <w:lang w:val="ru-RU"/>
+        </w:rPr>
+      </w:pPr>
+      <w:r>
+        <w:drawing>
+          <wp:anchor distT="0" distB="0" distL="114300" distR="114300" simplePos="0" relativeHeight="251650560" behindDoc="0" locked="0" layoutInCell="1" allowOverlap="1" wp14:anchorId="1179501B" wp14:editId="1F0AAE55">
+            <wp:simplePos x="0" y="0"/>
+            <wp:positionH relativeFrom="page">
+              <wp:posOffset>1844040</wp:posOffset>
+            </wp:positionH>
+            <wp:positionV relativeFrom="page">
+              <wp:posOffset>6969760</wp:posOffset>
+            </wp:positionV>
+            <wp:extent cx="4182059" cy="800212"/>
+            <wp:effectExtent l="0" t="0" r="0" b="0"/>
+            <wp:wrapTopAndBottom/>
+            <wp:docPr id="986904065" name="Рисунок 1"/>
+            <wp:cNvGraphicFramePr>
+              <a:graphicFrameLocks xmlns:a="http://schemas.openxmlformats.org/drawingml/2006/main" noChangeAspect="1"/>
+            </wp:cNvGraphicFramePr>
+            <a:graphic xmlns:a="http://schemas.openxmlformats.org/drawingml/2006/main">
+              <a:graphicData uri="http://schemas.openxmlformats.org/drawingml/2006/picture">
+                <pic:pic xmlns:pic="http://schemas.openxmlformats.org/drawingml/2006/picture">
+                  <pic:nvPicPr>
+                    <pic:cNvPr id="986904065" name=""/>
+                    <pic:cNvPicPr/>
+                  </pic:nvPicPr>
+                  <pic:blipFill>
+                    <a:blip r:embed="rId31"/>
+                    <a:stretch>
+                      <a:fillRect/>
+                    </a:stretch>
+                  </pic:blipFill>
+                  <pic:spPr>
+                    <a:xfrm>
+                      <a:off x="0" y="0"/>
+                      <a:ext cx="4182059" cy="800212"/>
+                    </a:xfrm>
+                    <a:prstGeom prst="rect">
+                      <a:avLst/>
+                    </a:prstGeom>
+                  </pic:spPr>
+                </pic:pic>
+              </a:graphicData>
+            </a:graphic>
+          </wp:anchor>
+        </w:drawing>
+      </w:r>
+      <w:r>
+        <w:rPr>
+          <w:b/>
+          <w:lang w:val="ru-RU"/>
+        </w:rPr>
+        <w:t xml:space="preserve">Извлечь </w:t>
+      </w:r>
+      <w:r>
+        <w:rPr>
+          <w:lang w:val="ru-RU"/>
+        </w:rPr>
+        <w:t xml:space="preserve">изменения локально и выполнить слияние с локальной веткой. </w:t>
+      </w:r>
+      <w:r>
+        <w:rPr>
+          <w:lang w:val="ru-RU"/>
+        </w:rPr>
         <w:t>(</w:t>
       </w:r>
       <w:r>
@@ -2065,10 +3380,143 @@
           <w:color w:val="6B21A8"/>
           <w:sz w:val="20"/>
         </w:rPr>
-        <w:t>git remote add origin https://github.com/your-account/wt-lab1-1git-ivanov.git</w:t>
-      </w:r>
-      <w:r>
+        <w:t>git</w:t>
+      </w:r>
+      <w:r>
+        <w:rPr>
+          <w:rFonts w:ascii="Consolas" w:hAnsi="Consolas"/>
+          <w:color w:val="6B21A8"/>
+          <w:sz w:val="20"/>
+          <w:lang w:val="ru-RU"/>
+        </w:rPr>
+        <w:t xml:space="preserve"> </w:t>
+      </w:r>
+      <w:r>
+        <w:rPr>
+          <w:rFonts w:ascii="Consolas" w:hAnsi="Consolas"/>
+          <w:color w:val="6B21A8"/>
+          <w:sz w:val="20"/>
+        </w:rPr>
+        <w:t>fetch</w:t>
+      </w:r>
+      <w:r>
+        <w:rPr>
+          <w:rFonts w:ascii="Consolas" w:hAnsi="Consolas"/>
+          <w:color w:val="6B21A8"/>
+          <w:sz w:val="20"/>
+          <w:lang w:val="ru-RU"/>
+        </w:rPr>
+        <w:t xml:space="preserve"> </w:t>
+      </w:r>
+      <w:r>
+        <w:rPr>
+          <w:rFonts w:ascii="Consolas" w:hAnsi="Consolas"/>
+          <w:color w:val="6B21A8"/>
+          <w:sz w:val="20"/>
+        </w:rPr>
+        <w:t>origin</w:t>
+      </w:r>
+      <w:r>
+        <w:rPr>
+          <w:rFonts w:ascii="Consolas" w:hAnsi="Consolas"/>
+          <w:color w:val="6B21A8"/>
+          <w:sz w:val="20"/>
+          <w:lang w:val="ru-RU"/>
+        </w:rPr>
+        <w:t xml:space="preserve"> &amp;&amp; </w:t>
+      </w:r>
+      <w:r>
+        <w:rPr>
+          <w:rFonts w:ascii="Consolas" w:hAnsi="Consolas"/>
+          <w:color w:val="6B21A8"/>
+          <w:sz w:val="20"/>
+        </w:rPr>
+        <w:t>git</w:t>
+      </w:r>
+      <w:r>
+        <w:rPr>
+          <w:rFonts w:ascii="Consolas" w:hAnsi="Consolas"/>
+          <w:color w:val="6B21A8"/>
+          <w:sz w:val="20"/>
+          <w:lang w:val="ru-RU"/>
+        </w:rPr>
+        <w:t xml:space="preserve"> </w:t>
+      </w:r>
+      <w:r>
+        <w:rPr>
+          <w:rFonts w:ascii="Consolas" w:hAnsi="Consolas"/>
+          <w:color w:val="6B21A8"/>
+          <w:sz w:val="20"/>
+        </w:rPr>
+        <w:t>pull</w:t>
+      </w:r>
+      <w:r>
+        <w:rPr>
+          <w:rFonts w:ascii="Consolas" w:hAnsi="Consolas"/>
+          <w:color w:val="6B21A8"/>
+          <w:sz w:val="20"/>
+          <w:lang w:val="ru-RU"/>
+        </w:rPr>
+        <w:t xml:space="preserve"> </w:t>
+      </w:r>
+      <w:r>
+        <w:rPr>
+          <w:rFonts w:ascii="Consolas" w:hAnsi="Consolas"/>
+          <w:color w:val="6B21A8"/>
+          <w:sz w:val="20"/>
+        </w:rPr>
+        <w:t>origin</w:t>
+      </w:r>
+      <w:r>
+        <w:rPr>
+          <w:rFonts w:ascii="Consolas" w:hAnsi="Consolas"/>
+          <w:color w:val="6B21A8"/>
+          <w:sz w:val="20"/>
+          <w:lang w:val="ru-RU"/>
+        </w:rPr>
+        <w:t xml:space="preserve"> </w:t>
+      </w:r>
+      <w:r>
+        <w:rPr>
+          <w:rFonts w:ascii="Consolas" w:hAnsi="Consolas"/>
+          <w:color w:val="6B21A8"/>
+          <w:sz w:val="20"/>
+        </w:rPr>
+        <w:t>main</w:t>
+      </w:r>
+      <w:r>
+        <w:rPr>
+          <w:lang w:val="ru-RU"/>
+        </w:rPr>
         <w:t>)</w:t>
+      </w:r>
+    </w:p>
+    <w:p>
+      <w:pPr>
+        <w:pStyle w:val="a0"/>
+        <w:numPr>
+          <w:ilvl w:val="0"/>
+          <w:numId w:val="0"/>
+        </w:numPr>
+        <w:spacing w:after="60"/>
+        <w:rPr>
+          <w:lang w:val="ru-RU"/>
+        </w:rPr>
+      </w:pPr>
+    </w:p>
+    <w:p>
+      <w:pPr>
+        <w:rPr>
+          <w:b/>
+          <w:lang w:val="ru-RU"/>
+        </w:rPr>
+      </w:pPr>
+      <w:r>
+        <w:rPr>
+          <w:b/>
+          <w:lang w:val="ru-RU"/>
+        </w:rPr>
+        <w:br w:type="page"/>
       </w:r>
     </w:p>
     <w:p>
@@ -2077,17 +3525,63 @@
         <w:spacing w:after="60"/>
       </w:pPr>
       <w:r>
-        <w:rPr>
-          <w:b/>
-          <w:lang w:val="ru-RU"/>
-        </w:rPr>
-        <w:t xml:space="preserve">Отправить </w:t>
-      </w:r>
-      <w:r>
-        <w:rPr>
-          <w:lang w:val="ru-RU"/>
-        </w:rPr>
-        <w:t xml:space="preserve">ветку </w:t>
+        <w:lastRenderedPageBreak/>
+        <w:drawing>
+          <wp:anchor distT="0" distB="0" distL="114300" distR="114300" simplePos="0" relativeHeight="251656704" behindDoc="0" locked="0" layoutInCell="1" allowOverlap="1" wp14:anchorId="3DDE5A08" wp14:editId="4146CAC2">
+            <wp:simplePos x="0" y="0"/>
+            <wp:positionH relativeFrom="page">
+              <wp:posOffset>914400</wp:posOffset>
+            </wp:positionH>
+            <wp:positionV relativeFrom="page">
+              <wp:posOffset>4032885</wp:posOffset>
+            </wp:positionV>
+            <wp:extent cx="5944430" cy="1781424"/>
+            <wp:effectExtent l="0" t="0" r="0" b="9525"/>
+            <wp:wrapTopAndBottom/>
+            <wp:docPr id="1386188223" name="Рисунок 1"/>
+            <wp:cNvGraphicFramePr>
+              <a:graphicFrameLocks xmlns:a="http://schemas.openxmlformats.org/drawingml/2006/main" noChangeAspect="1"/>
+            </wp:cNvGraphicFramePr>
+            <a:graphic xmlns:a="http://schemas.openxmlformats.org/drawingml/2006/main">
+              <a:graphicData uri="http://schemas.openxmlformats.org/drawingml/2006/picture">
+                <pic:pic xmlns:pic="http://schemas.openxmlformats.org/drawingml/2006/picture">
+                  <pic:nvPicPr>
+                    <pic:cNvPr id="1386188223" name=""/>
+                    <pic:cNvPicPr/>
+                  </pic:nvPicPr>
+                  <pic:blipFill>
+                    <a:blip r:embed="rId32"/>
+                    <a:stretch>
+                      <a:fillRect/>
+                    </a:stretch>
+                  </pic:blipFill>
+                  <pic:spPr>
+                    <a:xfrm>
+                      <a:off x="0" y="0"/>
+                      <a:ext cx="5944430" cy="1781424"/>
+                    </a:xfrm>
+                    <a:prstGeom prst="rect">
+                      <a:avLst/>
+                    </a:prstGeom>
+                  </pic:spPr>
+                </pic:pic>
+              </a:graphicData>
+            </a:graphic>
+          </wp:anchor>
+        </w:drawing>
+      </w:r>
+      <w:r>
+        <w:rPr>
+          <w:b/>
+          <w:lang w:val="ru-RU"/>
+        </w:rPr>
+        <w:t xml:space="preserve">Включить </w:t>
+      </w:r>
+      <w:r>
+        <w:rPr>
+          <w:lang w:val="ru-RU"/>
+        </w:rPr>
+        <w:t xml:space="preserve">правила защиты ветки </w:t>
       </w:r>
       <w:r>
         <w:t>main</w:t>
@@ -2096,7 +3590,7 @@
         <w:rPr>
           <w:lang w:val="ru-RU"/>
         </w:rPr>
-        <w:t xml:space="preserve"> на </w:t>
+        <w:t xml:space="preserve"> в настройках </w:t>
       </w:r>
       <w:r>
         <w:t>GitHub</w:t>
@@ -2116,11 +3610,22 @@
           <w:color w:val="6B21A8"/>
           <w:sz w:val="20"/>
         </w:rPr>
-        <w:t>git push -u origin main</w:t>
+        <w:t>Require a pull request before merging</w:t>
       </w:r>
       <w:r>
         <w:t>)</w:t>
       </w:r>
+    </w:p>
+    <w:p>
+      <w:pPr>
+        <w:pStyle w:val="a0"/>
+        <w:numPr>
+          <w:ilvl w:val="0"/>
+          <w:numId w:val="0"/>
+        </w:numPr>
+        <w:spacing w:after="60"/>
+        <w:ind w:left="360"/>
+      </w:pPr>
     </w:p>
     <w:p>
       <w:pPr>
@@ -2133,7 +3638,7 @@
           <w:color w:val="4C1D95"/>
           <w:sz w:val="25"/>
         </w:rPr>
-        <w:t xml:space="preserve">🟡 </w:t>
+        <w:t xml:space="preserve">🔴 </w:t>
       </w:r>
       <w:proofErr w:type="spellStart"/>
       <w:r>
@@ -2151,95 +3656,279 @@
           <w:color w:val="4C1D95"/>
           <w:sz w:val="25"/>
         </w:rPr>
-        <w:t xml:space="preserve"> 2 </w:t>
-      </w:r>
-      <w:r>
-        <w:rPr>
-          <w:b/>
-          <w:color w:val="4C1D95"/>
-          <w:sz w:val="25"/>
-        </w:rPr>
-        <w:t xml:space="preserve"> [</w:t>
-      </w:r>
-      <w:r>
-        <w:rPr>
-          <w:b/>
-          <w:color w:val="4C1D95"/>
-          <w:sz w:val="25"/>
-          <w:lang w:val="ru-RU"/>
-        </w:rPr>
-        <w:t>2</w:t>
-      </w:r>
-      <w:r>
-        <w:rPr>
-          <w:b/>
-          <w:color w:val="4C1D95"/>
-          <w:sz w:val="25"/>
-        </w:rPr>
-        <w:t xml:space="preserve"> </w:t>
-      </w:r>
-      <w:r>
-        <w:rPr>
-          <w:b/>
-          <w:color w:val="4C1D95"/>
-          <w:sz w:val="25"/>
-          <w:lang w:val="ru-RU"/>
-        </w:rPr>
-        <w:t>балла</w:t>
-      </w:r>
-      <w:r>
-        <w:rPr>
-          <w:b/>
-          <w:color w:val="4C1D95"/>
-          <w:sz w:val="25"/>
-        </w:rPr>
-        <w:t>]</w:t>
-      </w:r>
-      <w:r>
-        <w:rPr>
-          <w:b/>
-          <w:color w:val="4C1D95"/>
-          <w:sz w:val="25"/>
-          <w:lang w:val="ru-RU"/>
-        </w:rPr>
-        <w:t xml:space="preserve"> (3)</w:t>
+        <w:t xml:space="preserve"> 3 </w:t>
       </w:r>
     </w:p>
     <w:p>
       <w:pPr>
         <w:pStyle w:val="a0"/>
         <w:spacing w:after="60"/>
+        <w:rPr>
+          <w:lang w:val="ru-RU"/>
+        </w:rPr>
       </w:pPr>
       <w:r>
         <w:rPr>
           <w:b/>
-        </w:rPr>
-        <w:t xml:space="preserve">Создать </w:t>
-      </w:r>
-      <w:r>
-        <w:t>ветку feature/footer через веб-интерфейс GitHub и отредактировать index.html.</w:t>
+          <w:lang w:val="ru-RU"/>
+        </w:rPr>
+        <w:t xml:space="preserve">Сделать </w:t>
+      </w:r>
+      <w:proofErr w:type="spellStart"/>
+      <w:r>
+        <w:rPr>
+          <w:lang w:val="ru-RU"/>
+        </w:rPr>
+        <w:t>форк</w:t>
+      </w:r>
+      <w:proofErr w:type="spellEnd"/>
+      <w:r>
+        <w:rPr>
+          <w:lang w:val="ru-RU"/>
+        </w:rPr>
+        <w:t xml:space="preserve"> (</w:t>
+      </w:r>
+      <w:r>
+        <w:t>Fork</w:t>
+      </w:r>
+      <w:r>
+        <w:rPr>
+          <w:lang w:val="ru-RU"/>
+        </w:rPr>
+        <w:t xml:space="preserve">) репозитория напарника </w:t>
+      </w:r>
+      <w:proofErr w:type="spellStart"/>
+      <w:r>
+        <w:t>wt</w:t>
+      </w:r>
+      <w:proofErr w:type="spellEnd"/>
+      <w:r>
+        <w:rPr>
+          <w:lang w:val="ru-RU"/>
+        </w:rPr>
+        <w:t>-</w:t>
+      </w:r>
+      <w:r>
+        <w:t>lab</w:t>
+      </w:r>
+      <w:r>
+        <w:rPr>
+          <w:lang w:val="ru-RU"/>
+        </w:rPr>
+        <w:t>1-1</w:t>
+      </w:r>
+      <w:r>
+        <w:t>git</w:t>
+      </w:r>
+      <w:r>
+        <w:rPr>
+          <w:lang w:val="ru-RU"/>
+        </w:rPr>
+        <w:t>-</w:t>
+      </w:r>
+      <w:proofErr w:type="spellStart"/>
+      <w:r>
+        <w:t>petrov</w:t>
+      </w:r>
+      <w:proofErr w:type="spellEnd"/>
+      <w:r>
+        <w:rPr>
+          <w:lang w:val="ru-RU"/>
+        </w:rPr>
+        <w:t xml:space="preserve"> и </w:t>
+      </w:r>
+      <w:proofErr w:type="spellStart"/>
+      <w:r>
+        <w:rPr>
+          <w:lang w:val="ru-RU"/>
+        </w:rPr>
+        <w:t>склонировать</w:t>
+      </w:r>
+      <w:proofErr w:type="spellEnd"/>
+      <w:r>
+        <w:rPr>
+          <w:lang w:val="ru-RU"/>
+        </w:rPr>
+        <w:t xml:space="preserve"> его на свой компьютер. (</w:t>
+      </w:r>
+      <w:r>
+        <w:rPr>
+          <w:rFonts w:ascii="Consolas" w:hAnsi="Consolas"/>
+          <w:color w:val="6B21A8"/>
+          <w:sz w:val="20"/>
+        </w:rPr>
+        <w:t>git</w:t>
+      </w:r>
+      <w:r>
+        <w:rPr>
+          <w:rFonts w:ascii="Consolas" w:hAnsi="Consolas"/>
+          <w:color w:val="6B21A8"/>
+          <w:sz w:val="20"/>
+          <w:lang w:val="ru-RU"/>
+        </w:rPr>
+        <w:t xml:space="preserve"> </w:t>
+      </w:r>
+      <w:r>
+        <w:rPr>
+          <w:rFonts w:ascii="Consolas" w:hAnsi="Consolas"/>
+          <w:color w:val="6B21A8"/>
+          <w:sz w:val="20"/>
+        </w:rPr>
+        <w:t>clone</w:t>
+      </w:r>
+      <w:r>
+        <w:rPr>
+          <w:lang w:val="ru-RU"/>
+        </w:rPr>
+        <w:t>)</w:t>
       </w:r>
     </w:p>
     <w:p>
       <w:pPr>
         <w:pStyle w:val="a0"/>
         <w:spacing w:after="60"/>
+        <w:rPr>
+          <w:lang w:val="ru-RU"/>
+        </w:rPr>
       </w:pPr>
       <w:r>
         <w:rPr>
-          <w:b/>
-          <w:lang w:val="ru-RU"/>
-        </w:rPr>
-        <w:lastRenderedPageBreak/>
-        <w:t xml:space="preserve">Извлечь </w:t>
-      </w:r>
-      <w:r>
-        <w:rPr>
-          <w:lang w:val="ru-RU"/>
-        </w:rPr>
-        <w:t xml:space="preserve">изменения локально и выполнить слияние с локальной веткой. </w:t>
-      </w:r>
-      <w:r>
+          <w:lang w:val="ru-RU"/>
+        </w:rPr>
+        <w:drawing>
+          <wp:anchor distT="0" distB="0" distL="114300" distR="114300" simplePos="0" relativeHeight="251655680" behindDoc="0" locked="0" layoutInCell="1" allowOverlap="1" wp14:anchorId="28B07A80" wp14:editId="16E10C7E">
+            <wp:simplePos x="0" y="0"/>
+            <wp:positionH relativeFrom="page">
+              <wp:posOffset>1120140</wp:posOffset>
+            </wp:positionH>
+            <wp:positionV relativeFrom="page">
+              <wp:posOffset>731520</wp:posOffset>
+            </wp:positionV>
+            <wp:extent cx="5515745" cy="2772162"/>
+            <wp:effectExtent l="0" t="0" r="8890" b="9525"/>
+            <wp:wrapTopAndBottom/>
+            <wp:docPr id="1862146009" name="Рисунок 1"/>
+            <wp:cNvGraphicFramePr>
+              <a:graphicFrameLocks xmlns:a="http://schemas.openxmlformats.org/drawingml/2006/main" noChangeAspect="1"/>
+            </wp:cNvGraphicFramePr>
+            <a:graphic xmlns:a="http://schemas.openxmlformats.org/drawingml/2006/main">
+              <a:graphicData uri="http://schemas.openxmlformats.org/drawingml/2006/picture">
+                <pic:pic xmlns:pic="http://schemas.openxmlformats.org/drawingml/2006/picture">
+                  <pic:nvPicPr>
+                    <pic:cNvPr id="1862146009" name=""/>
+                    <pic:cNvPicPr/>
+                  </pic:nvPicPr>
+                  <pic:blipFill>
+                    <a:blip r:embed="rId33"/>
+                    <a:stretch>
+                      <a:fillRect/>
+                    </a:stretch>
+                  </pic:blipFill>
+                  <pic:spPr>
+                    <a:xfrm>
+                      <a:off x="0" y="0"/>
+                      <a:ext cx="5515745" cy="2772162"/>
+                    </a:xfrm>
+                    <a:prstGeom prst="rect">
+                      <a:avLst/>
+                    </a:prstGeom>
+                  </pic:spPr>
+                </pic:pic>
+              </a:graphicData>
+            </a:graphic>
+          </wp:anchor>
+        </w:drawing>
+      </w:r>
+      <w:r>
+        <w:rPr>
+          <w:b/>
+          <w:lang w:val="ru-RU"/>
+        </w:rPr>
+        <w:t xml:space="preserve">Создать </w:t>
+      </w:r>
+      <w:r>
+        <w:rPr>
+          <w:lang w:val="ru-RU"/>
+        </w:rPr>
+        <w:t xml:space="preserve">ветку </w:t>
+      </w:r>
+      <w:r>
+        <w:t>feature</w:t>
+      </w:r>
+      <w:r>
+        <w:rPr>
+          <w:lang w:val="ru-RU"/>
+        </w:rPr>
+        <w:t>/</w:t>
+      </w:r>
+      <w:r>
+        <w:t>contact</w:t>
+      </w:r>
+      <w:r>
+        <w:rPr>
+          <w:lang w:val="ru-RU"/>
+        </w:rPr>
+        <w:t>-</w:t>
+      </w:r>
+      <w:r>
+        <w:t>page</w:t>
+      </w:r>
+      <w:r>
+        <w:rPr>
+          <w:lang w:val="ru-RU"/>
+        </w:rPr>
+        <w:t xml:space="preserve">, добавить файл </w:t>
+      </w:r>
+      <w:r>
+        <w:t>contacts</w:t>
+      </w:r>
+      <w:r>
+        <w:rPr>
+          <w:lang w:val="ru-RU"/>
+        </w:rPr>
+        <w:t>.</w:t>
+      </w:r>
+      <w:r>
+        <w:t>html</w:t>
+      </w:r>
+      <w:r>
+        <w:rPr>
+          <w:lang w:val="ru-RU"/>
+        </w:rPr>
+        <w:t xml:space="preserve">, </w:t>
+      </w:r>
+      <w:proofErr w:type="spellStart"/>
+      <w:r>
+        <w:rPr>
+          <w:lang w:val="ru-RU"/>
+        </w:rPr>
+        <w:t>закоммитить</w:t>
+      </w:r>
+      <w:proofErr w:type="spellEnd"/>
+      <w:r>
+        <w:rPr>
+          <w:lang w:val="ru-RU"/>
+        </w:rPr>
+        <w:t xml:space="preserve"> и отправить ветку в свой </w:t>
+      </w:r>
+      <w:proofErr w:type="spellStart"/>
+      <w:r>
+        <w:rPr>
+          <w:lang w:val="ru-RU"/>
+        </w:rPr>
+        <w:t>форк</w:t>
+      </w:r>
+      <w:proofErr w:type="spellEnd"/>
+      <w:r>
+        <w:rPr>
+          <w:lang w:val="ru-RU"/>
+        </w:rPr>
+        <w:t xml:space="preserve">. </w:t>
+      </w:r>
+      <w:r>
+        <w:rPr>
+          <w:lang w:val="ru-RU"/>
+        </w:rPr>
         <w:t>(</w:t>
       </w:r>
       <w:r>
@@ -2248,168 +3937,16 @@
           <w:color w:val="6B21A8"/>
           <w:sz w:val="20"/>
         </w:rPr>
-        <w:t>git fetch origin &amp;&amp; git pull origin main</w:t>
-      </w:r>
-      <w:r>
-        <w:t>)</w:t>
-      </w:r>
-    </w:p>
-    <w:p>
-      <w:pPr>
-        <w:pStyle w:val="a0"/>
-        <w:spacing w:after="60"/>
-      </w:pPr>
-      <w:r>
-        <w:rPr>
-          <w:b/>
-          <w:lang w:val="ru-RU"/>
-        </w:rPr>
-        <w:t xml:space="preserve">Включить </w:t>
-      </w:r>
-      <w:r>
-        <w:rPr>
-          <w:lang w:val="ru-RU"/>
-        </w:rPr>
-        <w:t xml:space="preserve">правила защиты ветки </w:t>
-      </w:r>
-      <w:r>
-        <w:t>main</w:t>
-      </w:r>
-      <w:r>
-        <w:rPr>
-          <w:lang w:val="ru-RU"/>
-        </w:rPr>
-        <w:t xml:space="preserve"> в настройках </w:t>
-      </w:r>
-      <w:r>
-        <w:t>GitHub</w:t>
-      </w:r>
-      <w:r>
-        <w:rPr>
-          <w:lang w:val="ru-RU"/>
-        </w:rPr>
-        <w:t xml:space="preserve">. </w:t>
-      </w:r>
-      <w:r>
-        <w:t>(</w:t>
+        <w:t>git</w:t>
       </w:r>
       <w:r>
         <w:rPr>
           <w:rFonts w:ascii="Consolas" w:hAnsi="Consolas"/>
           <w:color w:val="6B21A8"/>
           <w:sz w:val="20"/>
-        </w:rPr>
-        <w:t>Require a pull request before merging</w:t>
-      </w:r>
-      <w:r>
-        <w:t>)</w:t>
-      </w:r>
-    </w:p>
-    <w:p>
-      <w:pPr>
-        <w:keepNext/>
-        <w:spacing w:before="200" w:after="80"/>
-      </w:pPr>
-      <w:r>
-        <w:rPr>
-          <w:b/>
-          <w:color w:val="4C1D95"/>
-          <w:sz w:val="25"/>
-        </w:rPr>
-        <w:t xml:space="preserve">🔴 Уровень 3 </w:t>
-      </w:r>
-    </w:p>
-    <w:p>
-      <w:pPr>
-        <w:pStyle w:val="a0"/>
-        <w:spacing w:after="60"/>
-        <w:rPr>
-          <w:lang w:val="ru-RU"/>
-        </w:rPr>
-      </w:pPr>
-      <w:r>
-        <w:rPr>
-          <w:b/>
-          <w:lang w:val="ru-RU"/>
-        </w:rPr>
-        <w:t xml:space="preserve">Сделать </w:t>
-      </w:r>
-      <w:proofErr w:type="spellStart"/>
-      <w:r>
-        <w:rPr>
-          <w:lang w:val="ru-RU"/>
-        </w:rPr>
-        <w:t>форк</w:t>
-      </w:r>
-      <w:proofErr w:type="spellEnd"/>
-      <w:r>
-        <w:rPr>
-          <w:lang w:val="ru-RU"/>
-        </w:rPr>
-        <w:t xml:space="preserve"> (</w:t>
-      </w:r>
-      <w:r>
-        <w:t>Fork</w:t>
-      </w:r>
-      <w:r>
-        <w:rPr>
-          <w:lang w:val="ru-RU"/>
-        </w:rPr>
-        <w:t xml:space="preserve">) репозитория напарника </w:t>
-      </w:r>
-      <w:proofErr w:type="spellStart"/>
-      <w:r>
-        <w:t>wt</w:t>
-      </w:r>
-      <w:proofErr w:type="spellEnd"/>
-      <w:r>
-        <w:rPr>
-          <w:lang w:val="ru-RU"/>
-        </w:rPr>
-        <w:t>-</w:t>
-      </w:r>
-      <w:r>
-        <w:t>lab</w:t>
-      </w:r>
-      <w:r>
-        <w:rPr>
-          <w:lang w:val="ru-RU"/>
-        </w:rPr>
-        <w:t>1-1</w:t>
-      </w:r>
-      <w:r>
-        <w:t>git</w:t>
-      </w:r>
-      <w:r>
-        <w:rPr>
-          <w:lang w:val="ru-RU"/>
-        </w:rPr>
-        <w:t>-</w:t>
-      </w:r>
-      <w:proofErr w:type="spellStart"/>
-      <w:r>
-        <w:t>petrov</w:t>
-      </w:r>
-      <w:proofErr w:type="spellEnd"/>
-      <w:r>
-        <w:rPr>
-          <w:lang w:val="ru-RU"/>
-        </w:rPr>
-        <w:t xml:space="preserve"> и </w:t>
-      </w:r>
-      <w:proofErr w:type="spellStart"/>
-      <w:r>
-        <w:rPr>
-          <w:lang w:val="ru-RU"/>
-        </w:rPr>
-        <w:t>склонировать</w:t>
-      </w:r>
-      <w:proofErr w:type="spellEnd"/>
-      <w:r>
-        <w:rPr>
-          <w:lang w:val="ru-RU"/>
-        </w:rPr>
-        <w:t xml:space="preserve"> его на свой компьютер. (</w:t>
+          <w:lang w:val="ru-RU"/>
+        </w:rPr>
+        <w:t xml:space="preserve"> </w:t>
       </w:r>
       <w:r>
         <w:rPr>
@@ -2417,7 +3954,7 @@
           <w:color w:val="6B21A8"/>
           <w:sz w:val="20"/>
         </w:rPr>
-        <w:t>git</w:t>
+        <w:t>push</w:t>
       </w:r>
       <w:r>
         <w:rPr>
@@ -2434,118 +3971,63 @@
           <w:color w:val="6B21A8"/>
           <w:sz w:val="20"/>
         </w:rPr>
-        <w:t>clone</w:t>
-      </w:r>
-      <w:r>
-        <w:rPr>
-          <w:lang w:val="ru-RU"/>
-        </w:rPr>
-        <w:t>)</w:t>
-      </w:r>
-    </w:p>
-    <w:p>
-      <w:pPr>
-        <w:pStyle w:val="a0"/>
-        <w:spacing w:after="60"/>
-      </w:pPr>
-      <w:r>
-        <w:rPr>
-          <w:b/>
-          <w:lang w:val="ru-RU"/>
-        </w:rPr>
-        <w:t xml:space="preserve">Создать </w:t>
-      </w:r>
-      <w:r>
-        <w:rPr>
-          <w:lang w:val="ru-RU"/>
-        </w:rPr>
-        <w:t xml:space="preserve">ветку </w:t>
-      </w:r>
-      <w:r>
-        <w:t>feature</w:t>
-      </w:r>
-      <w:r>
-        <w:rPr>
-          <w:lang w:val="ru-RU"/>
-        </w:rPr>
-        <w:t>/</w:t>
-      </w:r>
-      <w:r>
-        <w:t>contact</w:t>
-      </w:r>
-      <w:r>
-        <w:rPr>
-          <w:lang w:val="ru-RU"/>
-        </w:rPr>
-        <w:t>-</w:t>
-      </w:r>
-      <w:r>
-        <w:t>page</w:t>
-      </w:r>
-      <w:r>
-        <w:rPr>
-          <w:lang w:val="ru-RU"/>
-        </w:rPr>
-        <w:t xml:space="preserve">, добавить файл </w:t>
-      </w:r>
-      <w:r>
-        <w:t>contacts</w:t>
-      </w:r>
-      <w:r>
-        <w:rPr>
-          <w:lang w:val="ru-RU"/>
-        </w:rPr>
-        <w:t>.</w:t>
-      </w:r>
-      <w:r>
-        <w:t>html</w:t>
-      </w:r>
-      <w:r>
-        <w:rPr>
-          <w:lang w:val="ru-RU"/>
-        </w:rPr>
-        <w:t xml:space="preserve">, </w:t>
-      </w:r>
-      <w:proofErr w:type="spellStart"/>
-      <w:r>
-        <w:rPr>
-          <w:lang w:val="ru-RU"/>
-        </w:rPr>
-        <w:t>закоммитить</w:t>
-      </w:r>
-      <w:proofErr w:type="spellEnd"/>
-      <w:r>
-        <w:rPr>
-          <w:lang w:val="ru-RU"/>
-        </w:rPr>
-        <w:t xml:space="preserve"> и отправить ветку в свой </w:t>
-      </w:r>
-      <w:proofErr w:type="spellStart"/>
-      <w:r>
-        <w:rPr>
-          <w:lang w:val="ru-RU"/>
-        </w:rPr>
-        <w:t>форк</w:t>
-      </w:r>
-      <w:proofErr w:type="spellEnd"/>
-      <w:r>
-        <w:rPr>
-          <w:lang w:val="ru-RU"/>
-        </w:rPr>
-        <w:t xml:space="preserve">. </w:t>
-      </w:r>
-      <w:r>
-        <w:t>(</w:t>
+        <w:t>origin</w:t>
       </w:r>
       <w:r>
         <w:rPr>
           <w:rFonts w:ascii="Consolas" w:hAnsi="Consolas"/>
           <w:color w:val="6B21A8"/>
           <w:sz w:val="20"/>
-        </w:rPr>
-        <w:t>git push origin feature/contact-page</w:t>
-      </w:r>
-      <w:r>
+          <w:lang w:val="ru-RU"/>
+        </w:rPr>
+        <w:t xml:space="preserve"> </w:t>
+      </w:r>
+      <w:r>
+        <w:rPr>
+          <w:rFonts w:ascii="Consolas" w:hAnsi="Consolas"/>
+          <w:color w:val="6B21A8"/>
+          <w:sz w:val="20"/>
+        </w:rPr>
+        <w:t>feature</w:t>
+      </w:r>
+      <w:r>
+        <w:rPr>
+          <w:rFonts w:ascii="Consolas" w:hAnsi="Consolas"/>
+          <w:color w:val="6B21A8"/>
+          <w:sz w:val="20"/>
+          <w:lang w:val="ru-RU"/>
+        </w:rPr>
+        <w:t>/</w:t>
+      </w:r>
+      <w:r>
+        <w:rPr>
+          <w:rFonts w:ascii="Consolas" w:hAnsi="Consolas"/>
+          <w:color w:val="6B21A8"/>
+          <w:sz w:val="20"/>
+        </w:rPr>
+        <w:t>contact</w:t>
+      </w:r>
+      <w:r>
+        <w:rPr>
+          <w:rFonts w:ascii="Consolas" w:hAnsi="Consolas"/>
+          <w:color w:val="6B21A8"/>
+          <w:sz w:val="20"/>
+          <w:lang w:val="ru-RU"/>
+        </w:rPr>
+        <w:t>-</w:t>
+      </w:r>
+      <w:r>
+        <w:rPr>
+          <w:rFonts w:ascii="Consolas" w:hAnsi="Consolas"/>
+          <w:color w:val="6B21A8"/>
+          <w:sz w:val="20"/>
+        </w:rPr>
+        <w:t>page</w:t>
+      </w:r>
+      <w:r>
+        <w:rPr>
+          <w:lang w:val="ru-RU"/>
+        </w:rPr>
         <w:t>)</w:t>
       </w:r>
     </w:p>
@@ -2899,7 +4381,291 @@
       </w:r>
       <w:proofErr w:type="spellEnd"/>
       <w:r>
-        <w:t>: C# Dev Kit, Prettier, GitLens, Docker, REST Client, ESLint.</w:t>
+        <w:t xml:space="preserve">: C# Dev Kit, Prettier, GitLens, Docker, REST Client, </w:t>
+      </w:r>
+      <w:proofErr w:type="spellStart"/>
+      <w:r>
+        <w:t>ESLint</w:t>
+      </w:r>
+      <w:proofErr w:type="spellEnd"/>
+      <w:r>
+        <w:t>.</w:t>
+      </w:r>
+    </w:p>
+    <w:p>
+      <w:pPr>
+        <w:pStyle w:val="a0"/>
+        <w:numPr>
+          <w:ilvl w:val="0"/>
+          <w:numId w:val="0"/>
+        </w:numPr>
+        <w:ind w:left="360"/>
+      </w:pPr>
+      <w:r>
+        <w:lastRenderedPageBreak/>
+        <w:drawing>
+          <wp:anchor distT="0" distB="0" distL="114300" distR="114300" simplePos="0" relativeHeight="251678208" behindDoc="0" locked="0" layoutInCell="1" allowOverlap="1" wp14:anchorId="61D258A8" wp14:editId="7F80E8DC">
+            <wp:simplePos x="0" y="0"/>
+            <wp:positionH relativeFrom="page">
+              <wp:posOffset>838200</wp:posOffset>
+            </wp:positionH>
+            <wp:positionV relativeFrom="page">
+              <wp:posOffset>6568440</wp:posOffset>
+            </wp:positionV>
+            <wp:extent cx="6201640" cy="1638529"/>
+            <wp:effectExtent l="0" t="0" r="0" b="0"/>
+            <wp:wrapTopAndBottom/>
+            <wp:docPr id="1598927133" name="Рисунок 1"/>
+            <wp:cNvGraphicFramePr>
+              <a:graphicFrameLocks xmlns:a="http://schemas.openxmlformats.org/drawingml/2006/main" noChangeAspect="1"/>
+            </wp:cNvGraphicFramePr>
+            <a:graphic xmlns:a="http://schemas.openxmlformats.org/drawingml/2006/main">
+              <a:graphicData uri="http://schemas.openxmlformats.org/drawingml/2006/picture">
+                <pic:pic xmlns:pic="http://schemas.openxmlformats.org/drawingml/2006/picture">
+                  <pic:nvPicPr>
+                    <pic:cNvPr id="1598927133" name=""/>
+                    <pic:cNvPicPr/>
+                  </pic:nvPicPr>
+                  <pic:blipFill>
+                    <a:blip r:embed="rId34"/>
+                    <a:stretch>
+                      <a:fillRect/>
+                    </a:stretch>
+                  </pic:blipFill>
+                  <pic:spPr>
+                    <a:xfrm>
+                      <a:off x="0" y="0"/>
+                      <a:ext cx="6201640" cy="1638529"/>
+                    </a:xfrm>
+                    <a:prstGeom prst="rect">
+                      <a:avLst/>
+                    </a:prstGeom>
+                  </pic:spPr>
+                </pic:pic>
+              </a:graphicData>
+            </a:graphic>
+          </wp:anchor>
+        </w:drawing>
+      </w:r>
+      <w:r>
+        <w:drawing>
+          <wp:anchor distT="0" distB="0" distL="114300" distR="114300" simplePos="0" relativeHeight="251676160" behindDoc="0" locked="0" layoutInCell="1" allowOverlap="1" wp14:anchorId="7AA2FD20" wp14:editId="3532A316">
+            <wp:simplePos x="0" y="0"/>
+            <wp:positionH relativeFrom="page">
+              <wp:posOffset>731520</wp:posOffset>
+            </wp:positionH>
+            <wp:positionV relativeFrom="page">
+              <wp:posOffset>4210050</wp:posOffset>
+            </wp:positionV>
+            <wp:extent cx="6249272" cy="2286319"/>
+            <wp:effectExtent l="0" t="0" r="0" b="0"/>
+            <wp:wrapTopAndBottom/>
+            <wp:docPr id="956804189" name="Рисунок 1"/>
+            <wp:cNvGraphicFramePr>
+              <a:graphicFrameLocks xmlns:a="http://schemas.openxmlformats.org/drawingml/2006/main" noChangeAspect="1"/>
+            </wp:cNvGraphicFramePr>
+            <a:graphic xmlns:a="http://schemas.openxmlformats.org/drawingml/2006/main">
+              <a:graphicData uri="http://schemas.openxmlformats.org/drawingml/2006/picture">
+                <pic:pic xmlns:pic="http://schemas.openxmlformats.org/drawingml/2006/picture">
+                  <pic:nvPicPr>
+                    <pic:cNvPr id="956804189" name=""/>
+                    <pic:cNvPicPr/>
+                  </pic:nvPicPr>
+                  <pic:blipFill>
+                    <a:blip r:embed="rId35"/>
+                    <a:stretch>
+                      <a:fillRect/>
+                    </a:stretch>
+                  </pic:blipFill>
+                  <pic:spPr>
+                    <a:xfrm>
+                      <a:off x="0" y="0"/>
+                      <a:ext cx="6249272" cy="2286319"/>
+                    </a:xfrm>
+                    <a:prstGeom prst="rect">
+                      <a:avLst/>
+                    </a:prstGeom>
+                  </pic:spPr>
+                </pic:pic>
+              </a:graphicData>
+            </a:graphic>
+          </wp:anchor>
+        </w:drawing>
+      </w:r>
+      <w:r>
+        <w:drawing>
+          <wp:anchor distT="0" distB="0" distL="114300" distR="114300" simplePos="0" relativeHeight="251671040" behindDoc="0" locked="0" layoutInCell="1" allowOverlap="1" wp14:anchorId="36E4F052" wp14:editId="300A6217">
+            <wp:simplePos x="0" y="0"/>
+            <wp:positionH relativeFrom="page">
+              <wp:posOffset>883920</wp:posOffset>
+            </wp:positionH>
+            <wp:positionV relativeFrom="page">
+              <wp:posOffset>2514600</wp:posOffset>
+            </wp:positionV>
+            <wp:extent cx="6001588" cy="1657581"/>
+            <wp:effectExtent l="0" t="0" r="0" b="0"/>
+            <wp:wrapTopAndBottom/>
+            <wp:docPr id="92779793" name="Рисунок 1"/>
+            <wp:cNvGraphicFramePr>
+              <a:graphicFrameLocks xmlns:a="http://schemas.openxmlformats.org/drawingml/2006/main" noChangeAspect="1"/>
+            </wp:cNvGraphicFramePr>
+            <a:graphic xmlns:a="http://schemas.openxmlformats.org/drawingml/2006/main">
+              <a:graphicData uri="http://schemas.openxmlformats.org/drawingml/2006/picture">
+                <pic:pic xmlns:pic="http://schemas.openxmlformats.org/drawingml/2006/picture">
+                  <pic:nvPicPr>
+                    <pic:cNvPr id="92779793" name=""/>
+                    <pic:cNvPicPr/>
+                  </pic:nvPicPr>
+                  <pic:blipFill>
+                    <a:blip r:embed="rId36"/>
+                    <a:stretch>
+                      <a:fillRect/>
+                    </a:stretch>
+                  </pic:blipFill>
+                  <pic:spPr>
+                    <a:xfrm>
+                      <a:off x="0" y="0"/>
+                      <a:ext cx="6001588" cy="1657581"/>
+                    </a:xfrm>
+                    <a:prstGeom prst="rect">
+                      <a:avLst/>
+                    </a:prstGeom>
+                  </pic:spPr>
+                </pic:pic>
+              </a:graphicData>
+            </a:graphic>
+          </wp:anchor>
+        </w:drawing>
+      </w:r>
+      <w:r>
+        <w:drawing>
+          <wp:anchor distT="0" distB="0" distL="114300" distR="114300" simplePos="0" relativeHeight="251664896" behindDoc="0" locked="0" layoutInCell="1" allowOverlap="1" wp14:anchorId="4F2B30BB" wp14:editId="218EAD6E">
+            <wp:simplePos x="0" y="0"/>
+            <wp:positionH relativeFrom="page">
+              <wp:posOffset>731520</wp:posOffset>
+            </wp:positionH>
+            <wp:positionV relativeFrom="page">
+              <wp:posOffset>731520</wp:posOffset>
+            </wp:positionV>
+            <wp:extent cx="6201640" cy="1743318"/>
+            <wp:effectExtent l="0" t="0" r="8890" b="9525"/>
+            <wp:wrapTopAndBottom/>
+            <wp:docPr id="906115020" name="Рисунок 1"/>
+            <wp:cNvGraphicFramePr>
+              <a:graphicFrameLocks xmlns:a="http://schemas.openxmlformats.org/drawingml/2006/main" noChangeAspect="1"/>
+            </wp:cNvGraphicFramePr>
+            <a:graphic xmlns:a="http://schemas.openxmlformats.org/drawingml/2006/main">
+              <a:graphicData uri="http://schemas.openxmlformats.org/drawingml/2006/picture">
+                <pic:pic xmlns:pic="http://schemas.openxmlformats.org/drawingml/2006/picture">
+                  <pic:nvPicPr>
+                    <pic:cNvPr id="906115020" name=""/>
+                    <pic:cNvPicPr/>
+                  </pic:nvPicPr>
+                  <pic:blipFill>
+                    <a:blip r:embed="rId37"/>
+                    <a:stretch>
+                      <a:fillRect/>
+                    </a:stretch>
+                  </pic:blipFill>
+                  <pic:spPr>
+                    <a:xfrm>
+                      <a:off x="0" y="0"/>
+                      <a:ext cx="6201640" cy="1743318"/>
+                    </a:xfrm>
+                    <a:prstGeom prst="rect">
+                      <a:avLst/>
+                    </a:prstGeom>
+                  </pic:spPr>
+                </pic:pic>
+              </a:graphicData>
+            </a:graphic>
+          </wp:anchor>
+        </w:drawing>
+      </w:r>
+    </w:p>
+    <w:p>
+      <w:pPr>
+        <w:rPr>
+          <w:rFonts w:ascii="Segoe UI Emoji" w:hAnsi="Segoe UI Emoji" w:cs="Segoe UI Emoji"/>
+          <w:b/>
+          <w:color w:val="4C1D95"/>
+          <w:sz w:val="25"/>
+        </w:rPr>
+      </w:pPr>
+      <w:r>
+        <w:rPr>
+          <w:rFonts w:ascii="Segoe UI Emoji" w:hAnsi="Segoe UI Emoji" w:cs="Segoe UI Emoji"/>
+          <w:b/>
+          <w:color w:val="4C1D95"/>
+          <w:sz w:val="25"/>
+        </w:rPr>
+        <w:br w:type="page"/>
+      </w:r>
+    </w:p>
+    <w:p>
+      <w:pPr>
+        <w:keepNext/>
+        <w:spacing w:before="200" w:after="80"/>
+        <w:rPr>
+          <w:rFonts w:asciiTheme="minorHAnsi" w:hAnsiTheme="minorHAnsi" w:cs="Segoe UI Emoji"/>
+          <w:b/>
+          <w:color w:val="4C1D95"/>
+          <w:sz w:val="25"/>
+          <w:lang w:val="ru-RU"/>
+        </w:rPr>
+      </w:pPr>
+      <w:r>
+        <w:rPr>
+          <w:rFonts w:asciiTheme="minorHAnsi" w:hAnsiTheme="minorHAnsi" w:cs="Segoe UI Emoji"/>
+          <w:b/>
+          <w:color w:val="4C1D95"/>
+          <w:sz w:val="25"/>
+          <w:lang w:val="ru-RU"/>
+        </w:rPr>
+        <w:lastRenderedPageBreak/>
+        <w:drawing>
+          <wp:anchor distT="0" distB="0" distL="114300" distR="114300" simplePos="0" relativeHeight="251683328" behindDoc="0" locked="0" layoutInCell="1" allowOverlap="1" wp14:anchorId="18A0F735" wp14:editId="5C3B86D5">
+            <wp:simplePos x="0" y="0"/>
+            <wp:positionH relativeFrom="page">
+              <wp:posOffset>815340</wp:posOffset>
+            </wp:positionH>
+            <wp:positionV relativeFrom="page">
+              <wp:posOffset>2338705</wp:posOffset>
+            </wp:positionV>
+            <wp:extent cx="6220693" cy="1486107"/>
+            <wp:effectExtent l="0" t="0" r="8890" b="0"/>
+            <wp:wrapTopAndBottom/>
+            <wp:docPr id="978705071" name="Рисунок 1"/>
+            <wp:cNvGraphicFramePr>
+              <a:graphicFrameLocks xmlns:a="http://schemas.openxmlformats.org/drawingml/2006/main" noChangeAspect="1"/>
+            </wp:cNvGraphicFramePr>
+            <a:graphic xmlns:a="http://schemas.openxmlformats.org/drawingml/2006/main">
+              <a:graphicData uri="http://schemas.openxmlformats.org/drawingml/2006/picture">
+                <pic:pic xmlns:pic="http://schemas.openxmlformats.org/drawingml/2006/picture">
+                  <pic:nvPicPr>
+                    <pic:cNvPr id="978705071" name=""/>
+                    <pic:cNvPicPr/>
+                  </pic:nvPicPr>
+                  <pic:blipFill>
+                    <a:blip r:embed="rId38"/>
+                    <a:stretch>
+                      <a:fillRect/>
+                    </a:stretch>
+                  </pic:blipFill>
+                  <pic:spPr>
+                    <a:xfrm>
+                      <a:off x="0" y="0"/>
+                      <a:ext cx="6220693" cy="1486107"/>
+                    </a:xfrm>
+                    <a:prstGeom prst="rect">
+                      <a:avLst/>
+                    </a:prstGeom>
+                  </pic:spPr>
+                </pic:pic>
+              </a:graphicData>
+            </a:graphic>
+          </wp:anchor>
+        </w:drawing>
       </w:r>
     </w:p>
     <w:p>
@@ -2909,11 +4675,20 @@
       </w:pPr>
       <w:r>
         <w:rPr>
+          <w:rFonts w:ascii="Segoe UI Emoji" w:hAnsi="Segoe UI Emoji" w:cs="Segoe UI Emoji"/>
           <w:b/>
           <w:color w:val="4C1D95"/>
           <w:sz w:val="25"/>
         </w:rPr>
-        <w:t xml:space="preserve">🟡 </w:t>
+        <w:t>🟡</w:t>
+      </w:r>
+      <w:r>
+        <w:rPr>
+          <w:b/>
+          <w:color w:val="4C1D95"/>
+          <w:sz w:val="25"/>
+        </w:rPr>
+        <w:t xml:space="preserve"> </w:t>
       </w:r>
       <w:proofErr w:type="spellStart"/>
       <w:r>
@@ -2995,13 +4770,38 @@
           <w:b/>
           <w:lang w:val="ru-RU"/>
         </w:rPr>
-        <w:t xml:space="preserve">Открыть </w:t>
-      </w:r>
-      <w:r>
-        <w:rPr>
-          <w:lang w:val="ru-RU"/>
-        </w:rPr>
-        <w:t xml:space="preserve">папку проекта </w:t>
+        <w:t>Открыть</w:t>
+      </w:r>
+      <w:r>
+        <w:rPr>
+          <w:b/>
+          <w:lang w:val="ru-RU"/>
+        </w:rPr>
+        <w:t xml:space="preserve"> </w:t>
+      </w:r>
+      <w:r>
+        <w:rPr>
+          <w:lang w:val="ru-RU"/>
+        </w:rPr>
+        <w:t>папку</w:t>
+      </w:r>
+      <w:r>
+        <w:rPr>
+          <w:lang w:val="ru-RU"/>
+        </w:rPr>
+        <w:t xml:space="preserve"> </w:t>
+      </w:r>
+      <w:r>
+        <w:rPr>
+          <w:lang w:val="ru-RU"/>
+        </w:rPr>
+        <w:t>проекта</w:t>
+      </w:r>
+      <w:r>
+        <w:rPr>
+          <w:lang w:val="ru-RU"/>
+        </w:rPr>
+        <w:t xml:space="preserve"> </w:t>
       </w:r>
       <w:proofErr w:type="spellStart"/>
       <w:r>
@@ -3041,7 +4841,19 @@
         <w:rPr>
           <w:lang w:val="ru-RU"/>
         </w:rPr>
-        <w:t xml:space="preserve"> в </w:t>
+        <w:t xml:space="preserve"> </w:t>
+      </w:r>
+      <w:r>
+        <w:rPr>
+          <w:lang w:val="ru-RU"/>
+        </w:rPr>
+        <w:t>в</w:t>
+      </w:r>
+      <w:r>
+        <w:rPr>
+          <w:lang w:val="ru-RU"/>
+        </w:rPr>
+        <w:t xml:space="preserve"> </w:t>
       </w:r>
       <w:r>
         <w:t>VS</w:t>
@@ -3082,11 +4894,63 @@
         <w:spacing w:after="60"/>
       </w:pPr>
       <w:r>
-        <w:rPr>
-          <w:b/>
-          <w:lang w:val="ru-RU"/>
-        </w:rPr>
-        <w:t xml:space="preserve">Отредактировать </w:t>
+        <w:drawing>
+          <wp:anchor distT="0" distB="0" distL="114300" distR="114300" simplePos="0" relativeHeight="251681280" behindDoc="0" locked="0" layoutInCell="1" allowOverlap="1" wp14:anchorId="06E82CE1" wp14:editId="5DDBFB6A">
+            <wp:simplePos x="0" y="0"/>
+            <wp:positionH relativeFrom="page">
+              <wp:posOffset>952500</wp:posOffset>
+            </wp:positionH>
+            <wp:positionV relativeFrom="page">
+              <wp:posOffset>730885</wp:posOffset>
+            </wp:positionV>
+            <wp:extent cx="5858693" cy="1514686"/>
+            <wp:effectExtent l="0" t="0" r="8890" b="9525"/>
+            <wp:wrapTopAndBottom/>
+            <wp:docPr id="815751295" name="Рисунок 1"/>
+            <wp:cNvGraphicFramePr>
+              <a:graphicFrameLocks xmlns:a="http://schemas.openxmlformats.org/drawingml/2006/main" noChangeAspect="1"/>
+            </wp:cNvGraphicFramePr>
+            <a:graphic xmlns:a="http://schemas.openxmlformats.org/drawingml/2006/main">
+              <a:graphicData uri="http://schemas.openxmlformats.org/drawingml/2006/picture">
+                <pic:pic xmlns:pic="http://schemas.openxmlformats.org/drawingml/2006/picture">
+                  <pic:nvPicPr>
+                    <pic:cNvPr id="815751295" name=""/>
+                    <pic:cNvPicPr/>
+                  </pic:nvPicPr>
+                  <pic:blipFill>
+                    <a:blip r:embed="rId39"/>
+                    <a:stretch>
+                      <a:fillRect/>
+                    </a:stretch>
+                  </pic:blipFill>
+                  <pic:spPr>
+                    <a:xfrm>
+                      <a:off x="0" y="0"/>
+                      <a:ext cx="5858693" cy="1514686"/>
+                    </a:xfrm>
+                    <a:prstGeom prst="rect">
+                      <a:avLst/>
+                    </a:prstGeom>
+                  </pic:spPr>
+                </pic:pic>
+              </a:graphicData>
+            </a:graphic>
+          </wp:anchor>
+        </w:drawing>
+      </w:r>
+      <w:r>
+        <w:rPr>
+          <w:b/>
+          <w:lang w:val="ru-RU"/>
+        </w:rPr>
+        <w:t>Отредактировать</w:t>
+      </w:r>
+      <w:r>
+        <w:rPr>
+          <w:b/>
+          <w:lang w:val="ru-RU"/>
+        </w:rPr>
+        <w:t xml:space="preserve"> </w:t>
       </w:r>
       <w:r>
         <w:t>README</w:t>
@@ -3104,7 +4968,67 @@
         <w:rPr>
           <w:lang w:val="ru-RU"/>
         </w:rPr>
-        <w:t xml:space="preserve"> и изучить изменения в окне </w:t>
+        <w:t xml:space="preserve"> </w:t>
+      </w:r>
+      <w:r>
+        <w:rPr>
+          <w:lang w:val="ru-RU"/>
+        </w:rPr>
+        <w:t>и</w:t>
+      </w:r>
+      <w:r>
+        <w:rPr>
+          <w:lang w:val="ru-RU"/>
+        </w:rPr>
+        <w:t xml:space="preserve"> </w:t>
+      </w:r>
+      <w:r>
+        <w:rPr>
+          <w:lang w:val="ru-RU"/>
+        </w:rPr>
+        <w:t>изучить</w:t>
+      </w:r>
+      <w:r>
+        <w:rPr>
+          <w:lang w:val="ru-RU"/>
+        </w:rPr>
+        <w:t xml:space="preserve"> </w:t>
+      </w:r>
+      <w:r>
+        <w:rPr>
+          <w:lang w:val="ru-RU"/>
+        </w:rPr>
+        <w:t>изменения</w:t>
+      </w:r>
+      <w:r>
+        <w:rPr>
+          <w:lang w:val="ru-RU"/>
+        </w:rPr>
+        <w:t xml:space="preserve"> </w:t>
+      </w:r>
+      <w:r>
+        <w:rPr>
+          <w:lang w:val="ru-RU"/>
+        </w:rPr>
+        <w:t>в</w:t>
+      </w:r>
+      <w:r>
+        <w:rPr>
+          <w:lang w:val="ru-RU"/>
+        </w:rPr>
+        <w:t xml:space="preserve"> </w:t>
+      </w:r>
+      <w:r>
+        <w:rPr>
+          <w:lang w:val="ru-RU"/>
+        </w:rPr>
+        <w:t>окне</w:t>
+      </w:r>
+      <w:r>
+        <w:rPr>
+          <w:lang w:val="ru-RU"/>
+        </w:rPr>
+        <w:t xml:space="preserve"> </w:t>
       </w:r>
       <w:r>
         <w:t>Diff</w:t>
@@ -3122,7 +5046,31 @@
         <w:rPr>
           <w:lang w:val="ru-RU"/>
         </w:rPr>
-        <w:t xml:space="preserve"> на панели </w:t>
+        <w:t xml:space="preserve"> </w:t>
+      </w:r>
+      <w:r>
+        <w:rPr>
+          <w:lang w:val="ru-RU"/>
+        </w:rPr>
+        <w:t>на</w:t>
+      </w:r>
+      <w:r>
+        <w:rPr>
+          <w:lang w:val="ru-RU"/>
+        </w:rPr>
+        <w:t xml:space="preserve"> </w:t>
+      </w:r>
+      <w:r>
+        <w:rPr>
+          <w:lang w:val="ru-RU"/>
+        </w:rPr>
+        <w:t>панели</w:t>
+      </w:r>
+      <w:r>
+        <w:rPr>
+          <w:lang w:val="ru-RU"/>
+        </w:rPr>
+        <w:t xml:space="preserve"> </w:t>
       </w:r>
       <w:r>
         <w:t>Source</w:t>
@@ -3698,7 +5646,6 @@
           <w:color w:val="4C1D95"/>
           <w:sz w:val="25"/>
         </w:rPr>
-        <w:lastRenderedPageBreak/>
         <w:t xml:space="preserve">🟡 </w:t>
       </w:r>
       <w:proofErr w:type="spellStart"/>
@@ -3958,6 +5905,7 @@
           <w:b/>
           <w:lang w:val="ru-RU"/>
         </w:rPr>
+        <w:lastRenderedPageBreak/>
         <w:t xml:space="preserve">Изучить </w:t>
       </w:r>
       <w:r>
@@ -4405,7 +6353,7 @@
       </w:r>
     </w:p>
     <w:sectPr>
-      <w:footerReference w:type="default" r:id="rId12"/>
+      <w:footerReference w:type="default" r:id="rId40"/>
       <w:pgSz w:w="12240" w:h="15840"/>
       <w:pgMar w:top="1152" w:right="1152" w:bottom="1152" w:left="1152" w:header="720" w:footer="720" w:gutter="0"/>
       <w:cols w:space="720"/>

</xml_diff>

<commit_message>
chore: save changes and update gitignore
</commit_message>
<xml_diff>
--- a/ЛР-1. Настройка среды разработки.docx
+++ b/ЛР-1. Настройка среды разработки.docx
@@ -73,7 +73,7 @@
           <w:sz w:val="32"/>
           <w:lang w:val="ru-RU"/>
         </w:rPr>
-        <w:t>ЛАБОРАТОРНАЯ РАБОТА № 1</w:t>
+        <w:t xml:space="preserve">ОТЧЕТ ПО </w:t>
       </w:r>
       <w:r>
         <w:rPr>
@@ -82,29 +82,53 @@
           <w:sz w:val="32"/>
           <w:lang w:val="ru-RU"/>
         </w:rPr>
+        <w:t>ЛАБОРАТОРН</w:t>
+      </w:r>
+      <w:r>
+        <w:rPr>
+          <w:b/>
+          <w:color w:val="2E1065"/>
+          <w:sz w:val="32"/>
+          <w:lang w:val="ru-RU"/>
+        </w:rPr>
+        <w:t>ОЙ</w:t>
+      </w:r>
+      <w:r>
+        <w:rPr>
+          <w:b/>
+          <w:color w:val="2E1065"/>
+          <w:sz w:val="32"/>
+          <w:lang w:val="ru-RU"/>
+        </w:rPr>
+        <w:t xml:space="preserve"> РАБОТ</w:t>
+      </w:r>
+      <w:r>
+        <w:rPr>
+          <w:b/>
+          <w:color w:val="2E1065"/>
+          <w:sz w:val="32"/>
+          <w:lang w:val="ru-RU"/>
+        </w:rPr>
+        <w:t>Е</w:t>
+      </w:r>
+      <w:r>
+        <w:rPr>
+          <w:b/>
+          <w:color w:val="2E1065"/>
+          <w:sz w:val="32"/>
+          <w:lang w:val="ru-RU"/>
+        </w:rPr>
+        <w:t xml:space="preserve"> № 1</w:t>
+      </w:r>
+      <w:r>
+        <w:rPr>
+          <w:b/>
+          <w:color w:val="2E1065"/>
+          <w:sz w:val="32"/>
+          <w:lang w:val="ru-RU"/>
+        </w:rPr>
         <w:br/>
         <w:t>Настройка среды разработки</w:t>
-      </w:r>
-    </w:p>
-    <w:p>
-      <w:pPr>
-        <w:spacing w:after="280"/>
-        <w:jc w:val="center"/>
-        <w:rPr>
-          <w:i/>
-          <w:color w:val="6B21A8"/>
-          <w:sz w:val="22"/>
-          <w:lang w:val="ru-RU"/>
-        </w:rPr>
-      </w:pPr>
-      <w:r>
-        <w:rPr>
-          <w:i/>
-          <w:color w:val="6B21A8"/>
-          <w:sz w:val="22"/>
-          <w:lang w:val="ru-RU"/>
-        </w:rPr>
-        <w:t>Трудоемкость: 4 академических часа (занятия 2.3–2.4)</w:t>
       </w:r>
     </w:p>
     <w:p>
@@ -143,6 +167,55 @@
           <w:b/>
           <w:lang w:val="ru-RU"/>
         </w:rPr>
+        <w:drawing>
+          <wp:anchor distT="0" distB="0" distL="114300" distR="114300" simplePos="0" relativeHeight="251597824" behindDoc="0" locked="0" layoutInCell="1" allowOverlap="1" wp14:anchorId="2CFA60AD" wp14:editId="12364BC2">
+            <wp:simplePos x="0" y="0"/>
+            <wp:positionH relativeFrom="page">
+              <wp:posOffset>731520</wp:posOffset>
+            </wp:positionH>
+            <wp:positionV relativeFrom="page">
+              <wp:posOffset>3075940</wp:posOffset>
+            </wp:positionV>
+            <wp:extent cx="6309360" cy="3162935"/>
+            <wp:effectExtent l="0" t="0" r="0" b="0"/>
+            <wp:wrapTopAndBottom/>
+            <wp:docPr id="106126352" name="Рисунок 1"/>
+            <wp:cNvGraphicFramePr>
+              <a:graphicFrameLocks xmlns:a="http://schemas.openxmlformats.org/drawingml/2006/main" noChangeAspect="1"/>
+            </wp:cNvGraphicFramePr>
+            <a:graphic xmlns:a="http://schemas.openxmlformats.org/drawingml/2006/main">
+              <a:graphicData uri="http://schemas.openxmlformats.org/drawingml/2006/picture">
+                <pic:pic xmlns:pic="http://schemas.openxmlformats.org/drawingml/2006/picture">
+                  <pic:nvPicPr>
+                    <pic:cNvPr id="106126352" name=""/>
+                    <pic:cNvPicPr/>
+                  </pic:nvPicPr>
+                  <pic:blipFill>
+                    <a:blip r:embed="rId8"/>
+                    <a:stretch>
+                      <a:fillRect/>
+                    </a:stretch>
+                  </pic:blipFill>
+                  <pic:spPr>
+                    <a:xfrm>
+                      <a:off x="0" y="0"/>
+                      <a:ext cx="6309360" cy="3162935"/>
+                    </a:xfrm>
+                    <a:prstGeom prst="rect">
+                      <a:avLst/>
+                    </a:prstGeom>
+                  </pic:spPr>
+                </pic:pic>
+              </a:graphicData>
+            </a:graphic>
+          </wp:anchor>
+        </w:drawing>
+      </w:r>
+      <w:r>
+        <w:rPr>
+          <w:b/>
+          <w:lang w:val="ru-RU"/>
+        </w:rPr>
         <w:t xml:space="preserve">Разработать </w:t>
       </w:r>
       <w:r>
@@ -195,6 +268,36 @@
           <w:lang w:val="ru-RU"/>
         </w:rPr>
         <w:t>]</w:t>
+      </w:r>
+    </w:p>
+    <w:p>
+      <w:pPr>
+        <w:pStyle w:val="a0"/>
+        <w:numPr>
+          <w:ilvl w:val="0"/>
+          <w:numId w:val="0"/>
+        </w:numPr>
+        <w:spacing w:after="60"/>
+        <w:ind w:left="720"/>
+        <w:rPr>
+          <w:b/>
+          <w:lang w:val="ru-RU"/>
+        </w:rPr>
+      </w:pPr>
+    </w:p>
+    <w:p>
+      <w:pPr>
+        <w:rPr>
+          <w:b/>
+          <w:lang w:val="ru-RU"/>
+        </w:rPr>
+      </w:pPr>
+      <w:r>
+        <w:rPr>
+          <w:b/>
+          <w:lang w:val="ru-RU"/>
+        </w:rPr>
+        <w:br w:type="page"/>
       </w:r>
     </w:p>
     <w:p>
@@ -211,6 +314,55 @@
       </w:pPr>
       <w:r>
         <w:rPr>
+          <w:lang w:val="ru-RU"/>
+        </w:rPr>
+        <w:lastRenderedPageBreak/>
+        <w:drawing>
+          <wp:anchor distT="0" distB="0" distL="114300" distR="114300" simplePos="0" relativeHeight="251604992" behindDoc="0" locked="0" layoutInCell="1" allowOverlap="1" wp14:anchorId="22060160" wp14:editId="2AABB9E8">
+            <wp:simplePos x="0" y="0"/>
+            <wp:positionH relativeFrom="page">
+              <wp:posOffset>2385060</wp:posOffset>
+            </wp:positionH>
+            <wp:positionV relativeFrom="page">
+              <wp:posOffset>1078865</wp:posOffset>
+            </wp:positionV>
+            <wp:extent cx="2991267" cy="6039693"/>
+            <wp:effectExtent l="0" t="0" r="0" b="0"/>
+            <wp:wrapTopAndBottom/>
+            <wp:docPr id="1320320097" name="Рисунок 1"/>
+            <wp:cNvGraphicFramePr>
+              <a:graphicFrameLocks xmlns:a="http://schemas.openxmlformats.org/drawingml/2006/main" noChangeAspect="1"/>
+            </wp:cNvGraphicFramePr>
+            <a:graphic xmlns:a="http://schemas.openxmlformats.org/drawingml/2006/main">
+              <a:graphicData uri="http://schemas.openxmlformats.org/drawingml/2006/picture">
+                <pic:pic xmlns:pic="http://schemas.openxmlformats.org/drawingml/2006/picture">
+                  <pic:nvPicPr>
+                    <pic:cNvPr id="1320320097" name=""/>
+                    <pic:cNvPicPr/>
+                  </pic:nvPicPr>
+                  <pic:blipFill>
+                    <a:blip r:embed="rId9"/>
+                    <a:stretch>
+                      <a:fillRect/>
+                    </a:stretch>
+                  </pic:blipFill>
+                  <pic:spPr>
+                    <a:xfrm>
+                      <a:off x="0" y="0"/>
+                      <a:ext cx="2991267" cy="6039693"/>
+                    </a:xfrm>
+                    <a:prstGeom prst="rect">
+                      <a:avLst/>
+                    </a:prstGeom>
+                  </pic:spPr>
+                </pic:pic>
+              </a:graphicData>
+            </a:graphic>
+          </wp:anchor>
+        </w:drawing>
+      </w:r>
+      <w:r>
+        <w:rPr>
           <w:b/>
           <w:lang w:val="ru-RU"/>
         </w:rPr>
@@ -248,6 +400,34 @@
           <w:lang w:val="ru-RU"/>
         </w:rPr>
         <w:t>]</w:t>
+      </w:r>
+    </w:p>
+    <w:p>
+      <w:pPr>
+        <w:pStyle w:val="a0"/>
+        <w:numPr>
+          <w:ilvl w:val="0"/>
+          <w:numId w:val="0"/>
+        </w:numPr>
+        <w:spacing w:after="60"/>
+        <w:rPr>
+          <w:lang w:val="ru-RU"/>
+        </w:rPr>
+      </w:pPr>
+    </w:p>
+    <w:p>
+      <w:pPr>
+        <w:rPr>
+          <w:b/>
+          <w:lang w:val="ru-RU"/>
+        </w:rPr>
+      </w:pPr>
+      <w:r>
+        <w:rPr>
+          <w:b/>
+          <w:lang w:val="ru-RU"/>
+        </w:rPr>
+        <w:br w:type="page"/>
       </w:r>
     </w:p>
     <w:p>
@@ -264,6 +444,55 @@
       </w:pPr>
       <w:r>
         <w:rPr>
+          <w:lang w:val="ru-RU"/>
+        </w:rPr>
+        <w:lastRenderedPageBreak/>
+        <w:drawing>
+          <wp:anchor distT="0" distB="0" distL="114300" distR="114300" simplePos="0" relativeHeight="251606016" behindDoc="0" locked="0" layoutInCell="1" allowOverlap="1" wp14:anchorId="17DF6723" wp14:editId="48672D26">
+            <wp:simplePos x="0" y="0"/>
+            <wp:positionH relativeFrom="page">
+              <wp:posOffset>731520</wp:posOffset>
+            </wp:positionH>
+            <wp:positionV relativeFrom="page">
+              <wp:posOffset>1054735</wp:posOffset>
+            </wp:positionV>
+            <wp:extent cx="6309360" cy="2426335"/>
+            <wp:effectExtent l="0" t="0" r="0" b="0"/>
+            <wp:wrapTopAndBottom/>
+            <wp:docPr id="1409778200" name="Рисунок 1"/>
+            <wp:cNvGraphicFramePr>
+              <a:graphicFrameLocks xmlns:a="http://schemas.openxmlformats.org/drawingml/2006/main" noChangeAspect="1"/>
+            </wp:cNvGraphicFramePr>
+            <a:graphic xmlns:a="http://schemas.openxmlformats.org/drawingml/2006/main">
+              <a:graphicData uri="http://schemas.openxmlformats.org/drawingml/2006/picture">
+                <pic:pic xmlns:pic="http://schemas.openxmlformats.org/drawingml/2006/picture">
+                  <pic:nvPicPr>
+                    <pic:cNvPr id="1409778200" name=""/>
+                    <pic:cNvPicPr/>
+                  </pic:nvPicPr>
+                  <pic:blipFill>
+                    <a:blip r:embed="rId10"/>
+                    <a:stretch>
+                      <a:fillRect/>
+                    </a:stretch>
+                  </pic:blipFill>
+                  <pic:spPr>
+                    <a:xfrm>
+                      <a:off x="0" y="0"/>
+                      <a:ext cx="6309360" cy="2426335"/>
+                    </a:xfrm>
+                    <a:prstGeom prst="rect">
+                      <a:avLst/>
+                    </a:prstGeom>
+                  </pic:spPr>
+                </pic:pic>
+              </a:graphicData>
+            </a:graphic>
+          </wp:anchor>
+        </w:drawing>
+      </w:r>
+      <w:r>
+        <w:rPr>
           <w:b/>
           <w:lang w:val="ru-RU"/>
         </w:rPr>
@@ -314,6 +543,16 @@
         </w:rPr>
         <w:t>]</w:t>
       </w:r>
+    </w:p>
+    <w:p>
+      <w:pPr>
+        <w:pStyle w:val="a0"/>
+        <w:numPr>
+          <w:ilvl w:val="0"/>
+          <w:numId w:val="0"/>
+        </w:numPr>
+        <w:spacing w:after="60"/>
+      </w:pPr>
     </w:p>
     <w:p>
       <w:pPr>
@@ -459,7 +698,7 @@
           <w:lang w:val="ru-RU"/>
         </w:rPr>
         <w:drawing>
-          <wp:anchor distT="0" distB="0" distL="114300" distR="114300" simplePos="0" relativeHeight="251612672" behindDoc="0" locked="0" layoutInCell="1" allowOverlap="1" wp14:anchorId="09C90A42" wp14:editId="513501B2">
+          <wp:anchor distT="0" distB="0" distL="114300" distR="114300" simplePos="0" relativeHeight="251580416" behindDoc="0" locked="0" layoutInCell="1" allowOverlap="1" wp14:anchorId="09C90A42" wp14:editId="513501B2">
             <wp:simplePos x="0" y="0"/>
             <wp:positionH relativeFrom="page">
               <wp:posOffset>1866900</wp:posOffset>
@@ -482,7 +721,7 @@
                     <pic:cNvPicPr/>
                   </pic:nvPicPr>
                   <pic:blipFill>
-                    <a:blip r:embed="rId8"/>
+                    <a:blip r:embed="rId11"/>
                     <a:stretch>
                       <a:fillRect/>
                     </a:stretch>
@@ -514,7 +753,7 @@
           <w:lang w:val="ru-RU"/>
         </w:rPr>
         <w:drawing>
-          <wp:anchor distT="0" distB="0" distL="114300" distR="114300" simplePos="0" relativeHeight="251604480" behindDoc="0" locked="0" layoutInCell="1" allowOverlap="1" wp14:anchorId="2C5F23D5" wp14:editId="06C46ED4">
+          <wp:anchor distT="0" distB="0" distL="114300" distR="114300" simplePos="0" relativeHeight="251578368" behindDoc="0" locked="0" layoutInCell="1" allowOverlap="1" wp14:anchorId="2C5F23D5" wp14:editId="06C46ED4">
             <wp:simplePos x="0" y="0"/>
             <wp:positionH relativeFrom="page">
               <wp:posOffset>731520</wp:posOffset>
@@ -537,7 +776,7 @@
                     <pic:cNvPicPr/>
                   </pic:nvPicPr>
                   <pic:blipFill rotWithShape="1">
-                    <a:blip r:embed="rId9"/>
+                    <a:blip r:embed="rId12"/>
                     <a:srcRect b="59552"/>
                     <a:stretch>
                       <a:fillRect/>
@@ -644,7 +883,7 @@
           <w:lang w:val="ru-RU"/>
         </w:rPr>
         <w:drawing>
-          <wp:anchor distT="0" distB="0" distL="114300" distR="114300" simplePos="0" relativeHeight="251616768" behindDoc="0" locked="0" layoutInCell="1" allowOverlap="1" wp14:anchorId="00EC2DEF" wp14:editId="741FE2E7">
+          <wp:anchor distT="0" distB="0" distL="114300" distR="114300" simplePos="0" relativeHeight="251582464" behindDoc="0" locked="0" layoutInCell="1" allowOverlap="1" wp14:anchorId="00EC2DEF" wp14:editId="741FE2E7">
             <wp:simplePos x="0" y="0"/>
             <wp:positionH relativeFrom="page">
               <wp:posOffset>815340</wp:posOffset>
@@ -667,7 +906,7 @@
                     <pic:cNvPicPr/>
                   </pic:nvPicPr>
                   <pic:blipFill>
-                    <a:blip r:embed="rId10"/>
+                    <a:blip r:embed="rId13"/>
                     <a:stretch>
                       <a:fillRect/>
                     </a:stretch>
@@ -844,7 +1083,7 @@
         </w:rPr>
         <w:lastRenderedPageBreak/>
         <w:drawing>
-          <wp:anchor distT="0" distB="0" distL="114300" distR="114300" simplePos="0" relativeHeight="251621888" behindDoc="0" locked="0" layoutInCell="1" allowOverlap="1" wp14:anchorId="2AE5A85E" wp14:editId="0F2E6484">
+          <wp:anchor distT="0" distB="0" distL="114300" distR="114300" simplePos="0" relativeHeight="251641856" behindDoc="0" locked="0" layoutInCell="1" allowOverlap="1" wp14:anchorId="2AE5A85E" wp14:editId="0F2E6484">
             <wp:simplePos x="0" y="0"/>
             <wp:positionH relativeFrom="page">
               <wp:posOffset>731520</wp:posOffset>
@@ -867,7 +1106,7 @@
                     <pic:cNvPicPr/>
                   </pic:nvPicPr>
                   <pic:blipFill>
-                    <a:blip r:embed="rId11"/>
+                    <a:blip r:embed="rId14"/>
                     <a:stretch>
                       <a:fillRect/>
                     </a:stretch>
@@ -1055,7 +1294,7 @@
           <w:lang w:val="ru-RU"/>
         </w:rPr>
         <w:drawing>
-          <wp:anchor distT="0" distB="0" distL="114300" distR="114300" simplePos="0" relativeHeight="251623936" behindDoc="0" locked="0" layoutInCell="1" allowOverlap="1" wp14:anchorId="19A47080" wp14:editId="7DFD25BD">
+          <wp:anchor distT="0" distB="0" distL="114300" distR="114300" simplePos="0" relativeHeight="251642880" behindDoc="0" locked="0" layoutInCell="1" allowOverlap="1" wp14:anchorId="19A47080" wp14:editId="7DFD25BD">
             <wp:simplePos x="0" y="0"/>
             <wp:positionH relativeFrom="page">
               <wp:posOffset>1691640</wp:posOffset>
@@ -1078,7 +1317,7 @@
                     <pic:cNvPicPr/>
                   </pic:nvPicPr>
                   <pic:blipFill>
-                    <a:blip r:embed="rId12"/>
+                    <a:blip r:embed="rId15"/>
                     <a:stretch>
                       <a:fillRect/>
                     </a:stretch>
@@ -1219,7 +1458,7 @@
           <w:lang w:val="ru-RU"/>
         </w:rPr>
         <w:drawing>
-          <wp:anchor distT="0" distB="0" distL="114300" distR="114300" simplePos="0" relativeHeight="251624960" behindDoc="0" locked="0" layoutInCell="1" allowOverlap="1" wp14:anchorId="35DF82A1" wp14:editId="5E055EBE">
+          <wp:anchor distT="0" distB="0" distL="114300" distR="114300" simplePos="0" relativeHeight="251643904" behindDoc="0" locked="0" layoutInCell="1" allowOverlap="1" wp14:anchorId="35DF82A1" wp14:editId="5E055EBE">
             <wp:simplePos x="0" y="0"/>
             <wp:positionH relativeFrom="page">
               <wp:posOffset>1341120</wp:posOffset>
@@ -1242,7 +1481,7 @@
                     <pic:cNvPicPr/>
                   </pic:nvPicPr>
                   <pic:blipFill>
-                    <a:blip r:embed="rId13"/>
+                    <a:blip r:embed="rId16"/>
                     <a:stretch>
                       <a:fillRect/>
                     </a:stretch>
@@ -1339,7 +1578,7 @@
           <w:lang w:val="ru-RU"/>
         </w:rPr>
         <w:drawing>
-          <wp:anchor distT="0" distB="0" distL="114300" distR="114300" simplePos="0" relativeHeight="251627008" behindDoc="0" locked="0" layoutInCell="1" allowOverlap="1" wp14:anchorId="6049839D" wp14:editId="3009235B">
+          <wp:anchor distT="0" distB="0" distL="114300" distR="114300" simplePos="0" relativeHeight="251644928" behindDoc="0" locked="0" layoutInCell="1" allowOverlap="1" wp14:anchorId="6049839D" wp14:editId="3009235B">
             <wp:simplePos x="0" y="0"/>
             <wp:positionH relativeFrom="page">
               <wp:posOffset>937260</wp:posOffset>
@@ -1362,7 +1601,7 @@
                     <pic:cNvPicPr/>
                   </pic:nvPicPr>
                   <pic:blipFill>
-                    <a:blip r:embed="rId14"/>
+                    <a:blip r:embed="rId17"/>
                     <a:stretch>
                       <a:fillRect/>
                     </a:stretch>
@@ -1557,7 +1796,7 @@
         </w:rPr>
         <w:lastRenderedPageBreak/>
         <w:drawing>
-          <wp:anchor distT="0" distB="0" distL="114300" distR="114300" simplePos="0" relativeHeight="251637248" behindDoc="0" locked="0" layoutInCell="1" allowOverlap="1" wp14:anchorId="22173BE7" wp14:editId="7572A72D">
+          <wp:anchor distT="0" distB="0" distL="114300" distR="114300" simplePos="0" relativeHeight="251646976" behindDoc="0" locked="0" layoutInCell="1" allowOverlap="1" wp14:anchorId="22173BE7" wp14:editId="7572A72D">
             <wp:simplePos x="0" y="0"/>
             <wp:positionH relativeFrom="page">
               <wp:posOffset>1699260</wp:posOffset>
@@ -1580,7 +1819,7 @@
                     <pic:cNvPicPr/>
                   </pic:nvPicPr>
                   <pic:blipFill>
-                    <a:blip r:embed="rId15"/>
+                    <a:blip r:embed="rId18"/>
                     <a:stretch>
                       <a:fillRect/>
                     </a:stretch>
@@ -1606,7 +1845,7 @@
           <w:lang w:val="ru-RU"/>
         </w:rPr>
         <w:drawing>
-          <wp:anchor distT="0" distB="0" distL="114300" distR="114300" simplePos="0" relativeHeight="251647488" behindDoc="0" locked="0" layoutInCell="1" allowOverlap="1" wp14:anchorId="66A3436A" wp14:editId="48BFA175">
+          <wp:anchor distT="0" distB="0" distL="114300" distR="114300" simplePos="0" relativeHeight="251653120" behindDoc="0" locked="0" layoutInCell="1" allowOverlap="1" wp14:anchorId="66A3436A" wp14:editId="48BFA175">
             <wp:simplePos x="0" y="0"/>
             <wp:positionH relativeFrom="page">
               <wp:posOffset>2171700</wp:posOffset>
@@ -1629,7 +1868,7 @@
                     <pic:cNvPicPr/>
                   </pic:nvPicPr>
                   <pic:blipFill>
-                    <a:blip r:embed="rId16"/>
+                    <a:blip r:embed="rId19"/>
                     <a:stretch>
                       <a:fillRect/>
                     </a:stretch>
@@ -1816,7 +2055,7 @@
           <w:lang w:val="ru-RU"/>
         </w:rPr>
         <w:drawing>
-          <wp:anchor distT="0" distB="0" distL="114300" distR="114300" simplePos="0" relativeHeight="251664896" behindDoc="0" locked="0" layoutInCell="1" allowOverlap="1" wp14:anchorId="347AC861" wp14:editId="056D72BD">
+          <wp:anchor distT="0" distB="0" distL="114300" distR="114300" simplePos="0" relativeHeight="251660288" behindDoc="0" locked="0" layoutInCell="1" allowOverlap="1" wp14:anchorId="347AC861" wp14:editId="056D72BD">
             <wp:simplePos x="0" y="0"/>
             <wp:positionH relativeFrom="page">
               <wp:posOffset>1661160</wp:posOffset>
@@ -1839,7 +2078,7 @@
                     <pic:cNvPicPr/>
                   </pic:nvPicPr>
                   <pic:blipFill>
-                    <a:blip r:embed="rId17"/>
+                    <a:blip r:embed="rId20"/>
                     <a:stretch>
                       <a:fillRect/>
                     </a:stretch>
@@ -1991,7 +2230,7 @@
           <w:lang w:val="ru-RU"/>
         </w:rPr>
         <w:drawing>
-          <wp:anchor distT="0" distB="0" distL="114300" distR="114300" simplePos="0" relativeHeight="251678208" behindDoc="0" locked="0" layoutInCell="1" allowOverlap="1" wp14:anchorId="3D02A73C" wp14:editId="0B87B4B9">
+          <wp:anchor distT="0" distB="0" distL="114300" distR="114300" simplePos="0" relativeHeight="251667456" behindDoc="0" locked="0" layoutInCell="1" allowOverlap="1" wp14:anchorId="3D02A73C" wp14:editId="0B87B4B9">
             <wp:simplePos x="0" y="0"/>
             <wp:positionH relativeFrom="page">
               <wp:posOffset>1821180</wp:posOffset>
@@ -2014,7 +2253,7 @@
                     <pic:cNvPicPr/>
                   </pic:nvPicPr>
                   <pic:blipFill>
-                    <a:blip r:embed="rId18"/>
+                    <a:blip r:embed="rId21"/>
                     <a:stretch>
                       <a:fillRect/>
                     </a:stretch>
@@ -2040,7 +2279,7 @@
           <w:lang w:val="ru-RU"/>
         </w:rPr>
         <w:drawing>
-          <wp:anchor distT="0" distB="0" distL="114300" distR="114300" simplePos="0" relativeHeight="251672064" behindDoc="0" locked="0" layoutInCell="1" allowOverlap="1" wp14:anchorId="1B43C36D" wp14:editId="189F27EF">
+          <wp:anchor distT="0" distB="0" distL="114300" distR="114300" simplePos="0" relativeHeight="251663360" behindDoc="0" locked="0" layoutInCell="1" allowOverlap="1" wp14:anchorId="1B43C36D" wp14:editId="189F27EF">
             <wp:simplePos x="0" y="0"/>
             <wp:positionH relativeFrom="page">
               <wp:posOffset>1249680</wp:posOffset>
@@ -2063,7 +2302,7 @@
                     <pic:cNvPicPr/>
                   </pic:nvPicPr>
                   <pic:blipFill>
-                    <a:blip r:embed="rId19"/>
+                    <a:blip r:embed="rId22"/>
                     <a:stretch>
                       <a:fillRect/>
                     </a:stretch>
@@ -2098,7 +2337,7 @@
           <w:lang w:val="ru-RU"/>
         </w:rPr>
         <w:drawing>
-          <wp:anchor distT="0" distB="0" distL="114300" distR="114300" simplePos="0" relativeHeight="251688448" behindDoc="0" locked="0" layoutInCell="1" allowOverlap="1" wp14:anchorId="41BBFAE6" wp14:editId="0DCB608F">
+          <wp:anchor distT="0" distB="0" distL="114300" distR="114300" simplePos="0" relativeHeight="251670528" behindDoc="0" locked="0" layoutInCell="1" allowOverlap="1" wp14:anchorId="41BBFAE6" wp14:editId="0DCB608F">
             <wp:simplePos x="0" y="0"/>
             <wp:positionH relativeFrom="page">
               <wp:posOffset>2644140</wp:posOffset>
@@ -2121,7 +2360,7 @@
                     <pic:cNvPicPr/>
                   </pic:nvPicPr>
                   <pic:blipFill>
-                    <a:blip r:embed="rId20"/>
+                    <a:blip r:embed="rId23"/>
                     <a:stretch>
                       <a:fillRect/>
                     </a:stretch>
@@ -2147,7 +2386,7 @@
           <w:lang w:val="ru-RU"/>
         </w:rPr>
         <w:drawing>
-          <wp:anchor distT="0" distB="0" distL="114300" distR="114300" simplePos="0" relativeHeight="251683328" behindDoc="0" locked="0" layoutInCell="1" allowOverlap="1" wp14:anchorId="6C6CB29D" wp14:editId="640518C1">
+          <wp:anchor distT="0" distB="0" distL="114300" distR="114300" simplePos="0" relativeHeight="251669504" behindDoc="0" locked="0" layoutInCell="1" allowOverlap="1" wp14:anchorId="6C6CB29D" wp14:editId="640518C1">
             <wp:simplePos x="0" y="0"/>
             <wp:positionH relativeFrom="page">
               <wp:posOffset>2278380</wp:posOffset>
@@ -2170,7 +2409,7 @@
                     <pic:cNvPicPr/>
                   </pic:nvPicPr>
                   <pic:blipFill>
-                    <a:blip r:embed="rId21"/>
+                    <a:blip r:embed="rId24"/>
                     <a:stretch>
                       <a:fillRect/>
                     </a:stretch>
@@ -2273,7 +2512,7 @@
         </w:rPr>
         <w:lastRenderedPageBreak/>
         <w:drawing>
-          <wp:anchor distT="0" distB="0" distL="114300" distR="114300" simplePos="0" relativeHeight="251703808" behindDoc="0" locked="0" layoutInCell="1" allowOverlap="1" wp14:anchorId="5A100C6D" wp14:editId="638E1CC8">
+          <wp:anchor distT="0" distB="0" distL="114300" distR="114300" simplePos="0" relativeHeight="251672576" behindDoc="0" locked="0" layoutInCell="1" allowOverlap="1" wp14:anchorId="5A100C6D" wp14:editId="638E1CC8">
             <wp:simplePos x="0" y="0"/>
             <wp:positionH relativeFrom="page">
               <wp:posOffset>716280</wp:posOffset>
@@ -2296,7 +2535,7 @@
                     <pic:cNvPicPr/>
                   </pic:nvPicPr>
                   <pic:blipFill>
-                    <a:blip r:embed="rId22"/>
+                    <a:blip r:embed="rId25"/>
                     <a:stretch>
                       <a:fillRect/>
                     </a:stretch>
@@ -2322,7 +2561,7 @@
           <w:lang w:val="ru-RU"/>
         </w:rPr>
         <w:drawing>
-          <wp:anchor distT="0" distB="0" distL="114300" distR="114300" simplePos="0" relativeHeight="251709952" behindDoc="0" locked="0" layoutInCell="1" allowOverlap="1" wp14:anchorId="3B5E5BD9" wp14:editId="64EA347A">
+          <wp:anchor distT="0" distB="0" distL="114300" distR="114300" simplePos="0" relativeHeight="251673600" behindDoc="0" locked="0" layoutInCell="1" allowOverlap="1" wp14:anchorId="3B5E5BD9" wp14:editId="64EA347A">
             <wp:simplePos x="0" y="0"/>
             <wp:positionH relativeFrom="page">
               <wp:posOffset>1318260</wp:posOffset>
@@ -2345,7 +2584,7 @@
                     <pic:cNvPicPr/>
                   </pic:nvPicPr>
                   <pic:blipFill>
-                    <a:blip r:embed="rId23"/>
+                    <a:blip r:embed="rId26"/>
                     <a:stretch>
                       <a:fillRect/>
                     </a:stretch>
@@ -2371,7 +2610,7 @@
           <w:lang w:val="ru-RU"/>
         </w:rPr>
         <w:drawing>
-          <wp:anchor distT="0" distB="0" distL="114300" distR="114300" simplePos="0" relativeHeight="251697664" behindDoc="0" locked="0" layoutInCell="1" allowOverlap="1" wp14:anchorId="7D82194C" wp14:editId="1739FC9A">
+          <wp:anchor distT="0" distB="0" distL="114300" distR="114300" simplePos="0" relativeHeight="251671552" behindDoc="0" locked="0" layoutInCell="1" allowOverlap="1" wp14:anchorId="7D82194C" wp14:editId="1739FC9A">
             <wp:simplePos x="0" y="0"/>
             <wp:positionH relativeFrom="page">
               <wp:posOffset>1508760</wp:posOffset>
@@ -2394,7 +2633,7 @@
                     <pic:cNvPicPr/>
                   </pic:nvPicPr>
                   <pic:blipFill>
-                    <a:blip r:embed="rId24"/>
+                    <a:blip r:embed="rId27"/>
                     <a:stretch>
                       <a:fillRect/>
                     </a:stretch>
@@ -2636,7 +2875,7 @@
           <w:sz w:val="28"/>
         </w:rPr>
         <w:drawing>
-          <wp:anchor distT="0" distB="0" distL="114300" distR="114300" simplePos="0" relativeHeight="251715072" behindDoc="0" locked="0" layoutInCell="1" allowOverlap="1" wp14:anchorId="790B69ED" wp14:editId="428EADD5">
+          <wp:anchor distT="0" distB="0" distL="114300" distR="114300" simplePos="0" relativeHeight="251675648" behindDoc="0" locked="0" layoutInCell="1" allowOverlap="1" wp14:anchorId="790B69ED" wp14:editId="428EADD5">
             <wp:simplePos x="0" y="0"/>
             <wp:positionH relativeFrom="page">
               <wp:posOffset>1889760</wp:posOffset>
@@ -2659,7 +2898,7 @@
                     <pic:cNvPicPr/>
                   </pic:nvPicPr>
                   <pic:blipFill>
-                    <a:blip r:embed="rId25"/>
+                    <a:blip r:embed="rId28"/>
                     <a:stretch>
                       <a:fillRect/>
                     </a:stretch>
@@ -2685,7 +2924,7 @@
           <w:lang w:val="ru-RU"/>
         </w:rPr>
         <w:drawing>
-          <wp:anchor distT="0" distB="0" distL="114300" distR="114300" simplePos="0" relativeHeight="251713024" behindDoc="0" locked="0" layoutInCell="1" allowOverlap="1" wp14:anchorId="31880A2F" wp14:editId="4F2573C8">
+          <wp:anchor distT="0" distB="0" distL="114300" distR="114300" simplePos="0" relativeHeight="251674624" behindDoc="0" locked="0" layoutInCell="1" allowOverlap="1" wp14:anchorId="31880A2F" wp14:editId="4F2573C8">
             <wp:simplePos x="0" y="0"/>
             <wp:positionH relativeFrom="page">
               <wp:posOffset>1604010</wp:posOffset>
@@ -2708,7 +2947,7 @@
                     <pic:cNvPicPr/>
                   </pic:nvPicPr>
                   <pic:blipFill>
-                    <a:blip r:embed="rId26"/>
+                    <a:blip r:embed="rId29"/>
                     <a:stretch>
                       <a:fillRect/>
                     </a:stretch>
@@ -2927,8 +3166,11 @@
         <w:spacing w:after="60"/>
       </w:pPr>
       <w:r>
+        <w:rPr>
+          <w:noProof/>
+        </w:rPr>
         <w:drawing>
-          <wp:anchor distT="0" distB="0" distL="114300" distR="114300" simplePos="0" relativeHeight="251633152" behindDoc="0" locked="0" layoutInCell="1" allowOverlap="1" wp14:anchorId="74478DB5" wp14:editId="6565F5C3">
+          <wp:anchor distT="0" distB="0" distL="114300" distR="114300" simplePos="0" relativeHeight="251645952" behindDoc="0" locked="0" layoutInCell="1" allowOverlap="1" wp14:anchorId="74478DB5" wp14:editId="6565F5C3">
             <wp:simplePos x="0" y="0"/>
             <wp:positionH relativeFrom="page">
               <wp:posOffset>731520</wp:posOffset>
@@ -2951,7 +3193,7 @@
                     <pic:cNvPicPr/>
                   </pic:nvPicPr>
                   <pic:blipFill>
-                    <a:blip r:embed="rId27"/>
+                    <a:blip r:embed="rId30"/>
                     <a:stretch>
                       <a:fillRect/>
                     </a:stretch>
@@ -3034,9 +3276,12 @@
         <w:spacing w:before="200" w:after="80"/>
       </w:pPr>
       <w:r>
+        <w:rPr>
+          <w:noProof/>
+        </w:rPr>
         <w:lastRenderedPageBreak/>
         <w:drawing>
-          <wp:anchor distT="0" distB="0" distL="114300" distR="114300" simplePos="0" relativeHeight="251637248" behindDoc="0" locked="0" layoutInCell="1" allowOverlap="1" wp14:anchorId="1D95ED5C" wp14:editId="5CCF474F">
+          <wp:anchor distT="0" distB="0" distL="114300" distR="114300" simplePos="0" relativeHeight="251648000" behindDoc="0" locked="0" layoutInCell="1" allowOverlap="1" wp14:anchorId="1D95ED5C" wp14:editId="5CCF474F">
             <wp:simplePos x="0" y="0"/>
             <wp:positionH relativeFrom="page">
               <wp:posOffset>731520</wp:posOffset>
@@ -3059,7 +3304,7 @@
                     <pic:cNvPicPr/>
                   </pic:nvPicPr>
                   <pic:blipFill>
-                    <a:blip r:embed="rId28"/>
+                    <a:blip r:embed="rId31"/>
                     <a:stretch>
                       <a:fillRect/>
                     </a:stretch>
@@ -3163,8 +3408,11 @@
         <w:spacing w:after="60"/>
       </w:pPr>
       <w:r>
+        <w:rPr>
+          <w:noProof/>
+        </w:rPr>
         <w:drawing>
-          <wp:anchor distT="0" distB="0" distL="114300" distR="114300" simplePos="0" relativeHeight="251642368" behindDoc="0" locked="0" layoutInCell="1" allowOverlap="1" wp14:anchorId="4E0533EC" wp14:editId="09E0A780">
+          <wp:anchor distT="0" distB="0" distL="114300" distR="114300" simplePos="0" relativeHeight="251649024" behindDoc="0" locked="0" layoutInCell="1" allowOverlap="1" wp14:anchorId="4E0533EC" wp14:editId="09E0A780">
             <wp:simplePos x="0" y="0"/>
             <wp:positionH relativeFrom="page">
               <wp:posOffset>2034540</wp:posOffset>
@@ -3187,7 +3435,7 @@
                     <pic:cNvPicPr/>
                   </pic:nvPicPr>
                   <pic:blipFill>
-                    <a:blip r:embed="rId29"/>
+                    <a:blip r:embed="rId32"/>
                     <a:stretch>
                       <a:fillRect/>
                     </a:stretch>
@@ -3235,7 +3483,15 @@
       </w:r>
       <w:proofErr w:type="spellEnd"/>
       <w:r>
-        <w:t xml:space="preserve"> веб-интерфейс GitHub и </w:t>
+        <w:t xml:space="preserve"> </w:t>
+      </w:r>
+      <w:proofErr w:type="spellStart"/>
+      <w:r>
+        <w:t>веб-интерфейс</w:t>
+      </w:r>
+      <w:proofErr w:type="spellEnd"/>
+      <w:r>
+        <w:t xml:space="preserve"> GitHub и </w:t>
       </w:r>
       <w:proofErr w:type="spellStart"/>
       <w:r>
@@ -3257,8 +3513,11 @@
         <w:ind w:left="360"/>
       </w:pPr>
       <w:r>
+        <w:rPr>
+          <w:noProof/>
+        </w:rPr>
         <w:drawing>
-          <wp:anchor distT="0" distB="0" distL="114300" distR="114300" simplePos="0" relativeHeight="251645440" behindDoc="0" locked="0" layoutInCell="1" allowOverlap="1" wp14:anchorId="4EF9E854" wp14:editId="64CB2286">
+          <wp:anchor distT="0" distB="0" distL="114300" distR="114300" simplePos="0" relativeHeight="251651072" behindDoc="0" locked="0" layoutInCell="1" allowOverlap="1" wp14:anchorId="4EF9E854" wp14:editId="64CB2286">
             <wp:simplePos x="0" y="0"/>
             <wp:positionH relativeFrom="page">
               <wp:posOffset>1897380</wp:posOffset>
@@ -3281,7 +3540,7 @@
                     <pic:cNvPicPr/>
                   </pic:nvPicPr>
                   <pic:blipFill>
-                    <a:blip r:embed="rId30"/>
+                    <a:blip r:embed="rId33"/>
                     <a:stretch>
                       <a:fillRect/>
                     </a:stretch>
@@ -3311,8 +3570,11 @@
         </w:rPr>
       </w:pPr>
       <w:r>
+        <w:rPr>
+          <w:noProof/>
+        </w:rPr>
         <w:drawing>
-          <wp:anchor distT="0" distB="0" distL="114300" distR="114300" simplePos="0" relativeHeight="251650560" behindDoc="0" locked="0" layoutInCell="1" allowOverlap="1" wp14:anchorId="1179501B" wp14:editId="1F0AAE55">
+          <wp:anchor distT="0" distB="0" distL="114300" distR="114300" simplePos="0" relativeHeight="251654144" behindDoc="0" locked="0" layoutInCell="1" allowOverlap="1" wp14:anchorId="1179501B" wp14:editId="1F0AAE55">
             <wp:simplePos x="0" y="0"/>
             <wp:positionH relativeFrom="page">
               <wp:posOffset>1844040</wp:posOffset>
@@ -3335,7 +3597,7 @@
                     <pic:cNvPicPr/>
                   </pic:nvPicPr>
                   <pic:blipFill>
-                    <a:blip r:embed="rId31"/>
+                    <a:blip r:embed="rId34"/>
                     <a:stretch>
                       <a:fillRect/>
                     </a:stretch>
@@ -3525,9 +3787,12 @@
         <w:spacing w:after="60"/>
       </w:pPr>
       <w:r>
+        <w:rPr>
+          <w:noProof/>
+        </w:rPr>
         <w:lastRenderedPageBreak/>
         <w:drawing>
-          <wp:anchor distT="0" distB="0" distL="114300" distR="114300" simplePos="0" relativeHeight="251656704" behindDoc="0" locked="0" layoutInCell="1" allowOverlap="1" wp14:anchorId="3DDE5A08" wp14:editId="4146CAC2">
+          <wp:anchor distT="0" distB="0" distL="114300" distR="114300" simplePos="0" relativeHeight="251657216" behindDoc="0" locked="0" layoutInCell="1" allowOverlap="1" wp14:anchorId="3DDE5A08" wp14:editId="4146CAC2">
             <wp:simplePos x="0" y="0"/>
             <wp:positionH relativeFrom="page">
               <wp:posOffset>914400</wp:posOffset>
@@ -3550,7 +3815,7 @@
                     <pic:cNvPicPr/>
                   </pic:nvPicPr>
                   <pic:blipFill>
-                    <a:blip r:embed="rId32"/>
+                    <a:blip r:embed="rId35"/>
                     <a:stretch>
                       <a:fillRect/>
                     </a:stretch>
@@ -3793,10 +4058,11 @@
       </w:pPr>
       <w:r>
         <w:rPr>
+          <w:noProof/>
           <w:lang w:val="ru-RU"/>
         </w:rPr>
         <w:drawing>
-          <wp:anchor distT="0" distB="0" distL="114300" distR="114300" simplePos="0" relativeHeight="251655680" behindDoc="0" locked="0" layoutInCell="1" allowOverlap="1" wp14:anchorId="28B07A80" wp14:editId="16E10C7E">
+          <wp:anchor distT="0" distB="0" distL="114300" distR="114300" simplePos="0" relativeHeight="251656192" behindDoc="0" locked="0" layoutInCell="1" allowOverlap="1" wp14:anchorId="28B07A80" wp14:editId="16E10C7E">
             <wp:simplePos x="0" y="0"/>
             <wp:positionH relativeFrom="page">
               <wp:posOffset>1120140</wp:posOffset>
@@ -3819,7 +4085,7 @@
                     <pic:cNvPicPr/>
                   </pic:nvPicPr>
                   <pic:blipFill>
-                    <a:blip r:embed="rId33"/>
+                    <a:blip r:embed="rId36"/>
                     <a:stretch>
                       <a:fillRect/>
                     </a:stretch>
@@ -4402,9 +4668,12 @@
         <w:ind w:left="360"/>
       </w:pPr>
       <w:r>
+        <w:rPr>
+          <w:noProof/>
+        </w:rPr>
         <w:lastRenderedPageBreak/>
         <w:drawing>
-          <wp:anchor distT="0" distB="0" distL="114300" distR="114300" simplePos="0" relativeHeight="251678208" behindDoc="0" locked="0" layoutInCell="1" allowOverlap="1" wp14:anchorId="61D258A8" wp14:editId="7F80E8DC">
+          <wp:anchor distT="0" distB="0" distL="114300" distR="114300" simplePos="0" relativeHeight="251668480" behindDoc="0" locked="0" layoutInCell="1" allowOverlap="1" wp14:anchorId="61D258A8" wp14:editId="7F80E8DC">
             <wp:simplePos x="0" y="0"/>
             <wp:positionH relativeFrom="page">
               <wp:posOffset>838200</wp:posOffset>
@@ -4427,7 +4696,7 @@
                     <pic:cNvPicPr/>
                   </pic:nvPicPr>
                   <pic:blipFill>
-                    <a:blip r:embed="rId34"/>
+                    <a:blip r:embed="rId37"/>
                     <a:stretch>
                       <a:fillRect/>
                     </a:stretch>
@@ -4448,8 +4717,11 @@
         </w:drawing>
       </w:r>
       <w:r>
+        <w:rPr>
+          <w:noProof/>
+        </w:rPr>
         <w:drawing>
-          <wp:anchor distT="0" distB="0" distL="114300" distR="114300" simplePos="0" relativeHeight="251676160" behindDoc="0" locked="0" layoutInCell="1" allowOverlap="1" wp14:anchorId="7AA2FD20" wp14:editId="3532A316">
+          <wp:anchor distT="0" distB="0" distL="114300" distR="114300" simplePos="0" relativeHeight="251664384" behindDoc="0" locked="0" layoutInCell="1" allowOverlap="1" wp14:anchorId="7AA2FD20" wp14:editId="3532A316">
             <wp:simplePos x="0" y="0"/>
             <wp:positionH relativeFrom="page">
               <wp:posOffset>731520</wp:posOffset>
@@ -4472,7 +4744,7 @@
                     <pic:cNvPicPr/>
                   </pic:nvPicPr>
                   <pic:blipFill>
-                    <a:blip r:embed="rId35"/>
+                    <a:blip r:embed="rId38"/>
                     <a:stretch>
                       <a:fillRect/>
                     </a:stretch>
@@ -4493,8 +4765,11 @@
         </w:drawing>
       </w:r>
       <w:r>
+        <w:rPr>
+          <w:noProof/>
+        </w:rPr>
         <w:drawing>
-          <wp:anchor distT="0" distB="0" distL="114300" distR="114300" simplePos="0" relativeHeight="251671040" behindDoc="0" locked="0" layoutInCell="1" allowOverlap="1" wp14:anchorId="36E4F052" wp14:editId="300A6217">
+          <wp:anchor distT="0" distB="0" distL="114300" distR="114300" simplePos="0" relativeHeight="251661312" behindDoc="0" locked="0" layoutInCell="1" allowOverlap="1" wp14:anchorId="36E4F052" wp14:editId="300A6217">
             <wp:simplePos x="0" y="0"/>
             <wp:positionH relativeFrom="page">
               <wp:posOffset>883920</wp:posOffset>
@@ -4517,7 +4792,7 @@
                     <pic:cNvPicPr/>
                   </pic:nvPicPr>
                   <pic:blipFill>
-                    <a:blip r:embed="rId36"/>
+                    <a:blip r:embed="rId39"/>
                     <a:stretch>
                       <a:fillRect/>
                     </a:stretch>
@@ -4538,8 +4813,11 @@
         </w:drawing>
       </w:r>
       <w:r>
+        <w:rPr>
+          <w:noProof/>
+        </w:rPr>
         <w:drawing>
-          <wp:anchor distT="0" distB="0" distL="114300" distR="114300" simplePos="0" relativeHeight="251664896" behindDoc="0" locked="0" layoutInCell="1" allowOverlap="1" wp14:anchorId="4F2B30BB" wp14:editId="218EAD6E">
+          <wp:anchor distT="0" distB="0" distL="114300" distR="114300" simplePos="0" relativeHeight="251659264" behindDoc="0" locked="0" layoutInCell="1" allowOverlap="1" wp14:anchorId="4F2B30BB" wp14:editId="218EAD6E">
             <wp:simplePos x="0" y="0"/>
             <wp:positionH relativeFrom="page">
               <wp:posOffset>731520</wp:posOffset>
@@ -4562,7 +4840,7 @@
                     <pic:cNvPicPr/>
                   </pic:nvPicPr>
                   <pic:blipFill>
-                    <a:blip r:embed="rId37"/>
+                    <a:blip r:embed="rId40"/>
                     <a:stretch>
                       <a:fillRect/>
                     </a:stretch>
@@ -4611,20 +4889,20 @@
           <w:b/>
           <w:color w:val="4C1D95"/>
           <w:sz w:val="25"/>
-          <w:lang w:val="ru-RU"/>
         </w:rPr>
       </w:pPr>
       <w:r>
         <w:rPr>
           <w:rFonts w:asciiTheme="minorHAnsi" w:hAnsiTheme="minorHAnsi" w:cs="Segoe UI Emoji"/>
           <w:b/>
+          <w:noProof/>
           <w:color w:val="4C1D95"/>
           <w:sz w:val="25"/>
           <w:lang w:val="ru-RU"/>
         </w:rPr>
         <w:lastRenderedPageBreak/>
         <w:drawing>
-          <wp:anchor distT="0" distB="0" distL="114300" distR="114300" simplePos="0" relativeHeight="251683328" behindDoc="0" locked="0" layoutInCell="1" allowOverlap="1" wp14:anchorId="18A0F735" wp14:editId="5C3B86D5">
+          <wp:anchor distT="0" distB="0" distL="114300" distR="114300" simplePos="0" relativeHeight="251652096" behindDoc="0" locked="0" layoutInCell="1" allowOverlap="1" wp14:anchorId="18A0F735" wp14:editId="07B5C1F2">
             <wp:simplePos x="0" y="0"/>
             <wp:positionH relativeFrom="page">
               <wp:posOffset>815340</wp:posOffset>
@@ -4647,7 +4925,7 @@
                     <pic:cNvPicPr/>
                   </pic:nvPicPr>
                   <pic:blipFill>
-                    <a:blip r:embed="rId38"/>
+                    <a:blip r:embed="rId41"/>
                     <a:stretch>
                       <a:fillRect/>
                     </a:stretch>
@@ -4894,8 +5172,11 @@
         <w:spacing w:after="60"/>
       </w:pPr>
       <w:r>
+        <w:rPr>
+          <w:noProof/>
+        </w:rPr>
         <w:drawing>
-          <wp:anchor distT="0" distB="0" distL="114300" distR="114300" simplePos="0" relativeHeight="251681280" behindDoc="0" locked="0" layoutInCell="1" allowOverlap="1" wp14:anchorId="06E82CE1" wp14:editId="5DDBFB6A">
+          <wp:anchor distT="0" distB="0" distL="114300" distR="114300" simplePos="0" relativeHeight="251650048" behindDoc="0" locked="0" layoutInCell="1" allowOverlap="1" wp14:anchorId="06E82CE1" wp14:editId="5DDBFB6A">
             <wp:simplePos x="0" y="0"/>
             <wp:positionH relativeFrom="page">
               <wp:posOffset>952500</wp:posOffset>
@@ -4918,7 +5199,7 @@
                     <pic:cNvPicPr/>
                   </pic:nvPicPr>
                   <pic:blipFill>
-                    <a:blip r:embed="rId39"/>
+                    <a:blip r:embed="rId42"/>
                     <a:stretch>
                       <a:fillRect/>
                     </a:stretch>
@@ -5115,6 +5396,104 @@
       </w:pPr>
       <w:r>
         <w:rPr>
+          <w:noProof/>
+          <w:lang w:val="ru-RU"/>
+        </w:rPr>
+        <w:drawing>
+          <wp:anchor distT="0" distB="0" distL="114300" distR="114300" simplePos="0" relativeHeight="251658240" behindDoc="0" locked="0" layoutInCell="1" allowOverlap="1" wp14:anchorId="7DABAFF9" wp14:editId="5C035602">
+            <wp:simplePos x="0" y="0"/>
+            <wp:positionH relativeFrom="page">
+              <wp:posOffset>2644140</wp:posOffset>
+            </wp:positionH>
+            <wp:positionV relativeFrom="page">
+              <wp:posOffset>7004685</wp:posOffset>
+            </wp:positionV>
+            <wp:extent cx="2152950" cy="1400370"/>
+            <wp:effectExtent l="0" t="0" r="0" b="9525"/>
+            <wp:wrapTopAndBottom/>
+            <wp:docPr id="55297230" name="Рисунок 1"/>
+            <wp:cNvGraphicFramePr>
+              <a:graphicFrameLocks xmlns:a="http://schemas.openxmlformats.org/drawingml/2006/main" noChangeAspect="1"/>
+            </wp:cNvGraphicFramePr>
+            <a:graphic xmlns:a="http://schemas.openxmlformats.org/drawingml/2006/main">
+              <a:graphicData uri="http://schemas.openxmlformats.org/drawingml/2006/picture">
+                <pic:pic xmlns:pic="http://schemas.openxmlformats.org/drawingml/2006/picture">
+                  <pic:nvPicPr>
+                    <pic:cNvPr id="55297230" name=""/>
+                    <pic:cNvPicPr/>
+                  </pic:nvPicPr>
+                  <pic:blipFill>
+                    <a:blip r:embed="rId43"/>
+                    <a:stretch>
+                      <a:fillRect/>
+                    </a:stretch>
+                  </pic:blipFill>
+                  <pic:spPr>
+                    <a:xfrm>
+                      <a:off x="0" y="0"/>
+                      <a:ext cx="2152950" cy="1400370"/>
+                    </a:xfrm>
+                    <a:prstGeom prst="rect">
+                      <a:avLst/>
+                    </a:prstGeom>
+                  </pic:spPr>
+                </pic:pic>
+              </a:graphicData>
+            </a:graphic>
+          </wp:anchor>
+        </w:drawing>
+      </w:r>
+      <w:r>
+        <w:rPr>
+          <w:noProof/>
+          <w:lang w:val="ru-RU"/>
+        </w:rPr>
+        <w:drawing>
+          <wp:anchor distT="0" distB="0" distL="114300" distR="114300" simplePos="0" relativeHeight="251655168" behindDoc="0" locked="0" layoutInCell="1" allowOverlap="1" wp14:anchorId="286A5A8A" wp14:editId="3B6BFC8F">
+            <wp:simplePos x="0" y="0"/>
+            <wp:positionH relativeFrom="page">
+              <wp:posOffset>1066800</wp:posOffset>
+            </wp:positionH>
+            <wp:positionV relativeFrom="page">
+              <wp:posOffset>5351145</wp:posOffset>
+            </wp:positionV>
+            <wp:extent cx="5639587" cy="1505160"/>
+            <wp:effectExtent l="0" t="0" r="0" b="0"/>
+            <wp:wrapTopAndBottom/>
+            <wp:docPr id="1135043238" name="Рисунок 1"/>
+            <wp:cNvGraphicFramePr>
+              <a:graphicFrameLocks xmlns:a="http://schemas.openxmlformats.org/drawingml/2006/main" noChangeAspect="1"/>
+            </wp:cNvGraphicFramePr>
+            <a:graphic xmlns:a="http://schemas.openxmlformats.org/drawingml/2006/main">
+              <a:graphicData uri="http://schemas.openxmlformats.org/drawingml/2006/picture">
+                <pic:pic xmlns:pic="http://schemas.openxmlformats.org/drawingml/2006/picture">
+                  <pic:nvPicPr>
+                    <pic:cNvPr id="1135043238" name=""/>
+                    <pic:cNvPicPr/>
+                  </pic:nvPicPr>
+                  <pic:blipFill>
+                    <a:blip r:embed="rId44"/>
+                    <a:stretch>
+                      <a:fillRect/>
+                    </a:stretch>
+                  </pic:blipFill>
+                  <pic:spPr>
+                    <a:xfrm>
+                      <a:off x="0" y="0"/>
+                      <a:ext cx="5639587" cy="1505160"/>
+                    </a:xfrm>
+                    <a:prstGeom prst="rect">
+                      <a:avLst/>
+                    </a:prstGeom>
+                  </pic:spPr>
+                </pic:pic>
+              </a:graphicData>
+            </a:graphic>
+          </wp:anchor>
+        </w:drawing>
+      </w:r>
+      <w:r>
+        <w:rPr>
           <w:b/>
           <w:lang w:val="ru-RU"/>
         </w:rPr>
@@ -5126,6 +5505,20 @@
         </w:rPr>
         <w:t>файлы и выполнить коммит через графический интерфейс редактора.</w:t>
       </w:r>
+    </w:p>
+    <w:p>
+      <w:pPr>
+        <w:pStyle w:val="a0"/>
+        <w:numPr>
+          <w:ilvl w:val="0"/>
+          <w:numId w:val="0"/>
+        </w:numPr>
+        <w:spacing w:after="60"/>
+        <w:ind w:left="360"/>
+        <w:rPr>
+          <w:lang w:val="ru-RU"/>
+        </w:rPr>
+      </w:pPr>
     </w:p>
     <w:p>
       <w:pPr>
@@ -5138,6 +5531,7 @@
           <w:color w:val="4C1D95"/>
           <w:sz w:val="25"/>
         </w:rPr>
+        <w:lastRenderedPageBreak/>
         <w:t xml:space="preserve">🔴 </w:t>
       </w:r>
       <w:proofErr w:type="spellStart"/>
@@ -5215,6 +5609,54 @@
         <w:pStyle w:val="a0"/>
         <w:spacing w:after="60"/>
       </w:pPr>
+      <w:r>
+        <w:rPr>
+          <w:noProof/>
+        </w:rPr>
+        <w:drawing>
+          <wp:anchor distT="0" distB="0" distL="114300" distR="114300" simplePos="0" relativeHeight="251583488" behindDoc="0" locked="0" layoutInCell="1" allowOverlap="1" wp14:anchorId="3E55C6E9" wp14:editId="44DE38B0">
+            <wp:simplePos x="0" y="0"/>
+            <wp:positionH relativeFrom="page">
+              <wp:posOffset>1882140</wp:posOffset>
+            </wp:positionH>
+            <wp:positionV relativeFrom="page">
+              <wp:posOffset>1591310</wp:posOffset>
+            </wp:positionV>
+            <wp:extent cx="4182059" cy="924054"/>
+            <wp:effectExtent l="0" t="0" r="9525" b="9525"/>
+            <wp:wrapTopAndBottom/>
+            <wp:docPr id="1464579661" name="Рисунок 1"/>
+            <wp:cNvGraphicFramePr>
+              <a:graphicFrameLocks xmlns:a="http://schemas.openxmlformats.org/drawingml/2006/main" noChangeAspect="1"/>
+            </wp:cNvGraphicFramePr>
+            <a:graphic xmlns:a="http://schemas.openxmlformats.org/drawingml/2006/main">
+              <a:graphicData uri="http://schemas.openxmlformats.org/drawingml/2006/picture">
+                <pic:pic xmlns:pic="http://schemas.openxmlformats.org/drawingml/2006/picture">
+                  <pic:nvPicPr>
+                    <pic:cNvPr id="1464579661" name=""/>
+                    <pic:cNvPicPr/>
+                  </pic:nvPicPr>
+                  <pic:blipFill>
+                    <a:blip r:embed="rId45"/>
+                    <a:stretch>
+                      <a:fillRect/>
+                    </a:stretch>
+                  </pic:blipFill>
+                  <pic:spPr>
+                    <a:xfrm>
+                      <a:off x="0" y="0"/>
+                      <a:ext cx="4182059" cy="924054"/>
+                    </a:xfrm>
+                    <a:prstGeom prst="rect">
+                      <a:avLst/>
+                    </a:prstGeom>
+                  </pic:spPr>
+                </pic:pic>
+              </a:graphicData>
+            </a:graphic>
+          </wp:anchor>
+        </w:drawing>
+      </w:r>
       <w:proofErr w:type="spellStart"/>
       <w:r>
         <w:rPr>
@@ -5227,7 +5669,6 @@
       <w:r>
         <w:rPr>
           <w:b/>
-          <w:lang w:val="ru-RU"/>
         </w:rPr>
         <w:t xml:space="preserve"> </w:t>
       </w:r>
@@ -5238,49 +5679,30 @@
         <w:t>репозиторий</w:t>
       </w:r>
       <w:r>
-        <w:rPr>
-          <w:lang w:val="ru-RU"/>
-        </w:rPr>
         <w:t xml:space="preserve"> </w:t>
       </w:r>
-      <w:proofErr w:type="spellStart"/>
       <w:r>
         <w:t>wt</w:t>
       </w:r>
-      <w:proofErr w:type="spellEnd"/>
-      <w:r>
-        <w:rPr>
-          <w:lang w:val="ru-RU"/>
-        </w:rPr>
+      <w:r>
         <w:t>-</w:t>
       </w:r>
       <w:r>
         <w:t>lab</w:t>
       </w:r>
       <w:r>
-        <w:rPr>
-          <w:lang w:val="ru-RU"/>
-        </w:rPr>
         <w:t>1-1</w:t>
       </w:r>
       <w:r>
         <w:t>git</w:t>
       </w:r>
       <w:r>
-        <w:rPr>
-          <w:lang w:val="ru-RU"/>
-        </w:rPr>
         <w:t>-</w:t>
       </w:r>
-      <w:proofErr w:type="spellStart"/>
       <w:r>
         <w:t>ivanov</w:t>
       </w:r>
-      <w:proofErr w:type="spellEnd"/>
-      <w:r>
-        <w:rPr>
-          <w:lang w:val="ru-RU"/>
-        </w:rPr>
+      <w:r>
         <w:t xml:space="preserve"> </w:t>
       </w:r>
       <w:r>
@@ -5290,18 +5712,12 @@
         <w:t>из</w:t>
       </w:r>
       <w:r>
-        <w:rPr>
-          <w:lang w:val="ru-RU"/>
-        </w:rPr>
         <w:t xml:space="preserve"> </w:t>
       </w:r>
       <w:r>
         <w:t>GitHub</w:t>
       </w:r>
       <w:r>
-        <w:rPr>
-          <w:lang w:val="ru-RU"/>
-        </w:rPr>
         <w:t xml:space="preserve"> </w:t>
       </w:r>
       <w:r>
@@ -5311,9 +5727,6 @@
         <w:t>через</w:t>
       </w:r>
       <w:r>
-        <w:rPr>
-          <w:lang w:val="ru-RU"/>
-        </w:rPr>
         <w:t xml:space="preserve"> </w:t>
       </w:r>
       <w:r>
@@ -5323,9 +5736,6 @@
         <w:t>Палитру</w:t>
       </w:r>
       <w:r>
-        <w:rPr>
-          <w:lang w:val="ru-RU"/>
-        </w:rPr>
         <w:t xml:space="preserve"> </w:t>
       </w:r>
       <w:r>
@@ -5335,9 +5745,6 @@
         <w:t>команд</w:t>
       </w:r>
       <w:r>
-        <w:rPr>
-          <w:lang w:val="ru-RU"/>
-        </w:rPr>
         <w:t xml:space="preserve">. </w:t>
       </w:r>
       <w:r>
@@ -5354,6 +5761,17 @@
       <w:r>
         <w:t>)</w:t>
       </w:r>
+    </w:p>
+    <w:p>
+      <w:pPr>
+        <w:pStyle w:val="a0"/>
+        <w:numPr>
+          <w:ilvl w:val="0"/>
+          <w:numId w:val="0"/>
+        </w:numPr>
+        <w:spacing w:after="60"/>
+        <w:ind w:left="360"/>
+      </w:pPr>
     </w:p>
     <w:p>
       <w:pPr>
@@ -5365,6 +5783,104 @@
       </w:pPr>
       <w:r>
         <w:rPr>
+          <w:noProof/>
+          <w:lang w:val="ru-RU"/>
+        </w:rPr>
+        <w:drawing>
+          <wp:anchor distT="0" distB="0" distL="114300" distR="114300" simplePos="0" relativeHeight="251591680" behindDoc="0" locked="0" layoutInCell="1" allowOverlap="1" wp14:anchorId="774EAE80" wp14:editId="5D697E89">
+            <wp:simplePos x="0" y="0"/>
+            <wp:positionH relativeFrom="page">
+              <wp:posOffset>2758440</wp:posOffset>
+            </wp:positionH>
+            <wp:positionV relativeFrom="page">
+              <wp:posOffset>3879215</wp:posOffset>
+            </wp:positionV>
+            <wp:extent cx="2238687" cy="647790"/>
+            <wp:effectExtent l="0" t="0" r="9525" b="0"/>
+            <wp:wrapTopAndBottom/>
+            <wp:docPr id="867690625" name="Рисунок 1"/>
+            <wp:cNvGraphicFramePr>
+              <a:graphicFrameLocks xmlns:a="http://schemas.openxmlformats.org/drawingml/2006/main" noChangeAspect="1"/>
+            </wp:cNvGraphicFramePr>
+            <a:graphic xmlns:a="http://schemas.openxmlformats.org/drawingml/2006/main">
+              <a:graphicData uri="http://schemas.openxmlformats.org/drawingml/2006/picture">
+                <pic:pic xmlns:pic="http://schemas.openxmlformats.org/drawingml/2006/picture">
+                  <pic:nvPicPr>
+                    <pic:cNvPr id="867690625" name=""/>
+                    <pic:cNvPicPr/>
+                  </pic:nvPicPr>
+                  <pic:blipFill>
+                    <a:blip r:embed="rId46"/>
+                    <a:stretch>
+                      <a:fillRect/>
+                    </a:stretch>
+                  </pic:blipFill>
+                  <pic:spPr>
+                    <a:xfrm>
+                      <a:off x="0" y="0"/>
+                      <a:ext cx="2238687" cy="647790"/>
+                    </a:xfrm>
+                    <a:prstGeom prst="rect">
+                      <a:avLst/>
+                    </a:prstGeom>
+                  </pic:spPr>
+                </pic:pic>
+              </a:graphicData>
+            </a:graphic>
+          </wp:anchor>
+        </w:drawing>
+      </w:r>
+      <w:r>
+        <w:rPr>
+          <w:noProof/>
+          <w:lang w:val="ru-RU"/>
+        </w:rPr>
+        <w:drawing>
+          <wp:anchor distT="0" distB="0" distL="114300" distR="114300" simplePos="0" relativeHeight="251587584" behindDoc="0" locked="0" layoutInCell="1" allowOverlap="1" wp14:anchorId="0661C1C5" wp14:editId="4AA009BB">
+            <wp:simplePos x="0" y="0"/>
+            <wp:positionH relativeFrom="page">
+              <wp:posOffset>2819400</wp:posOffset>
+            </wp:positionH>
+            <wp:positionV relativeFrom="page">
+              <wp:posOffset>3239135</wp:posOffset>
+            </wp:positionV>
+            <wp:extent cx="2133898" cy="485843"/>
+            <wp:effectExtent l="0" t="0" r="0" b="9525"/>
+            <wp:wrapTopAndBottom/>
+            <wp:docPr id="2091196310" name="Рисунок 1"/>
+            <wp:cNvGraphicFramePr>
+              <a:graphicFrameLocks xmlns:a="http://schemas.openxmlformats.org/drawingml/2006/main" noChangeAspect="1"/>
+            </wp:cNvGraphicFramePr>
+            <a:graphic xmlns:a="http://schemas.openxmlformats.org/drawingml/2006/main">
+              <a:graphicData uri="http://schemas.openxmlformats.org/drawingml/2006/picture">
+                <pic:pic xmlns:pic="http://schemas.openxmlformats.org/drawingml/2006/picture">
+                  <pic:nvPicPr>
+                    <pic:cNvPr id="2091196310" name=""/>
+                    <pic:cNvPicPr/>
+                  </pic:nvPicPr>
+                  <pic:blipFill>
+                    <a:blip r:embed="rId47"/>
+                    <a:stretch>
+                      <a:fillRect/>
+                    </a:stretch>
+                  </pic:blipFill>
+                  <pic:spPr>
+                    <a:xfrm>
+                      <a:off x="0" y="0"/>
+                      <a:ext cx="2133898" cy="485843"/>
+                    </a:xfrm>
+                    <a:prstGeom prst="rect">
+                      <a:avLst/>
+                    </a:prstGeom>
+                  </pic:spPr>
+                </pic:pic>
+              </a:graphicData>
+            </a:graphic>
+          </wp:anchor>
+        </w:drawing>
+      </w:r>
+      <w:r>
+        <w:rPr>
           <w:b/>
           <w:lang w:val="ru-RU"/>
         </w:rPr>
@@ -5414,6 +5930,19 @@
         </w:rPr>
         <w:t>.</w:t>
       </w:r>
+    </w:p>
+    <w:p>
+      <w:pPr>
+        <w:pStyle w:val="a0"/>
+        <w:numPr>
+          <w:ilvl w:val="0"/>
+          <w:numId w:val="0"/>
+        </w:numPr>
+        <w:spacing w:after="60"/>
+        <w:rPr>
+          <w:lang w:val="ru-RU"/>
+        </w:rPr>
+      </w:pPr>
     </w:p>
     <w:p>
       <w:pPr>
@@ -5439,6 +5968,64 @@
     </w:p>
     <w:p>
       <w:pPr>
+        <w:pStyle w:val="a0"/>
+        <w:numPr>
+          <w:ilvl w:val="0"/>
+          <w:numId w:val="0"/>
+        </w:numPr>
+        <w:spacing w:after="60"/>
+      </w:pPr>
+      <w:r>
+        <w:rPr>
+          <w:noProof/>
+        </w:rPr>
+        <w:drawing>
+          <wp:anchor distT="0" distB="0" distL="114300" distR="114300" simplePos="0" relativeHeight="251595776" behindDoc="0" locked="0" layoutInCell="1" allowOverlap="1" wp14:anchorId="0D7273E9" wp14:editId="2C61CA04">
+            <wp:simplePos x="0" y="0"/>
+            <wp:positionH relativeFrom="page">
+              <wp:posOffset>731520</wp:posOffset>
+            </wp:positionH>
+            <wp:positionV relativeFrom="page">
+              <wp:posOffset>5184140</wp:posOffset>
+            </wp:positionV>
+            <wp:extent cx="6077798" cy="885949"/>
+            <wp:effectExtent l="0" t="0" r="0" b="9525"/>
+            <wp:wrapTopAndBottom/>
+            <wp:docPr id="825636340" name="Рисунок 1"/>
+            <wp:cNvGraphicFramePr>
+              <a:graphicFrameLocks xmlns:a="http://schemas.openxmlformats.org/drawingml/2006/main" noChangeAspect="1"/>
+            </wp:cNvGraphicFramePr>
+            <a:graphic xmlns:a="http://schemas.openxmlformats.org/drawingml/2006/main">
+              <a:graphicData uri="http://schemas.openxmlformats.org/drawingml/2006/picture">
+                <pic:pic xmlns:pic="http://schemas.openxmlformats.org/drawingml/2006/picture">
+                  <pic:nvPicPr>
+                    <pic:cNvPr id="825636340" name=""/>
+                    <pic:cNvPicPr/>
+                  </pic:nvPicPr>
+                  <pic:blipFill>
+                    <a:blip r:embed="rId48"/>
+                    <a:stretch>
+                      <a:fillRect/>
+                    </a:stretch>
+                  </pic:blipFill>
+                  <pic:spPr>
+                    <a:xfrm>
+                      <a:off x="0" y="0"/>
+                      <a:ext cx="6077798" cy="885949"/>
+                    </a:xfrm>
+                    <a:prstGeom prst="rect">
+                      <a:avLst/>
+                    </a:prstGeom>
+                  </pic:spPr>
+                </pic:pic>
+              </a:graphicData>
+            </a:graphic>
+          </wp:anchor>
+        </w:drawing>
+      </w:r>
+    </w:p>
+    <w:p>
+      <w:pPr>
         <w:keepNext/>
         <w:spacing w:before="280" w:after="120"/>
         <w:rPr>
@@ -5610,8 +6197,221 @@
     <w:p>
       <w:pPr>
         <w:pStyle w:val="a0"/>
+        <w:numPr>
+          <w:ilvl w:val="0"/>
+          <w:numId w:val="0"/>
+        </w:numPr>
+        <w:spacing w:after="60"/>
+        <w:ind w:left="360"/>
+        <w:rPr>
+          <w:lang w:val="ru-RU"/>
+        </w:rPr>
+      </w:pPr>
+      <w:r>
+        <w:rPr>
+          <w:lang w:val="ru-RU"/>
+        </w:rPr>
+        <w:drawing>
+          <wp:anchor distT="0" distB="0" distL="114300" distR="114300" simplePos="0" relativeHeight="251614208" behindDoc="0" locked="0" layoutInCell="1" allowOverlap="1" wp14:anchorId="73B514BC" wp14:editId="7FCEC939">
+            <wp:simplePos x="0" y="0"/>
+            <wp:positionH relativeFrom="page">
+              <wp:posOffset>1859280</wp:posOffset>
+            </wp:positionH>
+            <wp:positionV relativeFrom="page">
+              <wp:posOffset>7620000</wp:posOffset>
+            </wp:positionV>
+            <wp:extent cx="4046220" cy="1303020"/>
+            <wp:effectExtent l="0" t="0" r="0" b="0"/>
+            <wp:wrapTopAndBottom/>
+            <wp:docPr id="994449560" name="Рисунок 1"/>
+            <wp:cNvGraphicFramePr>
+              <a:graphicFrameLocks xmlns:a="http://schemas.openxmlformats.org/drawingml/2006/main" noChangeAspect="1"/>
+            </wp:cNvGraphicFramePr>
+            <a:graphic xmlns:a="http://schemas.openxmlformats.org/drawingml/2006/main">
+              <a:graphicData uri="http://schemas.openxmlformats.org/drawingml/2006/picture">
+                <pic:pic xmlns:pic="http://schemas.openxmlformats.org/drawingml/2006/picture">
+                  <pic:nvPicPr>
+                    <pic:cNvPr id="994449560" name=""/>
+                    <pic:cNvPicPr/>
+                  </pic:nvPicPr>
+                  <pic:blipFill>
+                    <a:blip r:embed="rId49"/>
+                    <a:stretch>
+                      <a:fillRect/>
+                    </a:stretch>
+                  </pic:blipFill>
+                  <pic:spPr>
+                    <a:xfrm>
+                      <a:off x="0" y="0"/>
+                      <a:ext cx="4046220" cy="1303020"/>
+                    </a:xfrm>
+                    <a:prstGeom prst="rect">
+                      <a:avLst/>
+                    </a:prstGeom>
+                  </pic:spPr>
+                </pic:pic>
+              </a:graphicData>
+            </a:graphic>
+          </wp:anchor>
+        </w:drawing>
+      </w:r>
+    </w:p>
+    <w:p>
+      <w:pPr>
+        <w:rPr>
+          <w:b/>
+          <w:lang w:val="ru-RU"/>
+        </w:rPr>
+      </w:pPr>
+      <w:r>
+        <w:rPr>
+          <w:b/>
+          <w:lang w:val="ru-RU"/>
+        </w:rPr>
+        <w:br w:type="page"/>
+      </w:r>
+    </w:p>
+    <w:p>
+      <w:pPr>
+        <w:pStyle w:val="a0"/>
         <w:spacing w:after="60"/>
       </w:pPr>
+      <w:r>
+        <w:lastRenderedPageBreak/>
+        <w:drawing>
+          <wp:anchor distT="0" distB="0" distL="114300" distR="114300" simplePos="0" relativeHeight="251651072" behindDoc="0" locked="0" layoutInCell="1" allowOverlap="1" wp14:anchorId="58E42408" wp14:editId="588ABAB5">
+            <wp:simplePos x="0" y="0"/>
+            <wp:positionH relativeFrom="page">
+              <wp:posOffset>1333500</wp:posOffset>
+            </wp:positionH>
+            <wp:positionV relativeFrom="page">
+              <wp:posOffset>1948815</wp:posOffset>
+            </wp:positionV>
+            <wp:extent cx="5106113" cy="971686"/>
+            <wp:effectExtent l="0" t="0" r="0" b="0"/>
+            <wp:wrapTopAndBottom/>
+            <wp:docPr id="120402759" name="Рисунок 1"/>
+            <wp:cNvGraphicFramePr>
+              <a:graphicFrameLocks xmlns:a="http://schemas.openxmlformats.org/drawingml/2006/main" noChangeAspect="1"/>
+            </wp:cNvGraphicFramePr>
+            <a:graphic xmlns:a="http://schemas.openxmlformats.org/drawingml/2006/main">
+              <a:graphicData uri="http://schemas.openxmlformats.org/drawingml/2006/picture">
+                <pic:pic xmlns:pic="http://schemas.openxmlformats.org/drawingml/2006/picture">
+                  <pic:nvPicPr>
+                    <pic:cNvPr id="120402759" name=""/>
+                    <pic:cNvPicPr/>
+                  </pic:nvPicPr>
+                  <pic:blipFill>
+                    <a:blip r:embed="rId50"/>
+                    <a:stretch>
+                      <a:fillRect/>
+                    </a:stretch>
+                  </pic:blipFill>
+                  <pic:spPr>
+                    <a:xfrm>
+                      <a:off x="0" y="0"/>
+                      <a:ext cx="5106113" cy="971686"/>
+                    </a:xfrm>
+                    <a:prstGeom prst="rect">
+                      <a:avLst/>
+                    </a:prstGeom>
+                  </pic:spPr>
+                </pic:pic>
+              </a:graphicData>
+            </a:graphic>
+          </wp:anchor>
+        </w:drawing>
+      </w:r>
+      <w:r>
+        <w:drawing>
+          <wp:anchor distT="0" distB="0" distL="114300" distR="114300" simplePos="0" relativeHeight="251667456" behindDoc="0" locked="0" layoutInCell="1" allowOverlap="1" wp14:anchorId="3ED8D06C" wp14:editId="51AC25A2">
+            <wp:simplePos x="0" y="0"/>
+            <wp:positionH relativeFrom="page">
+              <wp:posOffset>1324608</wp:posOffset>
+            </wp:positionH>
+            <wp:positionV relativeFrom="page">
+              <wp:posOffset>3072130</wp:posOffset>
+            </wp:positionV>
+            <wp:extent cx="5115639" cy="962159"/>
+            <wp:effectExtent l="0" t="0" r="8890" b="9525"/>
+            <wp:wrapTopAndBottom/>
+            <wp:docPr id="2136767823" name="Рисунок 1"/>
+            <wp:cNvGraphicFramePr>
+              <a:graphicFrameLocks xmlns:a="http://schemas.openxmlformats.org/drawingml/2006/main" noChangeAspect="1"/>
+            </wp:cNvGraphicFramePr>
+            <a:graphic xmlns:a="http://schemas.openxmlformats.org/drawingml/2006/main">
+              <a:graphicData uri="http://schemas.openxmlformats.org/drawingml/2006/picture">
+                <pic:pic xmlns:pic="http://schemas.openxmlformats.org/drawingml/2006/picture">
+                  <pic:nvPicPr>
+                    <pic:cNvPr id="2136767823" name=""/>
+                    <pic:cNvPicPr/>
+                  </pic:nvPicPr>
+                  <pic:blipFill>
+                    <a:blip r:embed="rId51"/>
+                    <a:stretch>
+                      <a:fillRect/>
+                    </a:stretch>
+                  </pic:blipFill>
+                  <pic:spPr>
+                    <a:xfrm>
+                      <a:off x="0" y="0"/>
+                      <a:ext cx="5115639" cy="962159"/>
+                    </a:xfrm>
+                    <a:prstGeom prst="rect">
+                      <a:avLst/>
+                    </a:prstGeom>
+                  </pic:spPr>
+                </pic:pic>
+              </a:graphicData>
+            </a:graphic>
+          </wp:anchor>
+        </w:drawing>
+      </w:r>
+      <w:r>
+        <w:drawing>
+          <wp:anchor distT="0" distB="0" distL="114300" distR="114300" simplePos="0" relativeHeight="251632640" behindDoc="0" locked="0" layoutInCell="1" allowOverlap="1" wp14:anchorId="3F9A6C34" wp14:editId="786E31A0">
+            <wp:simplePos x="0" y="0"/>
+            <wp:positionH relativeFrom="page">
+              <wp:posOffset>1310640</wp:posOffset>
+            </wp:positionH>
+            <wp:positionV relativeFrom="page">
+              <wp:posOffset>1088390</wp:posOffset>
+            </wp:positionV>
+            <wp:extent cx="5144218" cy="762106"/>
+            <wp:effectExtent l="0" t="0" r="0" b="0"/>
+            <wp:wrapTopAndBottom/>
+            <wp:docPr id="678973705" name="Рисунок 1"/>
+            <wp:cNvGraphicFramePr>
+              <a:graphicFrameLocks xmlns:a="http://schemas.openxmlformats.org/drawingml/2006/main" noChangeAspect="1"/>
+            </wp:cNvGraphicFramePr>
+            <a:graphic xmlns:a="http://schemas.openxmlformats.org/drawingml/2006/main">
+              <a:graphicData uri="http://schemas.openxmlformats.org/drawingml/2006/picture">
+                <pic:pic xmlns:pic="http://schemas.openxmlformats.org/drawingml/2006/picture">
+                  <pic:nvPicPr>
+                    <pic:cNvPr id="678973705" name=""/>
+                    <pic:cNvPicPr/>
+                  </pic:nvPicPr>
+                  <pic:blipFill>
+                    <a:blip r:embed="rId52"/>
+                    <a:stretch>
+                      <a:fillRect/>
+                    </a:stretch>
+                  </pic:blipFill>
+                  <pic:spPr>
+                    <a:xfrm>
+                      <a:off x="0" y="0"/>
+                      <a:ext cx="5144218" cy="762106"/>
+                    </a:xfrm>
+                    <a:prstGeom prst="rect">
+                      <a:avLst/>
+                    </a:prstGeom>
+                  </pic:spPr>
+                </pic:pic>
+              </a:graphicData>
+            </a:graphic>
+          </wp:anchor>
+        </w:drawing>
+      </w:r>
       <w:proofErr w:type="spellStart"/>
       <w:r>
         <w:rPr>
@@ -5634,6 +6434,17 @@
       <w:r>
         <w:t>: GitHub Copilot / IntelliCode, Markdown Editor, Web Essentials.</w:t>
       </w:r>
+    </w:p>
+    <w:p>
+      <w:pPr>
+        <w:pStyle w:val="a0"/>
+        <w:numPr>
+          <w:ilvl w:val="0"/>
+          <w:numId w:val="0"/>
+        </w:numPr>
+        <w:spacing w:after="60"/>
+        <w:ind w:left="360"/>
+      </w:pPr>
     </w:p>
     <w:p>
       <w:pPr>
@@ -5728,6 +6539,54 @@
       </w:pPr>
       <w:r>
         <w:rPr>
+          <w:lang w:val="ru-RU"/>
+        </w:rPr>
+        <w:drawing>
+          <wp:anchor distT="0" distB="0" distL="114300" distR="114300" simplePos="0" relativeHeight="251683840" behindDoc="0" locked="0" layoutInCell="1" allowOverlap="1" wp14:anchorId="2D7BB43A" wp14:editId="39EDFF6E">
+            <wp:simplePos x="0" y="0"/>
+            <wp:positionH relativeFrom="page">
+              <wp:posOffset>624840</wp:posOffset>
+            </wp:positionH>
+            <wp:positionV relativeFrom="page">
+              <wp:posOffset>5015230</wp:posOffset>
+            </wp:positionV>
+            <wp:extent cx="6309360" cy="701675"/>
+            <wp:effectExtent l="0" t="0" r="0" b="3175"/>
+            <wp:wrapTopAndBottom/>
+            <wp:docPr id="20706505" name="Рисунок 1"/>
+            <wp:cNvGraphicFramePr>
+              <a:graphicFrameLocks xmlns:a="http://schemas.openxmlformats.org/drawingml/2006/main" noChangeAspect="1"/>
+            </wp:cNvGraphicFramePr>
+            <a:graphic xmlns:a="http://schemas.openxmlformats.org/drawingml/2006/main">
+              <a:graphicData uri="http://schemas.openxmlformats.org/drawingml/2006/picture">
+                <pic:pic xmlns:pic="http://schemas.openxmlformats.org/drawingml/2006/picture">
+                  <pic:nvPicPr>
+                    <pic:cNvPr id="20706505" name=""/>
+                    <pic:cNvPicPr/>
+                  </pic:nvPicPr>
+                  <pic:blipFill>
+                    <a:blip r:embed="rId53"/>
+                    <a:stretch>
+                      <a:fillRect/>
+                    </a:stretch>
+                  </pic:blipFill>
+                  <pic:spPr>
+                    <a:xfrm>
+                      <a:off x="0" y="0"/>
+                      <a:ext cx="6309360" cy="701675"/>
+                    </a:xfrm>
+                    <a:prstGeom prst="rect">
+                      <a:avLst/>
+                    </a:prstGeom>
+                  </pic:spPr>
+                </pic:pic>
+              </a:graphicData>
+            </a:graphic>
+          </wp:anchor>
+        </w:drawing>
+      </w:r>
+      <w:r>
+        <w:rPr>
           <w:b/>
           <w:lang w:val="ru-RU"/>
         </w:rPr>
@@ -5787,6 +6646,68 @@
           <w:lang w:val="ru-RU"/>
         </w:rPr>
         <w:t>.</w:t>
+      </w:r>
+    </w:p>
+    <w:p>
+      <w:pPr>
+        <w:pStyle w:val="a0"/>
+        <w:numPr>
+          <w:ilvl w:val="0"/>
+          <w:numId w:val="0"/>
+        </w:numPr>
+        <w:spacing w:after="60"/>
+        <w:ind w:left="360"/>
+        <w:rPr>
+          <w:lang w:val="ru-RU"/>
+        </w:rPr>
+      </w:pPr>
+      <w:r>
+        <w:rPr>
+          <w:lang w:val="ru-RU"/>
+        </w:rPr>
+        <w:drawing>
+          <wp:anchor distT="0" distB="0" distL="114300" distR="114300" simplePos="0" relativeHeight="251700224" behindDoc="0" locked="0" layoutInCell="1" allowOverlap="1" wp14:anchorId="2D1D1521" wp14:editId="14FDB811">
+            <wp:simplePos x="0" y="0"/>
+            <wp:positionH relativeFrom="page">
+              <wp:posOffset>1539240</wp:posOffset>
+            </wp:positionH>
+            <wp:positionV relativeFrom="page">
+              <wp:posOffset>6583680</wp:posOffset>
+            </wp:positionV>
+            <wp:extent cx="4753610" cy="1524000"/>
+            <wp:effectExtent l="0" t="0" r="0" b="0"/>
+            <wp:wrapTopAndBottom/>
+            <wp:docPr id="580105122" name="Рисунок 1"/>
+            <wp:cNvGraphicFramePr>
+              <a:graphicFrameLocks xmlns:a="http://schemas.openxmlformats.org/drawingml/2006/main" noChangeAspect="1"/>
+            </wp:cNvGraphicFramePr>
+            <a:graphic xmlns:a="http://schemas.openxmlformats.org/drawingml/2006/main">
+              <a:graphicData uri="http://schemas.openxmlformats.org/drawingml/2006/picture">
+                <pic:pic xmlns:pic="http://schemas.openxmlformats.org/drawingml/2006/picture">
+                  <pic:nvPicPr>
+                    <pic:cNvPr id="580105122" name=""/>
+                    <pic:cNvPicPr/>
+                  </pic:nvPicPr>
+                  <pic:blipFill>
+                    <a:blip r:embed="rId54"/>
+                    <a:stretch>
+                      <a:fillRect/>
+                    </a:stretch>
+                  </pic:blipFill>
+                  <pic:spPr>
+                    <a:xfrm>
+                      <a:off x="0" y="0"/>
+                      <a:ext cx="4753610" cy="1524000"/>
+                    </a:xfrm>
+                    <a:prstGeom prst="rect">
+                      <a:avLst/>
+                    </a:prstGeom>
+                  </pic:spPr>
+                </pic:pic>
+              </a:graphicData>
+            </a:graphic>
+          </wp:anchor>
+        </w:drawing>
       </w:r>
     </w:p>
     <w:p>
@@ -5895,17 +6816,141 @@
     <w:p>
       <w:pPr>
         <w:pStyle w:val="a0"/>
+        <w:numPr>
+          <w:ilvl w:val="0"/>
+          <w:numId w:val="0"/>
+        </w:numPr>
         <w:spacing w:after="60"/>
         <w:rPr>
           <w:lang w:val="ru-RU"/>
         </w:rPr>
       </w:pPr>
-      <w:r>
-        <w:rPr>
-          <w:b/>
+    </w:p>
+    <w:p>
+      <w:pPr>
+        <w:rPr>
+          <w:b/>
+          <w:lang w:val="ru-RU"/>
+        </w:rPr>
+      </w:pPr>
+      <w:r>
+        <w:rPr>
+          <w:b/>
+          <w:lang w:val="ru-RU"/>
+        </w:rPr>
+        <w:br w:type="page"/>
+      </w:r>
+    </w:p>
+    <w:p>
+      <w:pPr>
+        <w:pStyle w:val="a0"/>
+        <w:spacing w:after="60"/>
+        <w:rPr>
+          <w:lang w:val="ru-RU"/>
+        </w:rPr>
+      </w:pPr>
+      <w:r>
+        <w:rPr>
           <w:lang w:val="ru-RU"/>
         </w:rPr>
         <w:lastRenderedPageBreak/>
+        <w:drawing>
+          <wp:anchor distT="0" distB="0" distL="114300" distR="114300" simplePos="0" relativeHeight="251718656" behindDoc="0" locked="0" layoutInCell="1" allowOverlap="1" wp14:anchorId="31781362" wp14:editId="3C874255">
+            <wp:simplePos x="0" y="0"/>
+            <wp:positionH relativeFrom="page">
+              <wp:posOffset>1252220</wp:posOffset>
+            </wp:positionH>
+            <wp:positionV relativeFrom="page">
+              <wp:posOffset>2659380</wp:posOffset>
+            </wp:positionV>
+            <wp:extent cx="5239481" cy="724001"/>
+            <wp:effectExtent l="0" t="0" r="0" b="0"/>
+            <wp:wrapTopAndBottom/>
+            <wp:docPr id="836043055" name="Рисунок 1"/>
+            <wp:cNvGraphicFramePr>
+              <a:graphicFrameLocks xmlns:a="http://schemas.openxmlformats.org/drawingml/2006/main" noChangeAspect="1"/>
+            </wp:cNvGraphicFramePr>
+            <a:graphic xmlns:a="http://schemas.openxmlformats.org/drawingml/2006/main">
+              <a:graphicData uri="http://schemas.openxmlformats.org/drawingml/2006/picture">
+                <pic:pic xmlns:pic="http://schemas.openxmlformats.org/drawingml/2006/picture">
+                  <pic:nvPicPr>
+                    <pic:cNvPr id="836043055" name=""/>
+                    <pic:cNvPicPr/>
+                  </pic:nvPicPr>
+                  <pic:blipFill>
+                    <a:blip r:embed="rId55"/>
+                    <a:stretch>
+                      <a:fillRect/>
+                    </a:stretch>
+                  </pic:blipFill>
+                  <pic:spPr>
+                    <a:xfrm>
+                      <a:off x="0" y="0"/>
+                      <a:ext cx="5239481" cy="724001"/>
+                    </a:xfrm>
+                    <a:prstGeom prst="rect">
+                      <a:avLst/>
+                    </a:prstGeom>
+                  </pic:spPr>
+                </pic:pic>
+              </a:graphicData>
+            </a:graphic>
+          </wp:anchor>
+        </w:drawing>
+      </w:r>
+      <w:r>
+        <w:rPr>
+          <w:lang w:val="ru-RU"/>
+        </w:rPr>
+        <w:drawing>
+          <wp:anchor distT="0" distB="0" distL="114300" distR="114300" simplePos="0" relativeHeight="251713536" behindDoc="0" locked="0" layoutInCell="1" allowOverlap="1" wp14:anchorId="66A51404" wp14:editId="4C14859C">
+            <wp:simplePos x="0" y="0"/>
+            <wp:positionH relativeFrom="page">
+              <wp:posOffset>1442720</wp:posOffset>
+            </wp:positionH>
+            <wp:positionV relativeFrom="page">
+              <wp:posOffset>726440</wp:posOffset>
+            </wp:positionV>
+            <wp:extent cx="4763165" cy="1571844"/>
+            <wp:effectExtent l="0" t="0" r="0" b="9525"/>
+            <wp:wrapTopAndBottom/>
+            <wp:docPr id="790775644" name="Рисунок 1"/>
+            <wp:cNvGraphicFramePr>
+              <a:graphicFrameLocks xmlns:a="http://schemas.openxmlformats.org/drawingml/2006/main" noChangeAspect="1"/>
+            </wp:cNvGraphicFramePr>
+            <a:graphic xmlns:a="http://schemas.openxmlformats.org/drawingml/2006/main">
+              <a:graphicData uri="http://schemas.openxmlformats.org/drawingml/2006/picture">
+                <pic:pic xmlns:pic="http://schemas.openxmlformats.org/drawingml/2006/picture">
+                  <pic:nvPicPr>
+                    <pic:cNvPr id="790775644" name=""/>
+                    <pic:cNvPicPr/>
+                  </pic:nvPicPr>
+                  <pic:blipFill>
+                    <a:blip r:embed="rId56"/>
+                    <a:stretch>
+                      <a:fillRect/>
+                    </a:stretch>
+                  </pic:blipFill>
+                  <pic:spPr>
+                    <a:xfrm>
+                      <a:off x="0" y="0"/>
+                      <a:ext cx="4763165" cy="1571844"/>
+                    </a:xfrm>
+                    <a:prstGeom prst="rect">
+                      <a:avLst/>
+                    </a:prstGeom>
+                  </pic:spPr>
+                </pic:pic>
+              </a:graphicData>
+            </a:graphic>
+          </wp:anchor>
+        </w:drawing>
+      </w:r>
+      <w:r>
+        <w:rPr>
+          <w:b/>
+          <w:lang w:val="ru-RU"/>
+        </w:rPr>
         <w:t xml:space="preserve">Изучить </w:t>
       </w:r>
       <w:r>
@@ -5935,6 +6980,39 @@
           <w:lang w:val="ru-RU"/>
         </w:rPr>
         <w:t>.</w:t>
+      </w:r>
+    </w:p>
+    <w:p>
+      <w:pPr>
+        <w:pStyle w:val="a0"/>
+        <w:numPr>
+          <w:ilvl w:val="0"/>
+          <w:numId w:val="0"/>
+        </w:numPr>
+        <w:spacing w:after="60"/>
+        <w:ind w:left="360"/>
+        <w:rPr>
+          <w:lang w:val="ru-RU"/>
+        </w:rPr>
+      </w:pPr>
+    </w:p>
+    <w:p>
+      <w:pPr>
+        <w:rPr>
+          <w:b/>
+          <w:color w:val="4C1D95"/>
+          <w:sz w:val="25"/>
+          <w:lang w:val="ru-RU"/>
+        </w:rPr>
+      </w:pPr>
+      <w:r>
+        <w:rPr>
+          <w:b/>
+          <w:color w:val="4C1D95"/>
+          <w:sz w:val="25"/>
+          <w:lang w:val="ru-RU"/>
+        </w:rPr>
+        <w:br w:type="page"/>
       </w:r>
     </w:p>
     <w:p>
@@ -5948,6 +7026,7 @@
           <w:color w:val="4C1D95"/>
           <w:sz w:val="25"/>
         </w:rPr>
+        <w:lastRenderedPageBreak/>
         <w:t xml:space="preserve">🔴 </w:t>
       </w:r>
       <w:proofErr w:type="spellStart"/>
@@ -6030,6 +7109,102 @@
       </w:pPr>
       <w:r>
         <w:rPr>
+          <w:lang w:val="ru-RU"/>
+        </w:rPr>
+        <w:drawing>
+          <wp:anchor distT="0" distB="0" distL="114300" distR="114300" simplePos="0" relativeHeight="251726848" behindDoc="0" locked="0" layoutInCell="1" allowOverlap="1" wp14:anchorId="32A41F07" wp14:editId="08E7A61E">
+            <wp:simplePos x="0" y="0"/>
+            <wp:positionH relativeFrom="page">
+              <wp:posOffset>883920</wp:posOffset>
+            </wp:positionH>
+            <wp:positionV relativeFrom="page">
+              <wp:posOffset>6099175</wp:posOffset>
+            </wp:positionV>
+            <wp:extent cx="6249272" cy="2076740"/>
+            <wp:effectExtent l="0" t="0" r="0" b="0"/>
+            <wp:wrapTopAndBottom/>
+            <wp:docPr id="683297166" name="Рисунок 1"/>
+            <wp:cNvGraphicFramePr>
+              <a:graphicFrameLocks xmlns:a="http://schemas.openxmlformats.org/drawingml/2006/main" noChangeAspect="1"/>
+            </wp:cNvGraphicFramePr>
+            <a:graphic xmlns:a="http://schemas.openxmlformats.org/drawingml/2006/main">
+              <a:graphicData uri="http://schemas.openxmlformats.org/drawingml/2006/picture">
+                <pic:pic xmlns:pic="http://schemas.openxmlformats.org/drawingml/2006/picture">
+                  <pic:nvPicPr>
+                    <pic:cNvPr id="683297166" name=""/>
+                    <pic:cNvPicPr/>
+                  </pic:nvPicPr>
+                  <pic:blipFill>
+                    <a:blip r:embed="rId57"/>
+                    <a:stretch>
+                      <a:fillRect/>
+                    </a:stretch>
+                  </pic:blipFill>
+                  <pic:spPr>
+                    <a:xfrm>
+                      <a:off x="0" y="0"/>
+                      <a:ext cx="6249272" cy="2076740"/>
+                    </a:xfrm>
+                    <a:prstGeom prst="rect">
+                      <a:avLst/>
+                    </a:prstGeom>
+                  </pic:spPr>
+                </pic:pic>
+              </a:graphicData>
+            </a:graphic>
+          </wp:anchor>
+        </w:drawing>
+      </w:r>
+      <w:r>
+        <w:rPr>
+          <w:lang w:val="ru-RU"/>
+        </w:rPr>
+        <w:drawing>
+          <wp:anchor distT="0" distB="0" distL="114300" distR="114300" simplePos="0" relativeHeight="251725824" behindDoc="0" locked="0" layoutInCell="1" allowOverlap="1" wp14:anchorId="49F9325B" wp14:editId="679F881D">
+            <wp:simplePos x="0" y="0"/>
+            <wp:positionH relativeFrom="page">
+              <wp:posOffset>871220</wp:posOffset>
+            </wp:positionH>
+            <wp:positionV relativeFrom="page">
+              <wp:posOffset>1360170</wp:posOffset>
+            </wp:positionV>
+            <wp:extent cx="6309360" cy="4612005"/>
+            <wp:effectExtent l="0" t="0" r="0" b="0"/>
+            <wp:wrapTopAndBottom/>
+            <wp:docPr id="870722876" name="Рисунок 1"/>
+            <wp:cNvGraphicFramePr>
+              <a:graphicFrameLocks xmlns:a="http://schemas.openxmlformats.org/drawingml/2006/main" noChangeAspect="1"/>
+            </wp:cNvGraphicFramePr>
+            <a:graphic xmlns:a="http://schemas.openxmlformats.org/drawingml/2006/main">
+              <a:graphicData uri="http://schemas.openxmlformats.org/drawingml/2006/picture">
+                <pic:pic xmlns:pic="http://schemas.openxmlformats.org/drawingml/2006/picture">
+                  <pic:nvPicPr>
+                    <pic:cNvPr id="870722876" name=""/>
+                    <pic:cNvPicPr/>
+                  </pic:nvPicPr>
+                  <pic:blipFill>
+                    <a:blip r:embed="rId58"/>
+                    <a:stretch>
+                      <a:fillRect/>
+                    </a:stretch>
+                  </pic:blipFill>
+                  <pic:spPr>
+                    <a:xfrm>
+                      <a:off x="0" y="0"/>
+                      <a:ext cx="6309360" cy="4612005"/>
+                    </a:xfrm>
+                    <a:prstGeom prst="rect">
+                      <a:avLst/>
+                    </a:prstGeom>
+                  </pic:spPr>
+                </pic:pic>
+              </a:graphicData>
+            </a:graphic>
+          </wp:anchor>
+        </w:drawing>
+      </w:r>
+      <w:r>
+        <w:rPr>
           <w:b/>
           <w:lang w:val="ru-RU"/>
         </w:rPr>
@@ -6078,12 +7253,16 @@
       <w:pPr>
         <w:pStyle w:val="a0"/>
         <w:spacing w:after="60"/>
+        <w:rPr>
+          <w:lang w:val="ru-RU"/>
+        </w:rPr>
       </w:pPr>
       <w:r>
         <w:rPr>
           <w:b/>
           <w:lang w:val="ru-RU"/>
         </w:rPr>
+        <w:lastRenderedPageBreak/>
         <w:t xml:space="preserve">Зафиксировать </w:t>
       </w:r>
       <w:r>
@@ -6102,6 +7281,9 @@
         <w:t xml:space="preserve">». </w:t>
       </w:r>
       <w:r>
+        <w:rPr>
+          <w:lang w:val="ru-RU"/>
+        </w:rPr>
         <w:t>(</w:t>
       </w:r>
       <w:r>
@@ -6110,9 +7292,29 @@
           <w:color w:val="6B21A8"/>
           <w:sz w:val="20"/>
         </w:rPr>
-        <w:t>Git Changes</w:t>
-      </w:r>
-      <w:r>
+        <w:t>Git</w:t>
+      </w:r>
+      <w:r>
+        <w:rPr>
+          <w:rFonts w:ascii="Consolas" w:hAnsi="Consolas"/>
+          <w:color w:val="6B21A8"/>
+          <w:sz w:val="20"/>
+          <w:lang w:val="ru-RU"/>
+        </w:rPr>
+        <w:t xml:space="preserve"> </w:t>
+      </w:r>
+      <w:r>
+        <w:rPr>
+          <w:rFonts w:ascii="Consolas" w:hAnsi="Consolas"/>
+          <w:color w:val="6B21A8"/>
+          <w:sz w:val="20"/>
+        </w:rPr>
+        <w:t>Changes</w:t>
+      </w:r>
+      <w:r>
+        <w:rPr>
+          <w:lang w:val="ru-RU"/>
+        </w:rPr>
         <w:t>)</w:t>
       </w:r>
     </w:p>
@@ -6126,6 +7328,198 @@
       </w:pPr>
       <w:r>
         <w:rPr>
+          <w:lang w:val="ru-RU"/>
+        </w:rPr>
+        <w:drawing>
+          <wp:anchor distT="0" distB="0" distL="114300" distR="114300" simplePos="0" relativeHeight="251738112" behindDoc="0" locked="0" layoutInCell="1" allowOverlap="1" wp14:anchorId="06AB7328" wp14:editId="0E5FE59C">
+            <wp:simplePos x="0" y="0"/>
+            <wp:positionH relativeFrom="page">
+              <wp:posOffset>807720</wp:posOffset>
+            </wp:positionH>
+            <wp:positionV relativeFrom="page">
+              <wp:posOffset>7322820</wp:posOffset>
+            </wp:positionV>
+            <wp:extent cx="6309360" cy="923925"/>
+            <wp:effectExtent l="0" t="0" r="0" b="9525"/>
+            <wp:wrapTopAndBottom/>
+            <wp:docPr id="1141495041" name="Рисунок 1"/>
+            <wp:cNvGraphicFramePr>
+              <a:graphicFrameLocks xmlns:a="http://schemas.openxmlformats.org/drawingml/2006/main" noChangeAspect="1"/>
+            </wp:cNvGraphicFramePr>
+            <a:graphic xmlns:a="http://schemas.openxmlformats.org/drawingml/2006/main">
+              <a:graphicData uri="http://schemas.openxmlformats.org/drawingml/2006/picture">
+                <pic:pic xmlns:pic="http://schemas.openxmlformats.org/drawingml/2006/picture">
+                  <pic:nvPicPr>
+                    <pic:cNvPr id="1141495041" name=""/>
+                    <pic:cNvPicPr/>
+                  </pic:nvPicPr>
+                  <pic:blipFill>
+                    <a:blip r:embed="rId59"/>
+                    <a:stretch>
+                      <a:fillRect/>
+                    </a:stretch>
+                  </pic:blipFill>
+                  <pic:spPr>
+                    <a:xfrm>
+                      <a:off x="0" y="0"/>
+                      <a:ext cx="6309360" cy="923925"/>
+                    </a:xfrm>
+                    <a:prstGeom prst="rect">
+                      <a:avLst/>
+                    </a:prstGeom>
+                  </pic:spPr>
+                </pic:pic>
+              </a:graphicData>
+            </a:graphic>
+          </wp:anchor>
+        </w:drawing>
+      </w:r>
+      <w:r>
+        <w:rPr>
+          <w:lang w:val="ru-RU"/>
+        </w:rPr>
+        <w:drawing>
+          <wp:anchor distT="0" distB="0" distL="114300" distR="114300" simplePos="0" relativeHeight="251737088" behindDoc="0" locked="0" layoutInCell="1" allowOverlap="1" wp14:anchorId="6CCCB30D" wp14:editId="1E0A0262">
+            <wp:simplePos x="0" y="0"/>
+            <wp:positionH relativeFrom="page">
+              <wp:posOffset>731520</wp:posOffset>
+            </wp:positionH>
+            <wp:positionV relativeFrom="page">
+              <wp:posOffset>3348990</wp:posOffset>
+            </wp:positionV>
+            <wp:extent cx="6309360" cy="3872865"/>
+            <wp:effectExtent l="0" t="0" r="0" b="0"/>
+            <wp:wrapTopAndBottom/>
+            <wp:docPr id="598412724" name="Рисунок 1"/>
+            <wp:cNvGraphicFramePr>
+              <a:graphicFrameLocks xmlns:a="http://schemas.openxmlformats.org/drawingml/2006/main" noChangeAspect="1"/>
+            </wp:cNvGraphicFramePr>
+            <a:graphic xmlns:a="http://schemas.openxmlformats.org/drawingml/2006/main">
+              <a:graphicData uri="http://schemas.openxmlformats.org/drawingml/2006/picture">
+                <pic:pic xmlns:pic="http://schemas.openxmlformats.org/drawingml/2006/picture">
+                  <pic:nvPicPr>
+                    <pic:cNvPr id="598412724" name=""/>
+                    <pic:cNvPicPr/>
+                  </pic:nvPicPr>
+                  <pic:blipFill>
+                    <a:blip r:embed="rId60"/>
+                    <a:stretch>
+                      <a:fillRect/>
+                    </a:stretch>
+                  </pic:blipFill>
+                  <pic:spPr>
+                    <a:xfrm>
+                      <a:off x="0" y="0"/>
+                      <a:ext cx="6309360" cy="3872865"/>
+                    </a:xfrm>
+                    <a:prstGeom prst="rect">
+                      <a:avLst/>
+                    </a:prstGeom>
+                  </pic:spPr>
+                </pic:pic>
+              </a:graphicData>
+            </a:graphic>
+          </wp:anchor>
+        </w:drawing>
+      </w:r>
+      <w:r>
+        <w:rPr>
+          <w:lang w:val="ru-RU"/>
+        </w:rPr>
+        <w:drawing>
+          <wp:anchor distT="0" distB="0" distL="114300" distR="114300" simplePos="0" relativeHeight="251735040" behindDoc="0" locked="0" layoutInCell="1" allowOverlap="1" wp14:anchorId="6CB6DCF8" wp14:editId="28F5B151">
+            <wp:simplePos x="0" y="0"/>
+            <wp:positionH relativeFrom="page">
+              <wp:posOffset>1442720</wp:posOffset>
+            </wp:positionH>
+            <wp:positionV relativeFrom="page">
+              <wp:posOffset>2092325</wp:posOffset>
+            </wp:positionV>
+            <wp:extent cx="4867954" cy="1181265"/>
+            <wp:effectExtent l="0" t="0" r="0" b="0"/>
+            <wp:wrapTopAndBottom/>
+            <wp:docPr id="1829015770" name="Рисунок 1"/>
+            <wp:cNvGraphicFramePr>
+              <a:graphicFrameLocks xmlns:a="http://schemas.openxmlformats.org/drawingml/2006/main" noChangeAspect="1"/>
+            </wp:cNvGraphicFramePr>
+            <a:graphic xmlns:a="http://schemas.openxmlformats.org/drawingml/2006/main">
+              <a:graphicData uri="http://schemas.openxmlformats.org/drawingml/2006/picture">
+                <pic:pic xmlns:pic="http://schemas.openxmlformats.org/drawingml/2006/picture">
+                  <pic:nvPicPr>
+                    <pic:cNvPr id="1829015770" name=""/>
+                    <pic:cNvPicPr/>
+                  </pic:nvPicPr>
+                  <pic:blipFill>
+                    <a:blip r:embed="rId61"/>
+                    <a:stretch>
+                      <a:fillRect/>
+                    </a:stretch>
+                  </pic:blipFill>
+                  <pic:spPr>
+                    <a:xfrm>
+                      <a:off x="0" y="0"/>
+                      <a:ext cx="4867954" cy="1181265"/>
+                    </a:xfrm>
+                    <a:prstGeom prst="rect">
+                      <a:avLst/>
+                    </a:prstGeom>
+                  </pic:spPr>
+                </pic:pic>
+              </a:graphicData>
+            </a:graphic>
+          </wp:anchor>
+        </w:drawing>
+      </w:r>
+      <w:r>
+        <w:rPr>
+          <w:lang w:val="ru-RU"/>
+        </w:rPr>
+        <w:drawing>
+          <wp:anchor distT="0" distB="0" distL="114300" distR="114300" simplePos="0" relativeHeight="251731968" behindDoc="0" locked="0" layoutInCell="1" allowOverlap="1" wp14:anchorId="4E69D7E8" wp14:editId="08D11D23">
+            <wp:simplePos x="0" y="0"/>
+            <wp:positionH relativeFrom="page">
+              <wp:posOffset>731520</wp:posOffset>
+            </wp:positionH>
+            <wp:positionV relativeFrom="page">
+              <wp:posOffset>1419225</wp:posOffset>
+            </wp:positionV>
+            <wp:extent cx="6306430" cy="609685"/>
+            <wp:effectExtent l="0" t="0" r="0" b="0"/>
+            <wp:wrapTopAndBottom/>
+            <wp:docPr id="559884137" name="Рисунок 1"/>
+            <wp:cNvGraphicFramePr>
+              <a:graphicFrameLocks xmlns:a="http://schemas.openxmlformats.org/drawingml/2006/main" noChangeAspect="1"/>
+            </wp:cNvGraphicFramePr>
+            <a:graphic xmlns:a="http://schemas.openxmlformats.org/drawingml/2006/main">
+              <a:graphicData uri="http://schemas.openxmlformats.org/drawingml/2006/picture">
+                <pic:pic xmlns:pic="http://schemas.openxmlformats.org/drawingml/2006/picture">
+                  <pic:nvPicPr>
+                    <pic:cNvPr id="559884137" name=""/>
+                    <pic:cNvPicPr/>
+                  </pic:nvPicPr>
+                  <pic:blipFill>
+                    <a:blip r:embed="rId62"/>
+                    <a:stretch>
+                      <a:fillRect/>
+                    </a:stretch>
+                  </pic:blipFill>
+                  <pic:spPr>
+                    <a:xfrm>
+                      <a:off x="0" y="0"/>
+                      <a:ext cx="6306430" cy="609685"/>
+                    </a:xfrm>
+                    <a:prstGeom prst="rect">
+                      <a:avLst/>
+                    </a:prstGeom>
+                  </pic:spPr>
+                </pic:pic>
+              </a:graphicData>
+            </a:graphic>
+          </wp:anchor>
+        </w:drawing>
+      </w:r>
+      <w:r>
+        <w:rPr>
           <w:b/>
           <w:lang w:val="ru-RU"/>
         </w:rPr>
@@ -6200,6 +7594,19 @@
         </w:rPr>
         <w:t>.</w:t>
       </w:r>
+    </w:p>
+    <w:p>
+      <w:pPr>
+        <w:pStyle w:val="a0"/>
+        <w:numPr>
+          <w:ilvl w:val="0"/>
+          <w:numId w:val="0"/>
+        </w:numPr>
+        <w:spacing w:after="60"/>
+        <w:rPr>
+          <w:lang w:val="ru-RU"/>
+        </w:rPr>
+      </w:pPr>
     </w:p>
     <w:p>
       <w:pPr>
@@ -6323,6 +7730,7 @@
         <w:rPr>
           <w:lang w:val="ru-RU"/>
         </w:rPr>
+        <w:lastRenderedPageBreak/>
         <w:t xml:space="preserve">Ошибки именования </w:t>
       </w:r>
       <w:r>
@@ -6353,7 +7761,7 @@
       </w:r>
     </w:p>
     <w:sectPr>
-      <w:footerReference w:type="default" r:id="rId40"/>
+      <w:footerReference w:type="default" r:id="rId63"/>
       <w:pgSz w:w="12240" w:h="15840"/>
       <w:pgMar w:top="1152" w:right="1152" w:bottom="1152" w:left="1152" w:header="720" w:footer="720" w:gutter="0"/>
       <w:cols w:space="720"/>
@@ -6627,7 +8035,7 @@
   <w:abstractNum w:abstractNumId="8" w15:restartNumberingAfterBreak="0">
     <w:nsid w:val="FFFFFF89"/>
     <w:multiLevelType w:val="singleLevel"/>
-    <w:tmpl w:val="E7F4F75E"/>
+    <w:tmpl w:val="F7BC9472"/>
     <w:lvl w:ilvl="0">
       <w:start w:val="1"/>
       <w:numFmt w:val="bullet"/>

</xml_diff>